<commit_message>
Add .tmp to .gitignore
.tmp
</commit_message>
<xml_diff>
--- a/paper/[OptCommun] Design and Simulation of Sb2Se3-Based .docx
+++ b/paper/[OptCommun] Design and Simulation of Sb2Se3-Based .docx
@@ -19973,7 +19973,10 @@
         <w:t>cavity design</w:t>
       </w:r>
       <w:r>
-        <w:t xml:space="preserve"> for absorptive film</w:t>
+        <w:t xml:space="preserve"> for </w:t>
+      </w:r>
+      <w:r>
+        <w:t>absorptive film</w:t>
       </w:r>
     </w:p>
     <w:p>
@@ -22245,15 +22248,7 @@
         </m:f>
       </m:oMath>
       <w:r>
-        <w:t xml:space="preserve"> l</w:t>
-      </w:r>
-      <w:proofErr w:type="spellStart"/>
-      <w:r>
-        <w:t>ayers</w:t>
-      </w:r>
-      <w:proofErr w:type="spellEnd"/>
-      <w:r>
-        <w:t xml:space="preserve"> to the left</w:t>
+        <w:t xml:space="preserve"> layer to the left</w:t>
       </w:r>
       <w:r>
         <w:t>most</w:t>

</xml_diff>

<commit_message>
1064-nm comparison (dT and R)
</commit_message>
<xml_diff>
--- a/paper/[OptCommun] Design and Simulation of Sb2Se3-Based .docx
+++ b/paper/[OptCommun] Design and Simulation of Sb2Se3-Based .docx
@@ -421,7 +421,7 @@
           <w:sz w:val="20"/>
         </w:rPr>
       </w:pPr>
-      <w:hyperlink r:id="rId7" w:history="1">
+      <w:hyperlink r:id="rId8" w:history="1">
         <w:r>
           <w:rPr>
             <w:rStyle w:val="SubtleEmphasis"/>
@@ -6974,22 +6974,7 @@
         <w:t>In this work, a linear interpolation is used since all the materials dataset used have the measurement interval of less than 4 nm.</w:t>
       </w:r>
       <w:r>
-        <w:t xml:space="preserve"> </w:t>
-      </w:r>
-      <w:r>
-        <w:t>Figure 1 shows the</w:t>
-      </w:r>
-      <w:r>
-        <w:t xml:space="preserve"> complex refractive ind</w:t>
-      </w:r>
-      <w:r>
-        <w:t>e</w:t>
-      </w:r>
-      <w:r>
-        <w:t>x</w:t>
-      </w:r>
-      <w:r>
-        <w:t xml:space="preserve"> of Sb</w:t>
+        <w:t xml:space="preserve"> The complex refractive indices of Sb</w:t>
       </w:r>
       <w:r>
         <w:rPr>
@@ -7007,328 +6992,14 @@
         <w:t>3</w:t>
       </w:r>
       <w:r>
-        <w:t xml:space="preserve"> </w:t>
-      </w:r>
-      <w:r>
-        <w:t xml:space="preserve">from 300-1700 nm using </w:t>
-      </w:r>
-      <w:r>
-        <w:t>data</w:t>
-      </w:r>
-      <w:r>
-        <w:t xml:space="preserve"> from </w:t>
-      </w:r>
-      <w:r>
-        <w:fldChar w:fldCharType="begin"/>
-      </w:r>
-      <w:r>
-        <w:instrText xml:space="preserve"> ADDIN EN.CITE &lt;EndNote&gt;&lt;Cite&gt;&lt;Author&gt;Delaney&lt;/Author&gt;&lt;Year&gt;2020&lt;/Year&gt;&lt;RecNum&gt;64&lt;/RecNum&gt;&lt;DisplayText&gt;[22]&lt;/DisplayText&gt;&lt;record&gt;&lt;rec-number&gt;64&lt;/rec-number&gt;&lt;foreign-keys&gt;&lt;key app="EN" db-id="v920pft06rp9dbex2ap500x99x5rrtswxzss" timestamp="1768054090" guid="b15b5550-40d7-4ad2-8182-cf6f486a4f50"&gt;64&lt;/key&gt;&lt;/foreign-keys&gt;&lt;ref-type name="Journal Article"&gt;17&lt;/ref-type&gt;&lt;contributors&gt;&lt;authors&gt;&lt;author&gt;Delaney, Matthew&lt;/author&gt;&lt;author&gt;Zeimpekis, Ioannis&lt;/author&gt;&lt;author&gt;Lawson, Daniel&lt;/author&gt;&lt;author&gt;Hewak, Daniel W</w:instrText>
-      </w:r>
-      <w:r>
-        <w:rPr>
-          <w:rFonts w:hint="eastAsia"/>
-        </w:rPr>
-        <w:instrText>.&lt;/author&gt;&lt;author&gt;Muskens, Otto L.&lt;/author&gt;&lt;/authors&gt;&lt;/contributors&gt;&lt;titles&gt;&lt;title&gt;A New Family of Ultralow Loss Reversible Phase</w:instrText>
-      </w:r>
-      <w:r>
-        <w:rPr>
-          <w:rFonts w:hint="eastAsia"/>
-        </w:rPr>
-        <w:instrText>‐</w:instrText>
-      </w:r>
-      <w:r>
-        <w:rPr>
-          <w:rFonts w:hint="eastAsia"/>
-        </w:rPr>
-        <w:instrText>Change Materials for Photonic Integrated Circuits: Sb2S3 and Sb2Se3&lt;/title&gt;&lt;secondary-title&gt;Advanced Functional Materials&lt;/se</w:instrText>
-      </w:r>
-      <w:r>
-        <w:instrText>condary-title&gt;&lt;/titles&gt;&lt;periodical&gt;&lt;full-title&gt;Advanced Functional Materials&lt;/full-title&gt;&lt;/periodical&gt;&lt;volume&gt;30&lt;/volume&gt;&lt;number&gt;36&lt;/number&gt;&lt;dates&gt;&lt;year&gt;2020&lt;/year&gt;&lt;/dates&gt;&lt;isbn&gt;1616-301X&amp;#xD;1616-3028&lt;/isbn&gt;&lt;urls&gt;&lt;/urls&gt;&lt;electronic-resource-num&gt;10.1002/adfm.202002447&lt;/electronic-resource-num&gt;&lt;/record&gt;&lt;/Cite&gt;&lt;/EndNote&gt;</w:instrText>
-      </w:r>
-      <w:r>
-        <w:fldChar w:fldCharType="separate"/>
-      </w:r>
-      <w:r>
-        <w:rPr>
-          <w:noProof/>
-        </w:rPr>
-        <w:t>[22]</w:t>
-      </w:r>
-      <w:r>
-        <w:fldChar w:fldCharType="end"/>
-      </w:r>
-      <w:r>
-        <w:t xml:space="preserve">. </w:t>
-      </w:r>
-      <w:r>
-        <w:t xml:space="preserve">The blue line represents </w:t>
-      </w:r>
-      <w:r>
-        <w:t>real</w:t>
-      </w:r>
-      <w:r>
-        <w:t xml:space="preserve"> </w:t>
-      </w:r>
-      <w:r>
-        <w:t>refractive index (</w:t>
+        <w:t xml:space="preserve"> at 532 nm are: </w:t>
       </w:r>
       <w:r>
         <w:rPr>
           <w:i/>
           <w:iCs/>
         </w:rPr>
-        <w:t>n</w:t>
-      </w:r>
-      <w:r>
-        <w:t xml:space="preserve">), and the red line represents </w:t>
-      </w:r>
-      <w:r>
-        <w:t xml:space="preserve">imaginary </w:t>
-      </w:r>
-      <w:r>
-        <w:t>extinction coefficient (</w:t>
-      </w:r>
-      <w:r>
-        <w:rPr>
-          <w:i/>
-          <w:iCs/>
-        </w:rPr>
-        <w:t>k</w:t>
-      </w:r>
-      <w:r>
-        <w:t>). In amorphous phase</w:t>
-      </w:r>
-      <w:r>
-        <w:t xml:space="preserve"> </w:t>
-      </w:r>
-      <w:r>
-        <w:t>(</w:t>
-      </w:r>
-      <w:r>
-        <w:t>Fig. 1a</w:t>
-      </w:r>
-      <w:r>
-        <w:t>)</w:t>
-      </w:r>
-      <w:r>
-        <w:t>,</w:t>
-      </w:r>
-      <w:r>
-        <w:t xml:space="preserve"> </w:t>
-      </w:r>
-      <w:r>
-        <w:t>the refractive index</w:t>
-      </w:r>
-      <w:r>
-        <w:t xml:space="preserve"> increases from around 2.</w:t>
-      </w:r>
-      <w:r>
-        <w:t>4</w:t>
-      </w:r>
-      <w:r>
-        <w:t xml:space="preserve"> at 300 nm to a peak of around 4.0 at </w:t>
-      </w:r>
-      <w:r>
-        <w:t xml:space="preserve">600 nm and gradually decreases to a stable </w:t>
-      </w:r>
-      <w:r>
-        <w:t xml:space="preserve">value of around </w:t>
-      </w:r>
-      <w:r>
-        <w:t>3.3 a</w:t>
-      </w:r>
-      <w:r>
-        <w:t>bove</w:t>
-      </w:r>
-      <w:r>
-        <w:t xml:space="preserve"> 1200 nm, indicating a strong dispersion near the band edge of visible </w:t>
-      </w:r>
-      <w:r>
-        <w:t xml:space="preserve">spectrum </w:t>
-      </w:r>
-      <w:r>
-        <w:t xml:space="preserve">and a weaker dispersion in the </w:t>
-      </w:r>
-      <w:r>
-        <w:t>NIR</w:t>
-      </w:r>
-      <w:r>
-        <w:t xml:space="preserve"> </w:t>
-      </w:r>
-      <w:r>
-        <w:t>spectrum</w:t>
-      </w:r>
-      <w:r>
-        <w:t xml:space="preserve">. The </w:t>
-      </w:r>
-      <w:r>
-        <w:t>extinction coefficient</w:t>
-      </w:r>
-      <w:r>
-        <w:t xml:space="preserve"> start</w:t>
-      </w:r>
-      <w:r>
-        <w:t>s</w:t>
-      </w:r>
-      <w:r>
-        <w:t xml:space="preserve"> </w:t>
-      </w:r>
-      <w:r>
-        <w:t xml:space="preserve">at approximately </w:t>
-      </w:r>
-      <w:r>
-        <w:t xml:space="preserve">2.1 at 300 nm and dropped to </w:t>
-      </w:r>
-      <w:r>
-        <w:t>zero</w:t>
-      </w:r>
-      <w:r>
-        <w:t xml:space="preserve"> at around 8</w:t>
-      </w:r>
-      <w:r>
-        <w:t>5</w:t>
-      </w:r>
-      <w:r>
-        <w:t>0 nm</w:t>
-      </w:r>
-      <w:r>
-        <w:t xml:space="preserve">. In the crystalline phase </w:t>
-      </w:r>
-      <w:r>
-        <w:t>(</w:t>
-      </w:r>
-      <w:r>
-        <w:t>Fig. 1b</w:t>
-      </w:r>
-      <w:r>
-        <w:t>)</w:t>
-      </w:r>
-      <w:r>
-        <w:t xml:space="preserve">, </w:t>
-      </w:r>
-      <w:r>
-        <w:t>the refractive index</w:t>
-      </w:r>
-      <w:r>
-        <w:t xml:space="preserve"> </w:t>
-      </w:r>
-      <w:r>
-        <w:t xml:space="preserve">is </w:t>
-      </w:r>
-      <w:r>
-        <w:t xml:space="preserve">around the </w:t>
-      </w:r>
-      <w:r>
-        <w:t xml:space="preserve">same </w:t>
-      </w:r>
-      <w:r>
-        <w:t xml:space="preserve">value </w:t>
-      </w:r>
-      <w:r>
-        <w:t xml:space="preserve">as </w:t>
-      </w:r>
-      <w:r>
-        <w:t>that of</w:t>
-      </w:r>
-      <w:r>
-        <w:t xml:space="preserve"> </w:t>
-      </w:r>
-      <w:r>
-        <w:t>amorphous phase but reached a peak of around 5.</w:t>
-      </w:r>
-      <w:r>
-        <w:t>1</w:t>
-      </w:r>
-      <w:r>
-        <w:t xml:space="preserve"> at </w:t>
-      </w:r>
-      <w:r>
-        <w:t xml:space="preserve">around </w:t>
-      </w:r>
-      <w:r>
-        <w:t>6</w:t>
-      </w:r>
-      <w:r>
-        <w:t>6</w:t>
-      </w:r>
-      <w:r>
-        <w:t>0 nm, it</w:t>
-      </w:r>
-      <w:r>
-        <w:t xml:space="preserve"> is</w:t>
-      </w:r>
-      <w:r>
-        <w:t xml:space="preserve"> then dropped to a stable of 4.</w:t>
-      </w:r>
-      <w:r>
-        <w:t>1</w:t>
-      </w:r>
-      <w:r>
-        <w:t xml:space="preserve"> in the </w:t>
-      </w:r>
-      <w:r>
-        <w:t>N</w:t>
-      </w:r>
-      <w:r>
-        <w:t xml:space="preserve">IR spectrum. The k-index of crystalline phase peaked </w:t>
-      </w:r>
-      <w:r>
-        <w:t>at around 3</w:t>
-      </w:r>
-      <w:r>
-        <w:t>.1</w:t>
-      </w:r>
-      <w:r>
-        <w:t xml:space="preserve"> </w:t>
-      </w:r>
-      <w:r>
-        <w:t xml:space="preserve">in the near-UV </w:t>
-      </w:r>
-      <w:r>
-        <w:t xml:space="preserve">spectrum </w:t>
-      </w:r>
-      <w:r>
-        <w:t xml:space="preserve">and rapidly </w:t>
-      </w:r>
-      <w:r>
-        <w:t xml:space="preserve">approach zero </w:t>
-      </w:r>
-      <w:r>
-        <w:t xml:space="preserve">above 900 nm. </w:t>
-      </w:r>
-      <w:r>
-        <w:t xml:space="preserve">So, </w:t>
-      </w:r>
-      <w:r>
-        <w:t>antimony triselenide (Sb</w:t>
-      </w:r>
-      <w:r>
-        <w:rPr>
-          <w:vertAlign w:val="subscript"/>
-        </w:rPr>
-        <w:t>2</w:t>
-      </w:r>
-      <w:r>
-        <w:t>Se</w:t>
-      </w:r>
-      <w:r>
-        <w:rPr>
-          <w:vertAlign w:val="subscript"/>
-        </w:rPr>
-        <w:t>3</w:t>
-      </w:r>
-      <w:r>
-        <w:t>)</w:t>
-      </w:r>
-      <w:r>
-        <w:t xml:space="preserve"> refractive index contrast </w:t>
-      </w:r>
-      <w:r>
-        <w:rPr>
-          <w:i/>
-          <w:iCs/>
-        </w:rPr>
-        <w:t>Δn = n</w:t>
+        <w:t>ñ</w:t>
       </w:r>
       <w:r>
         <w:rPr>
@@ -7336,14 +7007,17 @@
           <w:iCs/>
           <w:vertAlign w:val="subscript"/>
         </w:rPr>
-        <w:t>c</w:t>
+        <w:t>a</w:t>
+      </w:r>
+      <w:r>
+        <w:t xml:space="preserve"> = 3.962 + 1.093i, and </w:t>
       </w:r>
       <w:r>
         <w:rPr>
           <w:i/>
           <w:iCs/>
         </w:rPr>
-        <w:t xml:space="preserve"> - n</w:t>
+        <w:t>ñ</w:t>
       </w:r>
       <w:r>
         <w:rPr>
@@ -7351,20 +7025,455 @@
           <w:iCs/>
           <w:vertAlign w:val="subscript"/>
         </w:rPr>
+        <w:t>c</w:t>
+      </w:r>
+      <w:r>
+        <w:t xml:space="preserve"> = 4.788 + 2.241i</w:t>
+      </w:r>
+      <w:r>
+        <w:t xml:space="preserve">. And </w:t>
+      </w:r>
+      <w:r>
+        <w:rPr>
+          <w:i/>
+          <w:iCs/>
+        </w:rPr>
+        <w:t>ñ</w:t>
+      </w:r>
+      <w:r>
+        <w:t xml:space="preserve"> at 1064 nm are: </w:t>
+      </w:r>
+      <w:r>
+        <w:rPr>
+          <w:i/>
+          <w:iCs/>
+        </w:rPr>
+        <w:t>ñ</w:t>
+      </w:r>
+      <w:r>
+        <w:rPr>
+          <w:i/>
+          <w:iCs/>
+          <w:vertAlign w:val="subscript"/>
+        </w:rPr>
         <w:t>a</w:t>
       </w:r>
       <w:r>
+        <w:rPr>
+          <w:i/>
+          <w:iCs/>
+        </w:rPr>
+        <w:t xml:space="preserve"> = </w:t>
+      </w:r>
+      <w:r>
+        <w:t>3.370 + 0.000i</w:t>
+      </w:r>
+      <w:r>
+        <w:t xml:space="preserve">, and </w:t>
+      </w:r>
+      <w:r>
+        <w:rPr>
+          <w:i/>
+          <w:iCs/>
+        </w:rPr>
+        <w:t>ñ</w:t>
+      </w:r>
+      <w:r>
+        <w:rPr>
+          <w:i/>
+          <w:iCs/>
+          <w:vertAlign w:val="subscript"/>
+        </w:rPr>
+        <w:t>c</w:t>
+      </w:r>
+      <w:r>
+        <w:rPr>
+          <w:i/>
+          <w:iCs/>
+        </w:rPr>
+        <w:t xml:space="preserve"> = </w:t>
+      </w:r>
+      <w:r>
+        <w:t>4.308 + 0.010i</w:t>
+      </w:r>
+      <w:r>
+        <w:t xml:space="preserve">. </w:t>
+      </w:r>
+      <w:r>
+        <w:t xml:space="preserve">Figure 1 shows </w:t>
+      </w:r>
+      <w:r>
+        <w:t xml:space="preserve">their </w:t>
+      </w:r>
+      <w:r>
+        <w:rPr>
+          <w:i/>
+          <w:iCs/>
+        </w:rPr>
+        <w:t>ñ</w:t>
+      </w:r>
+      <w:r>
+        <w:t xml:space="preserve"> </w:t>
+      </w:r>
+      <w:r>
+        <w:t>from 300</w:t>
+      </w:r>
+      <w:r>
+        <w:t xml:space="preserve"> to </w:t>
+      </w:r>
+      <w:r>
+        <w:t xml:space="preserve">1700 nm using </w:t>
+      </w:r>
+      <w:r>
+        <w:t>data</w:t>
+      </w:r>
+      <w:r>
+        <w:t xml:space="preserve"> from </w:t>
+      </w:r>
+      <w:r>
+        <w:fldChar w:fldCharType="begin"/>
+      </w:r>
+      <w:r>
+        <w:instrText xml:space="preserve"> ADDIN EN.CITE &lt;EndNote&gt;&lt;Cite&gt;&lt;Author&gt;Delaney&lt;/Author&gt;&lt;Year&gt;2020&lt;/Year&gt;&lt;RecNum&gt;64&lt;/RecNum&gt;&lt;DisplayText&gt;[22]&lt;/DisplayText&gt;&lt;record&gt;&lt;rec-number&gt;64&lt;/rec-number&gt;&lt;foreign-keys&gt;&lt;key app="EN" db-id="v920pft06rp9dbex2ap500x99x5rrtswxzss" timestamp="1768054090" guid="b15b5550-40d7-4ad2-8182-cf6f486a4f50"&gt;64&lt;/key&gt;&lt;/foreign-keys&gt;&lt;ref-type name="Journal Article"&gt;17&lt;/ref-type&gt;&lt;contributors&gt;&lt;authors&gt;&lt;author&gt;Delaney, Matthew&lt;/author&gt;&lt;author&gt;Zeimpekis, Ioannis&lt;/author&gt;&lt;author&gt;Lawson, Daniel&lt;/author&gt;&lt;author&gt;Hewak, Daniel W</w:instrText>
+      </w:r>
+      <w:r>
+        <w:rPr>
+          <w:rFonts w:hint="eastAsia"/>
+        </w:rPr>
+        <w:instrText>.&lt;/author&gt;&lt;author&gt;Muskens, Otto L.&lt;/author&gt;&lt;/authors&gt;&lt;/contributors&gt;&lt;titles&gt;&lt;title&gt;A New Family of Ultralow Loss Reversible Phase</w:instrText>
+      </w:r>
+      <w:r>
+        <w:rPr>
+          <w:rFonts w:hint="eastAsia"/>
+        </w:rPr>
+        <w:instrText>‐</w:instrText>
+      </w:r>
+      <w:r>
+        <w:rPr>
+          <w:rFonts w:hint="eastAsia"/>
+        </w:rPr>
+        <w:instrText>Change Materials for Photonic Integrated Circuits: Sb2S3 and Sb2Se3&lt;/title&gt;&lt;secondary-title&gt;Advanced Functional Materials&lt;/se</w:instrText>
+      </w:r>
+      <w:r>
+        <w:instrText>condary-title&gt;&lt;/titles&gt;&lt;periodical&gt;&lt;full-title&gt;Advanced Functional Materials&lt;/full-title&gt;&lt;/periodical&gt;&lt;volume&gt;30&lt;/volume&gt;&lt;number&gt;36&lt;/number&gt;&lt;dates&gt;&lt;year&gt;2020&lt;/year&gt;&lt;/dates&gt;&lt;isbn&gt;1616-301X&amp;#xD;1616-3028&lt;/isbn&gt;&lt;urls&gt;&lt;/urls&gt;&lt;electronic-resource-num&gt;10.1002/adfm.202002447&lt;/electronic-resource-num&gt;&lt;/record&gt;&lt;/Cite&gt;&lt;/EndNote&gt;</w:instrText>
+      </w:r>
+      <w:r>
+        <w:fldChar w:fldCharType="separate"/>
+      </w:r>
+      <w:r>
+        <w:rPr>
+          <w:noProof/>
+        </w:rPr>
+        <w:t>[22]</w:t>
+      </w:r>
+      <w:r>
+        <w:fldChar w:fldCharType="end"/>
+      </w:r>
+      <w:r>
+        <w:t xml:space="preserve">. </w:t>
+      </w:r>
+      <w:r>
+        <w:t xml:space="preserve">The blue line represents </w:t>
+      </w:r>
+      <w:r>
+        <w:t>real</w:t>
+      </w:r>
+      <w:r>
+        <w:t xml:space="preserve"> </w:t>
+      </w:r>
+      <w:r>
+        <w:t>refractive index (</w:t>
+      </w:r>
+      <w:r>
+        <w:rPr>
+          <w:i/>
+          <w:iCs/>
+        </w:rPr>
+        <w:t>n</w:t>
+      </w:r>
+      <w:r>
+        <w:t xml:space="preserve">), and the red line represents </w:t>
+      </w:r>
+      <w:r>
+        <w:t xml:space="preserve">imaginary </w:t>
+      </w:r>
+      <w:r>
+        <w:t>extinction coefficient (</w:t>
+      </w:r>
+      <w:r>
+        <w:rPr>
+          <w:i/>
+          <w:iCs/>
+        </w:rPr>
+        <w:t>k</w:t>
+      </w:r>
+      <w:r>
+        <w:t>). In amorphous phase</w:t>
+      </w:r>
+      <w:r>
+        <w:t xml:space="preserve"> </w:t>
+      </w:r>
+      <w:r>
+        <w:t>(</w:t>
+      </w:r>
+      <w:r>
+        <w:t>Fig. 1a</w:t>
+      </w:r>
+      <w:r>
+        <w:t>)</w:t>
+      </w:r>
+      <w:r>
+        <w:t>,</w:t>
+      </w:r>
+      <w:r>
+        <w:t xml:space="preserve"> </w:t>
+      </w:r>
+      <w:r>
+        <w:t>the refractive index</w:t>
+      </w:r>
+      <w:r>
+        <w:t xml:space="preserve"> increases from around 2.</w:t>
+      </w:r>
+      <w:r>
+        <w:t>4</w:t>
+      </w:r>
+      <w:r>
+        <w:t xml:space="preserve"> at 300 nm to a peak of around 4.0 at </w:t>
+      </w:r>
+      <w:r>
+        <w:t xml:space="preserve">600 nm and gradually decreases to a stable </w:t>
+      </w:r>
+      <w:r>
+        <w:t xml:space="preserve">value of around </w:t>
+      </w:r>
+      <w:r>
+        <w:t>3.3 a</w:t>
+      </w:r>
+      <w:r>
+        <w:t>bove</w:t>
+      </w:r>
+      <w:r>
+        <w:t xml:space="preserve"> 1200 nm, indicating a strong dispersion near the band edge of visible </w:t>
+      </w:r>
+      <w:r>
+        <w:t xml:space="preserve">spectrum </w:t>
+      </w:r>
+      <w:r>
+        <w:t xml:space="preserve">and a weaker dispersion in the </w:t>
+      </w:r>
+      <w:r>
+        <w:t>NIR</w:t>
+      </w:r>
+      <w:r>
+        <w:t xml:space="preserve"> </w:t>
+      </w:r>
+      <w:r>
+        <w:t>spectrum</w:t>
+      </w:r>
+      <w:r>
+        <w:t xml:space="preserve">. The </w:t>
+      </w:r>
+      <w:r>
+        <w:t>extinction coefficient</w:t>
+      </w:r>
+      <w:r>
+        <w:t xml:space="preserve"> start</w:t>
+      </w:r>
+      <w:r>
+        <w:t>s</w:t>
+      </w:r>
+      <w:r>
+        <w:t xml:space="preserve"> </w:t>
+      </w:r>
+      <w:r>
+        <w:t xml:space="preserve">at approximately </w:t>
+      </w:r>
+      <w:r>
+        <w:t xml:space="preserve">2.1 at 300 nm and dropped to </w:t>
+      </w:r>
+      <w:r>
+        <w:t>zero</w:t>
+      </w:r>
+      <w:r>
+        <w:t xml:space="preserve"> at around 8</w:t>
+      </w:r>
+      <w:r>
+        <w:t>5</w:t>
+      </w:r>
+      <w:r>
+        <w:t>0 nm</w:t>
+      </w:r>
+      <w:r>
+        <w:t xml:space="preserve">. In the crystalline phase </w:t>
+      </w:r>
+      <w:r>
+        <w:t>(</w:t>
+      </w:r>
+      <w:r>
+        <w:t>Fig. 1b</w:t>
+      </w:r>
+      <w:r>
+        <w:t>)</w:t>
+      </w:r>
+      <w:r>
+        <w:t xml:space="preserve">, </w:t>
+      </w:r>
+      <w:r>
+        <w:t>the refractive index</w:t>
+      </w:r>
+      <w:r>
+        <w:t xml:space="preserve"> </w:t>
+      </w:r>
+      <w:r>
+        <w:t xml:space="preserve">is </w:t>
+      </w:r>
+      <w:r>
+        <w:t xml:space="preserve">around the </w:t>
+      </w:r>
+      <w:r>
+        <w:t xml:space="preserve">same </w:t>
+      </w:r>
+      <w:r>
+        <w:t xml:space="preserve">value </w:t>
+      </w:r>
+      <w:r>
+        <w:t xml:space="preserve">as </w:t>
+      </w:r>
+      <w:r>
+        <w:t>that of</w:t>
+      </w:r>
+      <w:r>
+        <w:t xml:space="preserve"> </w:t>
+      </w:r>
+      <w:r>
+        <w:t>amorphous phase but reached a peak of around 5.</w:t>
+      </w:r>
+      <w:r>
+        <w:t>1</w:t>
+      </w:r>
+      <w:r>
+        <w:t xml:space="preserve"> at </w:t>
+      </w:r>
+      <w:r>
+        <w:t xml:space="preserve">around </w:t>
+      </w:r>
+      <w:r>
+        <w:t>6</w:t>
+      </w:r>
+      <w:r>
+        <w:t>6</w:t>
+      </w:r>
+      <w:r>
+        <w:t>0 nm, it</w:t>
+      </w:r>
+      <w:r>
+        <w:t xml:space="preserve"> is</w:t>
+      </w:r>
+      <w:r>
+        <w:t xml:space="preserve"> then dropped to a stable of 4.</w:t>
+      </w:r>
+      <w:r>
+        <w:t>1</w:t>
+      </w:r>
+      <w:r>
+        <w:t xml:space="preserve"> in the </w:t>
+      </w:r>
+      <w:r>
+        <w:t>N</w:t>
+      </w:r>
+      <w:r>
+        <w:t xml:space="preserve">IR spectrum. The k-index of crystalline phase peaked </w:t>
+      </w:r>
+      <w:r>
+        <w:t>at around 3</w:t>
+      </w:r>
+      <w:r>
+        <w:t>.1</w:t>
+      </w:r>
+      <w:r>
+        <w:t xml:space="preserve"> </w:t>
+      </w:r>
+      <w:r>
+        <w:t xml:space="preserve">in the near-UV </w:t>
+      </w:r>
+      <w:r>
+        <w:t xml:space="preserve">spectrum </w:t>
+      </w:r>
+      <w:r>
+        <w:t xml:space="preserve">and rapidly </w:t>
+      </w:r>
+      <w:r>
+        <w:lastRenderedPageBreak/>
+        <w:t xml:space="preserve">approach zero </w:t>
+      </w:r>
+      <w:r>
+        <w:t xml:space="preserve">above 900 nm. </w:t>
+      </w:r>
+      <w:r>
+        <w:t xml:space="preserve">So, </w:t>
+      </w:r>
+      <w:r>
+        <w:t>antimony triselenide (Sb</w:t>
+      </w:r>
+      <w:r>
+        <w:rPr>
+          <w:vertAlign w:val="subscript"/>
+        </w:rPr>
+        <w:t>2</w:t>
+      </w:r>
+      <w:r>
+        <w:t>Se</w:t>
+      </w:r>
+      <w:r>
+        <w:rPr>
+          <w:vertAlign w:val="subscript"/>
+        </w:rPr>
+        <w:t>3</w:t>
+      </w:r>
+      <w:r>
+        <w:t>)</w:t>
+      </w:r>
+      <w:r>
+        <w:t xml:space="preserve"> refractive index contrast </w:t>
+      </w:r>
+      <w:r>
+        <w:rPr>
+          <w:i/>
+          <w:iCs/>
+        </w:rPr>
+        <w:t>Δn = n</w:t>
+      </w:r>
+      <w:r>
+        <w:rPr>
+          <w:i/>
+          <w:iCs/>
+          <w:vertAlign w:val="subscript"/>
+        </w:rPr>
+        <w:t>c</w:t>
+      </w:r>
+      <w:r>
+        <w:rPr>
+          <w:i/>
+          <w:iCs/>
+        </w:rPr>
+        <w:t xml:space="preserve"> - n</w:t>
+      </w:r>
+      <w:r>
+        <w:rPr>
+          <w:i/>
+          <w:iCs/>
+          <w:vertAlign w:val="subscript"/>
+        </w:rPr>
+        <w:t>a</w:t>
+      </w:r>
+      <w:r>
         <w:t xml:space="preserve"> is large and stable in the visible </w:t>
       </w:r>
       <w:r>
         <w:t>through</w:t>
       </w:r>
       <w:r>
-        <w:t xml:space="preserve"> IR </w:t>
-      </w:r>
-      <w:r>
-        <w:lastRenderedPageBreak/>
-        <w:t>spectra</w:t>
+        <w:t xml:space="preserve"> IR spectra</w:t>
       </w:r>
       <w:r>
         <w:t xml:space="preserve">, and extinction coefficients is very large in the near-UV but falls to zero </w:t>
@@ -7434,7 +7543,7 @@
                     <pic:cNvPicPr/>
                   </pic:nvPicPr>
                   <pic:blipFill>
-                    <a:blip r:embed="rId8"/>
+                    <a:blip r:embed="rId9"/>
                     <a:stretch>
                       <a:fillRect/>
                     </a:stretch>
@@ -8196,32 +8305,12 @@
             </m:ctrlPr>
           </m:fPr>
           <m:num>
-            <m:sSub>
-              <m:sSubPr>
-                <m:ctrlPr>
-                  <w:rPr>
-                    <w:rFonts w:ascii="Cambria Math" w:hAnsi="Cambria Math"/>
-                    <w:i/>
-                  </w:rPr>
-                </m:ctrlPr>
-              </m:sSubPr>
-              <m:e>
-                <m:r>
-                  <w:rPr>
-                    <w:rFonts w:ascii="Cambria Math" w:hAnsi="Cambria Math"/>
-                  </w:rPr>
-                  <m:t>λ</m:t>
-                </m:r>
-              </m:e>
-              <m:sub>
-                <m:r>
-                  <w:rPr>
-                    <w:rFonts w:ascii="Cambria Math" w:hAnsi="Cambria Math"/>
-                  </w:rPr>
-                  <m:t>0</m:t>
-                </m:r>
-              </m:sub>
-            </m:sSub>
+            <m:r>
+              <w:rPr>
+                <w:rFonts w:ascii="Cambria Math" w:hAnsi="Cambria Math"/>
+              </w:rPr>
+              <m:t>λ</m:t>
+            </m:r>
           </m:num>
           <m:den>
             <m:r>
@@ -8293,7 +8382,7 @@
                     </pic:cNvPicPr>
                   </pic:nvPicPr>
                   <pic:blipFill>
-                    <a:blip r:embed="rId9" cstate="print">
+                    <a:blip r:embed="rId10" cstate="print">
                       <a:extLst>
                         <a:ext uri="{28A0092B-C50C-407E-A947-70E740481C1C}">
                           <a14:useLocalDpi xmlns:a14="http://schemas.microsoft.com/office/drawing/2010/main" val="0"/>
@@ -10319,6 +10408,13 @@
         <w:rPr>
           <w:i/>
           <w:iCs/>
+        </w:rPr>
+        <w:t>xp</w:t>
+      </w:r>
+      <w:r>
+        <w:rPr>
+          <w:i/>
+          <w:iCs/>
           <w:vertAlign w:val="superscript"/>
         </w:rPr>
         <w:t>-i</w:t>
@@ -11762,13 +11858,37 @@
         <w:rPr>
           <w:iCs/>
         </w:rPr>
-        <w:t xml:space="preserve"> would travel 2HWOT = 2</w:t>
-      </w:r>
-      <w:r>
-        <w:rPr>
-          <w:i/>
+        <w:t xml:space="preserve"> </w:t>
+      </w:r>
+      <w:r>
+        <w:rPr>
           <w:iCs/>
         </w:rPr>
+        <w:t>would</w:t>
+      </w:r>
+      <w:r>
+        <w:rPr>
+          <w:iCs/>
+        </w:rPr>
+        <w:t xml:space="preserve"> travel</w:t>
+      </w:r>
+      <w:r>
+        <w:rPr>
+          <w:iCs/>
+        </w:rPr>
+        <w:t xml:space="preserve"> an extra</w:t>
+      </w:r>
+      <w:r>
+        <w:rPr>
+          <w:iCs/>
+        </w:rPr>
+        <w:t xml:space="preserve"> 2HWOT = 2</w:t>
+      </w:r>
+      <w:r>
+        <w:rPr>
+          <w:i/>
+          <w:iCs/>
+        </w:rPr>
         <w:t>π</w:t>
       </w:r>
       <w:r>
@@ -11803,6 +11923,18 @@
           <w:lang w:val="en-US"/>
         </w:rPr>
         <w:t xml:space="preserve">at </w:t>
+      </w:r>
+      <w:r>
+        <w:rPr>
+          <w:lang w:val="en-US"/>
+        </w:rPr>
+        <w:t xml:space="preserve">the </w:t>
+      </w:r>
+      <w:r>
+        <w:rPr>
+          <w:lang w:val="en-US"/>
+        </w:rPr>
+        <w:t xml:space="preserve">reference wavelength </w:t>
       </w:r>
       <w:r>
         <w:rPr>
@@ -12281,7 +12413,7 @@
                     <pic:cNvPicPr/>
                   </pic:nvPicPr>
                   <pic:blipFill>
-                    <a:blip r:embed="rId10"/>
+                    <a:blip r:embed="rId11"/>
                     <a:stretch>
                       <a:fillRect/>
                     </a:stretch>
@@ -17849,7 +17981,7 @@
                     <pic:cNvPicPr/>
                   </pic:nvPicPr>
                   <pic:blipFill rotWithShape="1">
-                    <a:blip r:embed="rId11" cstate="print">
+                    <a:blip r:embed="rId12" cstate="print">
                       <a:extLst>
                         <a:ext uri="{28A0092B-C50C-407E-A947-70E740481C1C}">
                           <a14:useLocalDpi xmlns:a14="http://schemas.microsoft.com/office/drawing/2010/main" val="0"/>
@@ -18296,7 +18428,7 @@
                     <pic:cNvPicPr/>
                   </pic:nvPicPr>
                   <pic:blipFill>
-                    <a:blip r:embed="rId12"/>
+                    <a:blip r:embed="rId13"/>
                     <a:srcRect t="589" b="589"/>
                     <a:stretch>
                       <a:fillRect/>
@@ -19696,7 +19828,7 @@
                     <pic:cNvPicPr/>
                   </pic:nvPicPr>
                   <pic:blipFill>
-                    <a:blip r:embed="rId13"/>
+                    <a:blip r:embed="rId14"/>
                     <a:stretch>
                       <a:fillRect/>
                     </a:stretch>
@@ -19952,31 +20084,62 @@
         <w:pStyle w:val="Heading2"/>
       </w:pPr>
       <w:r>
+        <w:rPr>
+          <w:highlight w:val="yellow"/>
+        </w:rPr>
         <w:t>2.</w:t>
       </w:r>
       <w:r>
+        <w:rPr>
+          <w:highlight w:val="yellow"/>
+        </w:rPr>
         <w:t>5</w:t>
       </w:r>
       <w:r>
+        <w:rPr>
+          <w:highlight w:val="yellow"/>
+        </w:rPr>
         <w:t xml:space="preserve"> </w:t>
       </w:r>
       <w:r>
         <w:rPr>
+          <w:highlight w:val="yellow"/>
           <w:lang w:val="en"/>
         </w:rPr>
         <w:t>Fabry–Pérot</w:t>
       </w:r>
       <w:r>
+        <w:rPr>
+          <w:highlight w:val="yellow"/>
+        </w:rPr>
         <w:t xml:space="preserve"> </w:t>
       </w:r>
       <w:r>
+        <w:rPr>
+          <w:highlight w:val="yellow"/>
+        </w:rPr>
         <w:t>cavity design</w:t>
       </w:r>
       <w:r>
+        <w:rPr>
+          <w:highlight w:val="yellow"/>
+        </w:rPr>
         <w:t xml:space="preserve"> for </w:t>
       </w:r>
       <w:r>
+        <w:rPr>
+          <w:highlight w:val="yellow"/>
+        </w:rPr>
         <w:t>absorptive film</w:t>
+      </w:r>
+      <w:r>
+        <w:t xml:space="preserve"> </w:t>
+      </w:r>
+      <w:r>
+        <w:rPr>
+          <w:highlight w:val="magenta"/>
+        </w:rPr>
+        <w:t>(remove this part?)</w:t>
       </w:r>
     </w:p>
     <w:p>
@@ -20103,10 +20266,7 @@
         <w:t xml:space="preserve"> can be explained </w:t>
       </w:r>
       <w:r>
-        <w:t xml:space="preserve">using the same single-layer </w:t>
-      </w:r>
-      <w:r>
-        <w:t>Sb</w:t>
+        <w:t>using the same single-layer Sb</w:t>
       </w:r>
       <w:r>
         <w:rPr>
@@ -20121,13 +20281,7 @@
         <w:rPr>
           <w:vertAlign w:val="subscript"/>
         </w:rPr>
-        <w:t>3</w:t>
-      </w:r>
-      <w:r>
-        <w:rPr>
-          <w:vertAlign w:val="subscript"/>
-        </w:rPr>
-        <w:t xml:space="preserve"> </w:t>
+        <w:t xml:space="preserve">3 </w:t>
       </w:r>
       <w:r>
         <w:t>design with HWOT thickness deposited on SiO</w:t>
@@ -20510,10 +20664,7 @@
         <w:t>1.09i</w:t>
       </w:r>
       <w:r>
-        <w:t xml:space="preserve"> at 532 nm</w:t>
-      </w:r>
-      <w:r>
-        <w:t xml:space="preserve">) to an </w:t>
+        <w:t xml:space="preserve"> at 532 nm) to an </w:t>
       </w:r>
       <w:r>
         <w:t>ideal</w:t>
@@ -20535,10 +20686,7 @@
         <w:t>k</w:t>
       </w:r>
       <w:r>
-        <w:t xml:space="preserve"> </w:t>
-      </w:r>
-      <w:r>
-        <w:t>(</w:t>
+        <w:t xml:space="preserve"> (</w:t>
       </w:r>
       <w:r>
         <w:rPr>
@@ -20668,7 +20816,7 @@
                     </pic:cNvPicPr>
                   </pic:nvPicPr>
                   <pic:blipFill>
-                    <a:blip r:embed="rId14">
+                    <a:blip r:embed="rId15">
                       <a:extLst>
                         <a:ext uri="{28A0092B-C50C-407E-A947-70E740481C1C}">
                           <a14:useLocalDpi xmlns:a14="http://schemas.microsoft.com/office/drawing/2010/main" val="0"/>
@@ -21052,8 +21200,6 @@
     <w:p>
       <w:r>
         <w:tab/>
-      </w:r>
-      <w:r>
         <w:t xml:space="preserve">A </w:t>
       </w:r>
       <w:r>
@@ -21353,10 +21499,7 @@
         <w:t>, as described earlier.</w:t>
       </w:r>
       <w:r>
-        <w:t xml:space="preserve"> </w:t>
-      </w:r>
-      <w:r>
-        <w:t xml:space="preserve">The resonant condition in </w:t>
+        <w:t xml:space="preserve"> The resonant condition in </w:t>
       </w:r>
       <w:r>
         <w:rPr>
@@ -21365,10 +21508,7 @@
         <w:t>Fabry–Pérot</w:t>
       </w:r>
       <w:r>
-        <w:t xml:space="preserve"> design can be simplified </w:t>
-      </w:r>
-      <w:r>
-        <w:t xml:space="preserve">into a simpler optically equivalent layer. </w:t>
+        <w:t xml:space="preserve"> design can be simplified into a simpler optically equivalent layer. </w:t>
       </w:r>
       <w:r>
         <w:t xml:space="preserve">For example, a symmetrical cavity with H as central layer and </w:t>
@@ -22170,19 +22310,7 @@
         <w:rPr>
           <w:lang w:val="en-US"/>
         </w:rPr>
-        <w:t>2</w:t>
-      </w:r>
-      <w:r>
-        <w:rPr>
-          <w:lang w:val="en-US"/>
-        </w:rPr>
-        <w:t>2</w:t>
-      </w:r>
-      <w:r>
-        <w:rPr>
-          <w:lang w:val="en-US"/>
-        </w:rPr>
-        <w:t>)</w:t>
+        <w:t>22)</w:t>
       </w:r>
     </w:p>
     <w:p>
@@ -22551,7 +22679,19 @@
         <w:rPr>
           <w:lang w:val="en-US"/>
         </w:rPr>
-        <w:t>Eq. 23 is equivalent to (H H) layer which satisfy the condition for AR property. In reality, the middle can be changed from Sb</w:t>
+        <w:t xml:space="preserve">Eq. 23 is equivalent to (H H) layer which satisfy the condition for AR property. In reality, the middle can be changed </w:t>
+      </w:r>
+      <w:r>
+        <w:rPr>
+          <w:lang w:val="en-US"/>
+        </w:rPr>
+        <w:t>to</w:t>
+      </w:r>
+      <w:r>
+        <w:rPr>
+          <w:lang w:val="en-US"/>
+        </w:rPr>
+        <w:t xml:space="preserve"> Sb</w:t>
       </w:r>
       <w:r>
         <w:rPr>
@@ -22577,45 +22717,79 @@
         <w:rPr>
           <w:lang w:val="en-US"/>
         </w:rPr>
-        <w:t xml:space="preserve">, the selection of </w:t>
-      </w:r>
-      <w:r>
-        <w:rPr>
-          <w:lang w:val="en-US"/>
-        </w:rPr>
-        <w:t>n</w:t>
-      </w:r>
-      <w:r>
-        <w:rPr>
-          <w:vertAlign w:val="subscript"/>
-          <w:lang w:val="en-US"/>
-        </w:rPr>
-        <w:t>H</w:t>
-      </w:r>
-      <w:r>
-        <w:rPr>
-          <w:lang w:val="en-US"/>
-        </w:rPr>
-        <w:t xml:space="preserve"> must be close to </w:t>
-      </w:r>
-      <w:r>
-        <w:rPr>
-          <w:lang w:val="en-US"/>
-        </w:rPr>
-        <w:t>n</w:t>
-      </w:r>
-      <w:r>
-        <w:rPr>
-          <w:vertAlign w:val="subscript"/>
-          <w:lang w:val="en-US"/>
-        </w:rPr>
-        <w:t>SbSe</w:t>
-      </w:r>
-      <w:r>
-        <w:rPr>
-          <w:lang w:val="en-US"/>
-        </w:rPr>
-        <w:t xml:space="preserve">, or it can be compensated by additional layer in the middle with asymmetrical numbers of unit cells </w:t>
+        <w:t>, and t</w:t>
+      </w:r>
+      <w:r>
+        <w:rPr>
+          <w:lang w:val="en-US"/>
+        </w:rPr>
+        <w:t>he</w:t>
+      </w:r>
+      <w:r>
+        <w:rPr>
+          <w:lang w:val="en-US"/>
+        </w:rPr>
+        <w:t xml:space="preserve"> loss of resonance due to absorption can be</w:t>
+      </w:r>
+      <w:r>
+        <w:rPr>
+          <w:lang w:val="en-US"/>
+        </w:rPr>
+        <w:t xml:space="preserve"> </w:t>
+      </w:r>
+      <w:r>
+        <w:rPr>
+          <w:lang w:val="en-US"/>
+        </w:rPr>
+        <w:t xml:space="preserve">compensated by </w:t>
+      </w:r>
+      <w:r>
+        <w:rPr>
+          <w:lang w:val="en-US"/>
+        </w:rPr>
+        <w:t xml:space="preserve">changing the structure to have an </w:t>
+      </w:r>
+      <w:r>
+        <w:rPr>
+          <w:lang w:val="en-US"/>
+        </w:rPr>
+        <w:t>additional layer</w:t>
+      </w:r>
+      <w:r>
+        <w:rPr>
+          <w:lang w:val="en-US"/>
+        </w:rPr>
+        <w:t>(s)</w:t>
+      </w:r>
+      <w:r>
+        <w:rPr>
+          <w:lang w:val="en-US"/>
+        </w:rPr>
+        <w:t xml:space="preserve"> </w:t>
+      </w:r>
+      <w:r>
+        <w:rPr>
+          <w:lang w:val="en-US"/>
+        </w:rPr>
+        <w:t>at</w:t>
+      </w:r>
+      <w:r>
+        <w:rPr>
+          <w:lang w:val="en-US"/>
+        </w:rPr>
+        <w:t xml:space="preserve"> the middle </w:t>
+      </w:r>
+      <w:r>
+        <w:rPr>
+          <w:lang w:val="en-US"/>
+        </w:rPr>
+        <w:t>while also reduce the number of unit cell on the incident side to create asymmetrical reflectors</w:t>
+      </w:r>
+      <w:r>
+        <w:rPr>
+          <w:lang w:val="en-US"/>
+        </w:rPr>
+        <w:t xml:space="preserve"> </w:t>
       </w:r>
       <w:r>
         <w:rPr>
@@ -22766,39 +22940,23 @@
         <w:t>1.0)</w:t>
       </w:r>
       <w:r>
-        <w:t xml:space="preserve"> to simplify the design and allows for a more widely applicable analysis methods, this could be done in reality by applying antireflection coating on the back side of the substrate</w:t>
-      </w:r>
-      <w:r>
-        <w:rPr>
-          <w:i/>
-          <w:iCs/>
-        </w:rPr>
+        <w:t xml:space="preserve"> to simplify the design and allows for a more widely applicable analysis methods</w:t>
+      </w:r>
+      <w:r>
+        <w:t>,</w:t>
+      </w:r>
+      <w:r>
         <w:t xml:space="preserve"> </w:t>
       </w:r>
       <w:r>
-        <w:fldChar w:fldCharType="begin"/>
-      </w:r>
-      <w:r>
-        <w:instrText xml:space="preserve"> ADDIN EN.CITE &lt;EndNote&gt;&lt;Cite&gt;&lt;Author&gt;Sarangan&lt;/Author&gt;&lt;Year&gt;2020&lt;/Year&gt;&lt;RecNum&gt;38&lt;/RecNum&gt;&lt;DisplayText&gt;[40]&lt;/DisplayText&gt;&lt;record&gt;&lt;rec-number&gt;38&lt;/rec-number&gt;&lt;foreign-keys&gt;&lt;key app="EN" db-id="v920pft06rp9dbex2ap500x99x5rrtswxzss" timestamp="1768049998" guid="dde7f428-59aa-475f-b9b0-297f1786a224"&gt;38&lt;/key&gt;&lt;/foreign-keys&gt;&lt;ref-type name="Journal Article"&gt;17&lt;/ref-type&gt;&lt;contributors&gt;&lt;authors&gt;&lt;author&gt;Sarangan, Andrew&lt;/author&gt;&lt;/authors&gt;&lt;/contributors&gt;&lt;titles&gt;&lt;title&gt;Design of resonant cavity thin film structures with complex active layers&lt;/title&gt;&lt;secondary-title&gt;Journal of the Optical Society of America B&lt;/secondary-title&gt;&lt;alt-title&gt;J. Opt. Soc. Am. B&lt;/alt-title&gt;&lt;/titles&gt;&lt;periodical&gt;&lt;full-title&gt;Journal of the Optical Society of America B&lt;/full-title&gt;&lt;abbr-1&gt;J. Opt. Soc. Am. B&lt;/abbr-1&gt;&lt;/periodical&gt;&lt;alt-periodical&gt;&lt;full-title&gt;Journal of the Optical Society of America B&lt;/full-title&gt;&lt;abbr-1&gt;J. Opt. Soc. Am. B&lt;/abbr-1&gt;&lt;/alt-periodical&gt;&lt;pages&gt;3461-3468&lt;/pages&gt;&lt;volume&gt;37&lt;/volume&gt;&lt;number&gt;11&lt;/number&gt;&lt;keywords&gt;&lt;keyword&gt;Bragg reflectors&lt;/keyword&gt;&lt;keyword&gt;Field enhancement&lt;/keyword&gt;&lt;keyword&gt;Optical absorption&lt;/keyword&gt;&lt;keyword&gt;Phase shift&lt;/keyword&gt;&lt;keyword&gt;Refractive index&lt;/keyword&gt;&lt;keyword&gt;Thin films&lt;/keyword&gt;&lt;/keywords&gt;&lt;dates&gt;&lt;year&gt;2020&lt;/year&gt;&lt;pub-dates&gt;&lt;date&gt;2020/11/01&lt;/date&gt;&lt;/pub-dates&gt;&lt;/dates&gt;&lt;publisher&gt;Optica Publishing Group&lt;/publisher&gt;&lt;urls&gt;&lt;related-urls&gt;&lt;url&gt;https://opg.optica.org/josab/abstract.cfm?URI=josab-37-11-3461&lt;/url&gt;&lt;/related-urls&gt;&lt;/urls&gt;&lt;electronic-resource-num&gt;10.1364/JOSAB.404894&lt;/electronic-resource-num&gt;&lt;/record&gt;&lt;/Cite&gt;&lt;/EndNote&gt;</w:instrText>
-      </w:r>
-      <w:r>
-        <w:fldChar w:fldCharType="separate"/>
-      </w:r>
-      <w:r>
-        <w:rPr>
-          <w:noProof/>
-        </w:rPr>
-        <w:t>[40]</w:t>
-      </w:r>
-      <w:r>
-        <w:fldChar w:fldCharType="end"/>
-      </w:r>
-      <w:r>
-        <w:t xml:space="preserve">. But in this work, we choose to use </w:t>
+        <w:t>b</w:t>
+      </w:r>
+      <w:r>
+        <w:t xml:space="preserve">ut in this work we </w:t>
       </w:r>
       <w:r>
         <w:lastRenderedPageBreak/>
-        <w:t>3-mm thick silica (SiO</w:t>
+        <w:t>choose to use 3-mm thick silica (SiO</w:t>
       </w:r>
       <w:r>
         <w:rPr>
@@ -23286,24 +23444,6 @@
       </w:r>
       <w:r>
         <w:t xml:space="preserve"> in an order of 10</w:t>
-      </w:r>
-      <w:r>
-        <w:rPr>
-          <w:vertAlign w:val="superscript"/>
-        </w:rPr>
-        <w:t>4</w:t>
-      </w:r>
-      <w:r>
-        <w:t xml:space="preserve"> </w:t>
-      </w:r>
-      <w:r>
-        <w:rPr>
-          <w:highlight w:val="green"/>
-        </w:rPr>
-        <w:t>[cite]</w:t>
-      </w:r>
-      <w:r>
-        <w:t xml:space="preserve"> and 10</w:t>
       </w:r>
       <w:r>
         <w:rPr>
@@ -23470,7 +23610,13 @@
         <w:fldChar w:fldCharType="end"/>
       </w:r>
       <w:r>
-        <w:t>. To account for this, the complex refractive index</w:t>
+        <w:t>.</w:t>
+      </w:r>
+      <w:r>
+        <w:t xml:space="preserve"> </w:t>
+      </w:r>
+      <w:r>
+        <w:t>To account for this, the complex refractive index</w:t>
       </w:r>
       <w:r>
         <w:t xml:space="preserve"> (</w:t>
@@ -23676,7 +23822,13 @@
       </w:r>
       <w:r>
         <w:tab/>
-        <w:t>(XXX)</w:t>
+        <w:t>(</w:t>
+      </w:r>
+      <w:r>
+        <w:t>24</w:t>
+      </w:r>
+      <w:r>
+        <w:t>)</w:t>
       </w:r>
     </w:p>
     <w:p>
@@ -23959,10 +24111,10 @@
         <w:tab/>
       </w:r>
       <w:r>
-        <w:t>(XX</w:t>
-      </w:r>
-      <w:r>
-        <w:t>A</w:t>
+        <w:t>(</w:t>
+      </w:r>
+      <w:r>
+        <w:t>25</w:t>
       </w:r>
       <w:r>
         <w:t>)</w:t>
@@ -24476,10 +24628,10 @@
         <w:tab/>
       </w:r>
       <w:r>
-        <w:t>(XX</w:t>
-      </w:r>
-      <w:r>
-        <w:t>B</w:t>
+        <w:t>(</w:t>
+      </w:r>
+      <w:r>
+        <w:t>26</w:t>
       </w:r>
       <w:r>
         <w:t>)</w:t>
@@ -25192,7 +25344,21 @@
           <w:lang w:val="en-US"/>
         </w:rPr>
         <w:tab/>
-        <w:t>(XX)</w:t>
+        <w:t>(</w:t>
+      </w:r>
+      <w:r>
+        <w:rPr>
+          <w:highlight w:val="yellow"/>
+          <w:lang w:val="en-US"/>
+        </w:rPr>
+        <w:t>27</w:t>
+      </w:r>
+      <w:r>
+        <w:rPr>
+          <w:highlight w:val="yellow"/>
+          <w:lang w:val="en-US"/>
+        </w:rPr>
+        <w:t>)</w:t>
       </w:r>
     </w:p>
     <w:p>
@@ -25246,82 +25412,43 @@
         <w:rPr>
           <w:highlight w:val="yellow"/>
         </w:rPr>
-        <w:t xml:space="preserve"> is the contrast of optical device between amorphous (ON) and crystalline (OFF) phases initially (cycle = 0). Transmission contrast (</w:t>
-      </w:r>
-      <w:r>
-        <w:rPr>
-          <w:i/>
-          <w:iCs/>
+        <w:t xml:space="preserve"> is the </w:t>
+      </w:r>
+      <w:r>
+        <w:rPr>
           <w:highlight w:val="yellow"/>
         </w:rPr>
-        <w:t>ΔT</w:t>
+        <w:t>difference between</w:t>
       </w:r>
       <w:r>
         <w:rPr>
           <w:highlight w:val="yellow"/>
         </w:rPr>
-        <w:t xml:space="preserve"> )can be defined as:</w:t>
-      </w:r>
-      <w:r>
-        <w:t xml:space="preserve"> </w:t>
-      </w:r>
-      <w:r>
-        <w:rPr>
-          <w:highlight w:val="cyan"/>
-        </w:rPr>
-        <w:t>(T</w:t>
-      </w:r>
-      <w:r>
-        <w:rPr>
-          <w:highlight w:val="cyan"/>
-          <w:vertAlign w:val="subscript"/>
-        </w:rPr>
-        <w:t>a</w:t>
-      </w:r>
-      <w:r>
-        <w:rPr>
-          <w:highlight w:val="cyan"/>
-        </w:rPr>
-        <w:t xml:space="preserve"> – T</w:t>
-      </w:r>
-      <w:r>
-        <w:rPr>
-          <w:highlight w:val="cyan"/>
-          <w:vertAlign w:val="subscript"/>
-        </w:rPr>
-        <w:t>c</w:t>
-      </w:r>
-      <w:r>
-        <w:rPr>
-          <w:highlight w:val="cyan"/>
-        </w:rPr>
-        <w:t xml:space="preserve"> or T</w:t>
-      </w:r>
-      <w:r>
-        <w:rPr>
-          <w:highlight w:val="cyan"/>
-          <w:vertAlign w:val="subscript"/>
-        </w:rPr>
-        <w:t xml:space="preserve">c </w:t>
-      </w:r>
-      <w:r>
-        <w:rPr>
-          <w:highlight w:val="cyan"/>
-        </w:rPr>
-        <w:t>– T</w:t>
-      </w:r>
-      <w:r>
-        <w:rPr>
-          <w:highlight w:val="cyan"/>
-          <w:vertAlign w:val="subscript"/>
-        </w:rPr>
-        <w:t>a</w:t>
-      </w:r>
-      <w:r>
-        <w:rPr>
-          <w:highlight w:val="cyan"/>
-        </w:rPr>
-        <w:t>)</w:t>
+        <w:t xml:space="preserve"> amorphous (ON) and crystalline (OFF) phases </w:t>
+      </w:r>
+      <w:r>
+        <w:rPr>
+          <w:highlight w:val="yellow"/>
+        </w:rPr>
+        <w:t xml:space="preserve">at the initial cycle </w:t>
+      </w:r>
+      <w:r>
+        <w:rPr>
+          <w:highlight w:val="yellow"/>
+        </w:rPr>
+        <w:t>(</w:t>
+      </w:r>
+      <w:r>
+        <w:rPr>
+          <w:highlight w:val="yellow"/>
+        </w:rPr>
+        <w:t>N</w:t>
+      </w:r>
+      <w:r>
+        <w:rPr>
+          <w:highlight w:val="yellow"/>
+        </w:rPr>
+        <w:t xml:space="preserve"> = 0).</w:t>
       </w:r>
     </w:p>
     <w:p>
@@ -25519,7 +25646,19 @@
           <w:highlight w:val="yellow"/>
         </w:rPr>
         <w:tab/>
-        <w:t>(XX)</w:t>
+        <w:t>(</w:t>
+      </w:r>
+      <w:r>
+        <w:rPr>
+          <w:highlight w:val="yellow"/>
+        </w:rPr>
+        <w:t>28</w:t>
+      </w:r>
+      <w:r>
+        <w:rPr>
+          <w:highlight w:val="yellow"/>
+        </w:rPr>
+        <w:t>)</w:t>
       </w:r>
     </w:p>
     <w:p>
@@ -25775,7 +25914,13 @@
       </w:r>
       <w:r>
         <w:tab/>
-        <w:t>(XX)</w:t>
+        <w:t>(</w:t>
+      </w:r>
+      <w:r>
+        <w:t>29</w:t>
+      </w:r>
+      <w:r>
+        <w:t>)</w:t>
       </w:r>
     </w:p>
     <w:p>
@@ -25881,93 +26026,132 @@
         <w:pStyle w:val="Heading2"/>
       </w:pPr>
       <w:r>
-        <w:t>4.1 1064-nm optical limiters</w:t>
-      </w:r>
-    </w:p>
-    <w:p>
-      <w:r>
-        <w:t>Antimony triselenide shows little to no absorption in the infrared spectra, so an ideal design could have 100% transmission in the ON mode and 0% in the OFF mode. The transmission</w:t>
-      </w:r>
-      <w:r>
-        <w:t xml:space="preserve"> of each mode</w:t>
-      </w:r>
-      <w:r>
-        <w:t>,</w:t>
-      </w:r>
-      <w:r>
-        <w:t xml:space="preserve"> transmission contrast,</w:t>
-      </w:r>
-      <w:r>
-        <w:t xml:space="preserve"> </w:t>
-      </w:r>
-      <w:r>
-        <w:t>Sb</w:t>
-      </w:r>
-      <w:r>
-        <w:rPr>
-          <w:vertAlign w:val="subscript"/>
-        </w:rPr>
-        <w:t>2</w:t>
-      </w:r>
-      <w:r>
-        <w:t>Se</w:t>
-      </w:r>
-      <w:r>
-        <w:rPr>
-          <w:vertAlign w:val="subscript"/>
-        </w:rPr>
-        <w:t>3</w:t>
-      </w:r>
-      <w:r>
-        <w:t xml:space="preserve"> thickness, </w:t>
-      </w:r>
-      <w:r>
-        <w:t>overall</w:t>
-      </w:r>
-      <w:r>
-        <w:t xml:space="preserve"> device thickness and the number of </w:t>
-      </w:r>
-      <w:r>
-        <w:t>thin film layers</w:t>
-      </w:r>
-      <w:r>
-        <w:t xml:space="preserve"> needed for each previously discussed </w:t>
-      </w:r>
-      <w:r>
-        <w:lastRenderedPageBreak/>
-        <w:t>design are show in Table 1.</w:t>
-      </w:r>
-      <w:r>
-        <w:t xml:space="preserve"> </w:t>
-      </w:r>
-      <w:r>
-        <w:t xml:space="preserve">Aside from the single-layer design, only </w:t>
-      </w:r>
-      <w:r>
-        <w:rPr>
-          <w:lang w:val="en"/>
-        </w:rPr>
-        <w:t>Fabry–Pérot</w:t>
-      </w:r>
-      <w:r>
-        <w:t xml:space="preserve"> designs show transmission contrast (</w:t>
-      </w:r>
-      <w:r>
-        <w:t>ΔT</w:t>
-      </w:r>
-      <w:r>
-        <w:t xml:space="preserve">) higher than 50% with 6 unit-cell design having the largest </w:t>
-      </w:r>
-      <w:r>
-        <w:t>ΔT</w:t>
-      </w:r>
-      <w:r>
-        <w:t xml:space="preserve">. </w:t>
+        <w:t xml:space="preserve">4.1 </w:t>
+      </w:r>
+      <w:r>
+        <w:rPr>
+          <w:highlight w:val="yellow"/>
+        </w:rPr>
+        <w:t>1064-nm optical limiters</w:t>
       </w:r>
     </w:p>
     <w:p>
       <w:pPr>
         <w:rPr>
+          <w:rFonts w:cs="Cordia New"/>
+          <w:lang w:val="en-US" w:bidi="th-TH"/>
+        </w:rPr>
+      </w:pPr>
+      <w:r>
+        <w:t xml:space="preserve">Antimony triselenide shows little to no absorption in the infrared spectra, so an ideal design could have 100% </w:t>
+      </w:r>
+      <w:r>
+        <w:t>transmittance</w:t>
+      </w:r>
+      <w:r>
+        <w:t xml:space="preserve"> in the ON mode and 0% in the OFF mode. The </w:t>
+      </w:r>
+      <w:r>
+        <w:t xml:space="preserve">number of layers, </w:t>
+      </w:r>
+      <w:r>
+        <w:t>Sb</w:t>
+      </w:r>
+      <w:r>
+        <w:rPr>
+          <w:vertAlign w:val="subscript"/>
+        </w:rPr>
+        <w:t>2</w:t>
+      </w:r>
+      <w:r>
+        <w:t>Se</w:t>
+      </w:r>
+      <w:r>
+        <w:rPr>
+          <w:vertAlign w:val="subscript"/>
+        </w:rPr>
+        <w:t>3</w:t>
+      </w:r>
+      <w:r>
+        <w:t xml:space="preserve"> thickness, </w:t>
+      </w:r>
+      <w:r>
+        <w:t>overall</w:t>
+      </w:r>
+      <w:r>
+        <w:t xml:space="preserve"> device </w:t>
+      </w:r>
+      <w:r>
+        <w:lastRenderedPageBreak/>
+        <w:t>thickness, transmittance</w:t>
+      </w:r>
+      <w:r>
+        <w:t xml:space="preserve"> of each mode</w:t>
+      </w:r>
+      <w:r>
+        <w:t>,</w:t>
+      </w:r>
+      <w:r>
+        <w:t xml:space="preserve"> </w:t>
+      </w:r>
+      <w:r>
+        <w:t xml:space="preserve">and transmittance </w:t>
+      </w:r>
+      <w:r>
+        <w:t>contrast</w:t>
+      </w:r>
+      <w:r>
+        <w:t xml:space="preserve"> of each design </w:t>
+      </w:r>
+      <w:r>
+        <w:t>are show</w:t>
+      </w:r>
+      <w:r>
+        <w:t>n</w:t>
+      </w:r>
+      <w:r>
+        <w:t xml:space="preserve"> in Table 1.</w:t>
+      </w:r>
+      <w:r>
+        <w:t xml:space="preserve"> </w:t>
+      </w:r>
+      <w:r>
+        <w:t xml:space="preserve">Aside from the single-layer design, only </w:t>
+      </w:r>
+      <w:r>
+        <w:rPr>
+          <w:lang w:val="en"/>
+        </w:rPr>
+        <w:t>edge-filter</w:t>
+      </w:r>
+      <w:r>
+        <w:t xml:space="preserve"> designs show transmission contrast (</w:t>
+      </w:r>
+      <w:r>
+        <w:t>ΔT</w:t>
+      </w:r>
+      <w:r>
+        <w:t xml:space="preserve">) higher than 50% with </w:t>
+      </w:r>
+      <w:r>
+        <w:t>5</w:t>
+      </w:r>
+      <w:r>
+        <w:t xml:space="preserve"> unit-cell design having the largest </w:t>
+      </w:r>
+      <w:r>
+        <w:t>ΔT</w:t>
+      </w:r>
+      <w:r>
+        <w:t xml:space="preserve"> = 93.4%</w:t>
+      </w:r>
+      <w:r>
+        <w:t>.</w:t>
+      </w:r>
+    </w:p>
+    <w:p>
+      <w:pPr>
+        <w:rPr>
           <w:b/>
           <w:bCs/>
         </w:rPr>
@@ -26004,19 +26188,37 @@
         <w:t>λ</w:t>
       </w:r>
       <w:r>
-        <w:t xml:space="preserve"> = 1064 nm. The </w:t>
+        <w:t xml:space="preserve"> = 1064 nm. </w:t>
+      </w:r>
+      <w:r>
+        <w:t xml:space="preserve">Single, two, and three-layer designs all have </w:t>
+      </w:r>
+      <w:r>
+        <w:rPr>
+          <w:i/>
+          <w:iCs/>
+        </w:rPr>
+        <w:t>λ</w:t>
+      </w:r>
+      <w:r>
+        <w:rPr>
+          <w:i/>
+          <w:iCs/>
+          <w:vertAlign w:val="subscript"/>
+        </w:rPr>
+        <w:t xml:space="preserve">0 </w:t>
+      </w:r>
+      <w:r>
+        <w:t xml:space="preserve">= 1064 nm, but </w:t>
       </w:r>
       <w:r>
         <w:rPr>
           <w:lang w:val="en"/>
         </w:rPr>
-        <w:t>Fabry–Pérot</w:t>
-      </w:r>
-      <w:r>
-        <w:t xml:space="preserve"> </w:t>
-      </w:r>
-      <w:r>
-        <w:t xml:space="preserve">cavity designs have </w:t>
+        <w:t>edge-filter</w:t>
+      </w:r>
+      <w:r>
+        <w:t xml:space="preserve"> designs have </w:t>
       </w:r>
       <w:r>
         <w:rPr>
@@ -26714,7 +26916,6 @@
                 <w:bCs w:val="0"/>
                 <w:sz w:val="18"/>
                 <w:szCs w:val="18"/>
-                <w:highlight w:val="magenta"/>
               </w:rPr>
             </w:pPr>
             <w:r>
@@ -26724,7 +26925,6 @@
                 <w:bCs w:val="0"/>
                 <w:sz w:val="18"/>
                 <w:szCs w:val="18"/>
-                <w:highlight w:val="magenta"/>
               </w:rPr>
               <w:t>Two-layer</w:t>
             </w:r>
@@ -26742,7 +26942,6 @@
                 <w:rFonts w:cstheme="majorBidi"/>
                 <w:sz w:val="18"/>
                 <w:szCs w:val="18"/>
-                <w:highlight w:val="magenta"/>
               </w:rPr>
             </w:pPr>
             <w:r>
@@ -26750,7 +26949,6 @@
                 <w:rFonts w:cstheme="majorBidi"/>
                 <w:sz w:val="18"/>
                 <w:szCs w:val="18"/>
-                <w:highlight w:val="magenta"/>
               </w:rPr>
               <w:t>SbSe/TiO</w:t>
             </w:r>
@@ -26769,7 +26967,6 @@
                 <w:rFonts w:cstheme="majorBidi"/>
                 <w:sz w:val="18"/>
                 <w:szCs w:val="18"/>
-                <w:highlight w:val="magenta"/>
               </w:rPr>
             </w:pPr>
             <w:r>
@@ -26777,7 +26974,6 @@
                 <w:rFonts w:cstheme="majorBidi"/>
                 <w:sz w:val="18"/>
                 <w:szCs w:val="18"/>
-                <w:highlight w:val="magenta"/>
               </w:rPr>
               <w:t>2</w:t>
             </w:r>
@@ -26795,7 +26991,6 @@
                 <w:rFonts w:cstheme="majorBidi"/>
                 <w:sz w:val="18"/>
                 <w:szCs w:val="18"/>
-                <w:highlight w:val="magenta"/>
               </w:rPr>
             </w:pPr>
             <w:r>
@@ -26803,7 +26998,6 @@
                 <w:rFonts w:cstheme="majorBidi"/>
                 <w:sz w:val="18"/>
                 <w:szCs w:val="18"/>
-                <w:highlight w:val="magenta"/>
               </w:rPr>
               <w:t>78.9</w:t>
             </w:r>
@@ -26821,7 +27015,6 @@
                 <w:rFonts w:cstheme="majorBidi"/>
                 <w:sz w:val="18"/>
                 <w:szCs w:val="18"/>
-                <w:highlight w:val="magenta"/>
               </w:rPr>
             </w:pPr>
             <w:r>
@@ -26829,7 +27022,6 @@
                 <w:rFonts w:cstheme="majorBidi"/>
                 <w:sz w:val="18"/>
                 <w:szCs w:val="18"/>
-                <w:highlight w:val="magenta"/>
               </w:rPr>
               <w:t>194.1</w:t>
             </w:r>
@@ -26847,7 +27039,6 @@
                 <w:rFonts w:cstheme="majorBidi"/>
                 <w:sz w:val="18"/>
                 <w:szCs w:val="18"/>
-                <w:highlight w:val="magenta"/>
               </w:rPr>
             </w:pPr>
             <w:r>
@@ -26855,7 +27046,6 @@
                 <w:rFonts w:cstheme="majorBidi"/>
                 <w:sz w:val="18"/>
                 <w:szCs w:val="18"/>
-                <w:highlight w:val="magenta"/>
               </w:rPr>
               <w:t>93.3</w:t>
             </w:r>
@@ -26873,7 +27063,6 @@
                 <w:rFonts w:cstheme="majorBidi"/>
                 <w:sz w:val="18"/>
                 <w:szCs w:val="18"/>
-                <w:highlight w:val="magenta"/>
               </w:rPr>
             </w:pPr>
             <w:r>
@@ -26881,7 +27070,6 @@
                 <w:rFonts w:cstheme="majorBidi"/>
                 <w:sz w:val="18"/>
                 <w:szCs w:val="18"/>
-                <w:highlight w:val="magenta"/>
               </w:rPr>
               <w:t>76.9</w:t>
             </w:r>
@@ -26899,7 +27087,6 @@
                 <w:rFonts w:cstheme="majorBidi"/>
                 <w:sz w:val="18"/>
                 <w:szCs w:val="18"/>
-                <w:highlight w:val="magenta"/>
                 <w:lang w:val="en-US"/>
               </w:rPr>
             </w:pPr>
@@ -26908,7 +27095,6 @@
                 <w:rFonts w:cstheme="majorBidi"/>
                 <w:sz w:val="18"/>
                 <w:szCs w:val="18"/>
-                <w:highlight w:val="magenta"/>
               </w:rPr>
               <w:t>16.4</w:t>
             </w:r>
@@ -27555,7 +27741,7 @@
                 <w:sz w:val="18"/>
                 <w:szCs w:val="18"/>
               </w:rPr>
-              <w:t>44.1</w:t>
+              <w:t>49.5</w:t>
             </w:r>
           </w:p>
         </w:tc>
@@ -27579,7 +27765,7 @@
                 <w:sz w:val="18"/>
                 <w:szCs w:val="18"/>
               </w:rPr>
-              <w:t>179.9</w:t>
+              <w:t>185.3</w:t>
             </w:r>
           </w:p>
         </w:tc>
@@ -27603,7 +27789,7 @@
                 <w:sz w:val="18"/>
                 <w:szCs w:val="18"/>
               </w:rPr>
-              <w:t>95.1</w:t>
+              <w:t>93.3</w:t>
             </w:r>
           </w:p>
         </w:tc>
@@ -27627,7 +27813,7 @@
                 <w:sz w:val="18"/>
                 <w:szCs w:val="18"/>
               </w:rPr>
-              <w:t>65.4</w:t>
+              <w:t>50.1</w:t>
             </w:r>
           </w:p>
         </w:tc>
@@ -27651,7 +27837,7 @@
                 <w:sz w:val="18"/>
                 <w:szCs w:val="18"/>
               </w:rPr>
-              <w:t>29.7</w:t>
+              <w:t>43.2</w:t>
             </w:r>
           </w:p>
         </w:tc>
@@ -27891,7 +28077,7 @@
                 <w:sz w:val="18"/>
                 <w:szCs w:val="18"/>
               </w:rPr>
-              <w:t>88.1</w:t>
+              <w:t>99.0</w:t>
             </w:r>
           </w:p>
         </w:tc>
@@ -27915,7 +28101,7 @@
                 <w:sz w:val="18"/>
                 <w:szCs w:val="18"/>
               </w:rPr>
-              <w:t>359.8</w:t>
+              <w:t>370.7</w:t>
             </w:r>
           </w:p>
         </w:tc>
@@ -27939,7 +28125,7 @@
                 <w:sz w:val="18"/>
                 <w:szCs w:val="18"/>
               </w:rPr>
-              <w:t>96.6</w:t>
+              <w:t>93.1</w:t>
             </w:r>
           </w:p>
         </w:tc>
@@ -27963,7 +28149,7 @@
                 <w:sz w:val="18"/>
                 <w:szCs w:val="18"/>
               </w:rPr>
-              <w:t>27.6</w:t>
+              <w:t>13.3</w:t>
             </w:r>
           </w:p>
         </w:tc>
@@ -27987,7 +28173,364 @@
                 <w:sz w:val="18"/>
                 <w:szCs w:val="18"/>
               </w:rPr>
-              <w:t>69.0</w:t>
+              <w:t>79.8</w:t>
+            </w:r>
+          </w:p>
+        </w:tc>
+      </w:tr>
+      <w:tr>
+        <w:trPr>
+          <w:trHeight w:val="340"/>
+        </w:trPr>
+        <w:tc>
+          <w:tcPr>
+            <w:cnfStyle w:val="001000000000" w:firstRow="0" w:lastRow="0" w:firstColumn="1" w:lastColumn="0" w:oddVBand="0" w:evenVBand="0" w:oddHBand="0" w:evenHBand="0" w:firstRowFirstColumn="0" w:firstRowLastColumn="0" w:lastRowFirstColumn="0" w:lastRowLastColumn="0"/>
+            <w:tcW w:w="1191" w:type="dxa"/>
+            <w:vAlign w:val="center"/>
+          </w:tcPr>
+          <w:p>
+            <w:pPr>
+              <w:jc w:val="center"/>
+              <w:rPr>
+                <w:rFonts w:cstheme="majorBidi"/>
+                <w:sz w:val="18"/>
+                <w:szCs w:val="18"/>
+                <w:highlight w:val="magenta"/>
+              </w:rPr>
+            </w:pPr>
+            <w:r>
+              <w:rPr>
+                <w:rFonts w:cstheme="majorBidi"/>
+                <w:b w:val="0"/>
+                <w:bCs w:val="0"/>
+                <w:sz w:val="18"/>
+                <w:szCs w:val="18"/>
+                <w:highlight w:val="magenta"/>
+              </w:rPr>
+              <w:t>Edge filter</w:t>
+            </w:r>
+          </w:p>
+        </w:tc>
+        <w:tc>
+          <w:tcPr>
+            <w:tcW w:w="1701" w:type="dxa"/>
+          </w:tcPr>
+          <w:p>
+            <w:pPr>
+              <w:jc w:val="center"/>
+              <w:cnfStyle w:val="000000000000" w:firstRow="0" w:lastRow="0" w:firstColumn="0" w:lastColumn="0" w:oddVBand="0" w:evenVBand="0" w:oddHBand="0" w:evenHBand="0" w:firstRowFirstColumn="0" w:firstRowLastColumn="0" w:lastRowFirstColumn="0" w:lastRowLastColumn="0"/>
+              <w:rPr>
+                <w:rFonts w:ascii="Times New Roman" w:eastAsia="Yu Gothic" w:hAnsi="Times New Roman" w:cs="Times New Roman"/>
+                <w:iCs/>
+                <w:sz w:val="15"/>
+                <w:szCs w:val="15"/>
+                <w:highlight w:val="magenta"/>
+              </w:rPr>
+            </w:pPr>
+            <m:oMathPara>
+              <m:oMath>
+                <m:sSup>
+                  <m:sSupPr>
+                    <m:ctrlPr>
+                      <w:rPr>
+                        <w:rFonts w:ascii="Cambria Math" w:hAnsi="Cambria Math" w:cstheme="majorBidi"/>
+                        <w:iCs/>
+                        <w:sz w:val="15"/>
+                        <w:szCs w:val="15"/>
+                        <w:highlight w:val="magenta"/>
+                      </w:rPr>
+                    </m:ctrlPr>
+                  </m:sSupPr>
+                  <m:e>
+                    <m:r>
+                      <m:rPr>
+                        <m:sty m:val="p"/>
+                      </m:rPr>
+                      <w:rPr>
+                        <w:rFonts w:ascii="Cambria Math" w:hAnsi="Cambria Math" w:cstheme="majorBidi"/>
+                        <w:sz w:val="15"/>
+                        <w:szCs w:val="15"/>
+                        <w:highlight w:val="magenta"/>
+                      </w:rPr>
+                      <m:t>(</m:t>
+                    </m:r>
+                    <m:f>
+                      <m:fPr>
+                        <m:ctrlPr>
+                          <w:rPr>
+                            <w:rFonts w:ascii="Cambria Math" w:hAnsi="Cambria Math" w:cstheme="majorBidi"/>
+                            <w:iCs/>
+                            <w:sz w:val="15"/>
+                            <w:szCs w:val="15"/>
+                            <w:highlight w:val="magenta"/>
+                          </w:rPr>
+                        </m:ctrlPr>
+                      </m:fPr>
+                      <m:num>
+                        <m:r>
+                          <m:rPr>
+                            <m:sty m:val="p"/>
+                          </m:rPr>
+                          <w:rPr>
+                            <w:rFonts w:ascii="Cambria Math" w:hAnsi="Cambria Math" w:cstheme="majorBidi"/>
+                            <w:sz w:val="15"/>
+                            <w:szCs w:val="15"/>
+                            <w:highlight w:val="magenta"/>
+                          </w:rPr>
+                          <m:t>SbSe</m:t>
+                        </m:r>
+                      </m:num>
+                      <m:den>
+                        <m:r>
+                          <m:rPr>
+                            <m:sty m:val="p"/>
+                          </m:rPr>
+                          <w:rPr>
+                            <w:rFonts w:ascii="Cambria Math" w:hAnsi="Cambria Math" w:cstheme="majorBidi"/>
+                            <w:sz w:val="15"/>
+                            <w:szCs w:val="15"/>
+                            <w:highlight w:val="magenta"/>
+                          </w:rPr>
+                          <m:t>2</m:t>
+                        </m:r>
+                      </m:den>
+                    </m:f>
+                    <m:r>
+                      <m:rPr>
+                        <m:sty m:val="p"/>
+                      </m:rPr>
+                      <w:rPr>
+                        <w:rFonts w:ascii="Cambria Math" w:hAnsi="Cambria Math" w:cstheme="majorBidi"/>
+                        <w:sz w:val="15"/>
+                        <w:szCs w:val="15"/>
+                        <w:highlight w:val="magenta"/>
+                      </w:rPr>
+                      <m:t>/MgF/</m:t>
+                    </m:r>
+                    <m:f>
+                      <m:fPr>
+                        <m:ctrlPr>
+                          <w:rPr>
+                            <w:rFonts w:ascii="Cambria Math" w:hAnsi="Cambria Math" w:cstheme="majorBidi"/>
+                            <w:iCs/>
+                            <w:sz w:val="15"/>
+                            <w:szCs w:val="15"/>
+                            <w:highlight w:val="magenta"/>
+                          </w:rPr>
+                        </m:ctrlPr>
+                      </m:fPr>
+                      <m:num>
+                        <m:r>
+                          <m:rPr>
+                            <m:sty m:val="p"/>
+                          </m:rPr>
+                          <w:rPr>
+                            <w:rFonts w:ascii="Cambria Math" w:hAnsi="Cambria Math" w:cstheme="majorBidi"/>
+                            <w:sz w:val="15"/>
+                            <w:szCs w:val="15"/>
+                            <w:highlight w:val="magenta"/>
+                          </w:rPr>
+                          <m:t>SbSe</m:t>
+                        </m:r>
+                      </m:num>
+                      <m:den>
+                        <m:r>
+                          <m:rPr>
+                            <m:sty m:val="p"/>
+                          </m:rPr>
+                          <w:rPr>
+                            <w:rFonts w:ascii="Cambria Math" w:hAnsi="Cambria Math" w:cstheme="majorBidi"/>
+                            <w:sz w:val="15"/>
+                            <w:szCs w:val="15"/>
+                            <w:highlight w:val="magenta"/>
+                          </w:rPr>
+                          <m:t>2</m:t>
+                        </m:r>
+                      </m:den>
+                    </m:f>
+                    <m:r>
+                      <m:rPr>
+                        <m:sty m:val="p"/>
+                      </m:rPr>
+                      <w:rPr>
+                        <w:rFonts w:ascii="Cambria Math" w:hAnsi="Cambria Math" w:cstheme="majorBidi"/>
+                        <w:sz w:val="15"/>
+                        <w:szCs w:val="15"/>
+                        <w:highlight w:val="magenta"/>
+                      </w:rPr>
+                      <m:t>)</m:t>
+                    </m:r>
+                  </m:e>
+                  <m:sup>
+                    <m:r>
+                      <w:rPr>
+                        <w:rFonts w:ascii="Cambria Math" w:hAnsi="Cambria Math" w:cstheme="majorBidi"/>
+                        <w:sz w:val="15"/>
+                        <w:szCs w:val="15"/>
+                        <w:highlight w:val="magenta"/>
+                      </w:rPr>
+                      <m:t>3</m:t>
+                    </m:r>
+                  </m:sup>
+                </m:sSup>
+              </m:oMath>
+            </m:oMathPara>
+          </w:p>
+        </w:tc>
+        <w:tc>
+          <w:tcPr>
+            <w:tcW w:w="850" w:type="dxa"/>
+            <w:vAlign w:val="center"/>
+          </w:tcPr>
+          <w:p>
+            <w:pPr>
+              <w:jc w:val="right"/>
+              <w:cnfStyle w:val="000000000000" w:firstRow="0" w:lastRow="0" w:firstColumn="0" w:lastColumn="0" w:oddVBand="0" w:evenVBand="0" w:oddHBand="0" w:evenHBand="0" w:firstRowFirstColumn="0" w:firstRowLastColumn="0" w:lastRowFirstColumn="0" w:lastRowLastColumn="0"/>
+              <w:rPr>
+                <w:rFonts w:cstheme="majorBidi"/>
+                <w:sz w:val="18"/>
+                <w:szCs w:val="18"/>
+                <w:highlight w:val="magenta"/>
+              </w:rPr>
+            </w:pPr>
+            <w:r>
+              <w:rPr>
+                <w:rFonts w:cstheme="majorBidi"/>
+                <w:sz w:val="18"/>
+                <w:szCs w:val="18"/>
+                <w:highlight w:val="magenta"/>
+              </w:rPr>
+              <w:t>7</w:t>
+            </w:r>
+          </w:p>
+        </w:tc>
+        <w:tc>
+          <w:tcPr>
+            <w:tcW w:w="1077" w:type="dxa"/>
+          </w:tcPr>
+          <w:p>
+            <w:pPr>
+              <w:jc w:val="right"/>
+              <w:cnfStyle w:val="000000000000" w:firstRow="0" w:lastRow="0" w:firstColumn="0" w:lastColumn="0" w:oddVBand="0" w:evenVBand="0" w:oddHBand="0" w:evenHBand="0" w:firstRowFirstColumn="0" w:firstRowLastColumn="0" w:lastRowFirstColumn="0" w:lastRowLastColumn="0"/>
+              <w:rPr>
+                <w:rFonts w:cstheme="majorBidi"/>
+                <w:sz w:val="18"/>
+                <w:szCs w:val="18"/>
+                <w:highlight w:val="magenta"/>
+              </w:rPr>
+            </w:pPr>
+            <w:r>
+              <w:rPr>
+                <w:rFonts w:cstheme="majorBidi"/>
+                <w:sz w:val="18"/>
+                <w:szCs w:val="18"/>
+                <w:highlight w:val="magenta"/>
+              </w:rPr>
+              <w:t>148.5</w:t>
+            </w:r>
+          </w:p>
+        </w:tc>
+        <w:tc>
+          <w:tcPr>
+            <w:tcW w:w="1077" w:type="dxa"/>
+          </w:tcPr>
+          <w:p>
+            <w:pPr>
+              <w:jc w:val="right"/>
+              <w:cnfStyle w:val="000000000000" w:firstRow="0" w:lastRow="0" w:firstColumn="0" w:lastColumn="0" w:oddVBand="0" w:evenVBand="0" w:oddHBand="0" w:evenHBand="0" w:firstRowFirstColumn="0" w:firstRowLastColumn="0" w:lastRowFirstColumn="0" w:lastRowLastColumn="0"/>
+              <w:rPr>
+                <w:rFonts w:cstheme="majorBidi"/>
+                <w:sz w:val="18"/>
+                <w:szCs w:val="18"/>
+                <w:highlight w:val="magenta"/>
+              </w:rPr>
+            </w:pPr>
+            <w:r>
+              <w:rPr>
+                <w:rFonts w:cstheme="majorBidi"/>
+                <w:sz w:val="18"/>
+                <w:szCs w:val="18"/>
+                <w:highlight w:val="magenta"/>
+              </w:rPr>
+              <w:t>556.0</w:t>
+            </w:r>
+          </w:p>
+        </w:tc>
+        <w:tc>
+          <w:tcPr>
+            <w:tcW w:w="964" w:type="dxa"/>
+          </w:tcPr>
+          <w:p>
+            <w:pPr>
+              <w:jc w:val="right"/>
+              <w:cnfStyle w:val="000000000000" w:firstRow="0" w:lastRow="0" w:firstColumn="0" w:lastColumn="0" w:oddVBand="0" w:evenVBand="0" w:oddHBand="0" w:evenHBand="0" w:firstRowFirstColumn="0" w:firstRowLastColumn="0" w:lastRowFirstColumn="0" w:lastRowLastColumn="0"/>
+              <w:rPr>
+                <w:rFonts w:cstheme="majorBidi"/>
+                <w:sz w:val="18"/>
+                <w:szCs w:val="18"/>
+                <w:highlight w:val="magenta"/>
+              </w:rPr>
+            </w:pPr>
+            <w:r>
+              <w:rPr>
+                <w:rFonts w:cstheme="majorBidi"/>
+                <w:sz w:val="18"/>
+                <w:szCs w:val="18"/>
+                <w:highlight w:val="magenta"/>
+              </w:rPr>
+              <w:t>93.0</w:t>
+            </w:r>
+          </w:p>
+        </w:tc>
+        <w:tc>
+          <w:tcPr>
+            <w:tcW w:w="964" w:type="dxa"/>
+          </w:tcPr>
+          <w:p>
+            <w:pPr>
+              <w:jc w:val="right"/>
+              <w:cnfStyle w:val="000000000000" w:firstRow="0" w:lastRow="0" w:firstColumn="0" w:lastColumn="0" w:oddVBand="0" w:evenVBand="0" w:oddHBand="0" w:evenHBand="0" w:firstRowFirstColumn="0" w:firstRowLastColumn="0" w:lastRowFirstColumn="0" w:lastRowLastColumn="0"/>
+              <w:rPr>
+                <w:rFonts w:cstheme="majorBidi"/>
+                <w:sz w:val="18"/>
+                <w:szCs w:val="18"/>
+                <w:highlight w:val="magenta"/>
+              </w:rPr>
+            </w:pPr>
+            <w:r>
+              <w:rPr>
+                <w:rFonts w:cstheme="majorBidi"/>
+                <w:sz w:val="18"/>
+                <w:szCs w:val="18"/>
+                <w:highlight w:val="magenta"/>
+              </w:rPr>
+              <w:t>2.9</w:t>
+            </w:r>
+          </w:p>
+        </w:tc>
+        <w:tc>
+          <w:tcPr>
+            <w:tcW w:w="964" w:type="dxa"/>
+          </w:tcPr>
+          <w:p>
+            <w:pPr>
+              <w:jc w:val="right"/>
+              <w:cnfStyle w:val="000000000000" w:firstRow="0" w:lastRow="0" w:firstColumn="0" w:lastColumn="0" w:oddVBand="0" w:evenVBand="0" w:oddHBand="0" w:evenHBand="0" w:firstRowFirstColumn="0" w:firstRowLastColumn="0" w:lastRowFirstColumn="0" w:lastRowLastColumn="0"/>
+              <w:rPr>
+                <w:rFonts w:cstheme="majorBidi"/>
+                <w:sz w:val="18"/>
+                <w:szCs w:val="18"/>
+                <w:highlight w:val="magenta"/>
+              </w:rPr>
+            </w:pPr>
+            <w:r>
+              <w:rPr>
+                <w:rFonts w:cstheme="majorBidi"/>
+                <w:sz w:val="18"/>
+                <w:szCs w:val="18"/>
+                <w:highlight w:val="magenta"/>
+              </w:rPr>
+              <w:t>90.1</w:t>
             </w:r>
           </w:p>
         </w:tc>
@@ -28227,7 +28770,7 @@
                 <w:sz w:val="18"/>
                 <w:szCs w:val="18"/>
               </w:rPr>
-              <w:t>176.3</w:t>
+              <w:t>198.0</w:t>
             </w:r>
           </w:p>
         </w:tc>
@@ -28251,7 +28794,7 @@
                 <w:sz w:val="18"/>
                 <w:szCs w:val="18"/>
               </w:rPr>
-              <w:t>719.6</w:t>
+              <w:t>741.3</w:t>
             </w:r>
           </w:p>
         </w:tc>
@@ -28275,7 +28818,7 @@
                 <w:sz w:val="18"/>
                 <w:szCs w:val="18"/>
               </w:rPr>
-              <w:t>93.5</w:t>
+              <w:t>93.3</w:t>
             </w:r>
           </w:p>
         </w:tc>
@@ -28299,7 +28842,7 @@
                 <w:sz w:val="18"/>
                 <w:szCs w:val="18"/>
               </w:rPr>
-              <w:t>2.8</w:t>
+              <w:t>0.6</w:t>
             </w:r>
           </w:p>
         </w:tc>
@@ -28323,7 +28866,7 @@
                 <w:sz w:val="18"/>
                 <w:szCs w:val="18"/>
               </w:rPr>
-              <w:t>90.7</w:t>
+              <w:t>92.7</w:t>
             </w:r>
           </w:p>
         </w:tc>
@@ -28592,9 +29135,8 @@
                 <w:sz w:val="18"/>
                 <w:szCs w:val="18"/>
                 <w:highlight w:val="magenta"/>
-                <w:lang w:bidi="th-TH"/>
-              </w:rPr>
-              <w:t>220.3</w:t>
+              </w:rPr>
+              <w:t>247.5</w:t>
             </w:r>
           </w:p>
         </w:tc>
@@ -28620,7 +29162,7 @@
                 <w:szCs w:val="18"/>
                 <w:highlight w:val="magenta"/>
               </w:rPr>
-              <w:t>899.5</w:t>
+              <w:t>926.7</w:t>
             </w:r>
           </w:p>
         </w:tc>
@@ -28646,7 +29188,7 @@
                 <w:szCs w:val="18"/>
                 <w:highlight w:val="magenta"/>
               </w:rPr>
-              <w:t>95.3</w:t>
+              <w:t>93.5</w:t>
             </w:r>
           </w:p>
         </w:tc>
@@ -28672,7 +29214,7 @@
                 <w:szCs w:val="18"/>
                 <w:highlight w:val="magenta"/>
               </w:rPr>
-              <w:t>0.8</w:t>
+              <w:t>0.1</w:t>
             </w:r>
           </w:p>
         </w:tc>
@@ -28698,7 +29240,7 @@
                 <w:szCs w:val="18"/>
                 <w:highlight w:val="magenta"/>
               </w:rPr>
-              <w:t>94.5</w:t>
+              <w:t>93.4</w:t>
             </w:r>
           </w:p>
         </w:tc>
@@ -28939,10 +29481,8 @@
                 <w:rFonts w:cstheme="majorBidi"/>
                 <w:sz w:val="18"/>
                 <w:szCs w:val="18"/>
-                <w:cs/>
-                <w:lang w:bidi="th-TH"/>
-              </w:rPr>
-              <w:t>264.4</w:t>
+              </w:rPr>
+              <w:t>296.9</w:t>
             </w:r>
           </w:p>
         </w:tc>
@@ -28965,29 +29505,8 @@
                 <w:rFonts w:cstheme="majorBidi"/>
                 <w:sz w:val="18"/>
                 <w:szCs w:val="18"/>
-                <w:cs/>
-                <w:lang w:bidi="th-TH"/>
-              </w:rPr>
-              <w:t>1</w:t>
-            </w:r>
-            <w:r>
-              <w:rPr>
-                <w:rFonts w:cstheme="majorBidi"/>
-                <w:sz w:val="18"/>
-                <w:szCs w:val="18"/>
-                <w:lang w:bidi="th-TH"/>
-              </w:rPr>
-              <w:t>,</w:t>
-            </w:r>
-            <w:r>
-              <w:rPr>
-                <w:rFonts w:cstheme="majorBidi"/>
-                <w:sz w:val="18"/>
-                <w:szCs w:val="18"/>
-                <w:cs/>
-                <w:lang w:bidi="th-TH"/>
-              </w:rPr>
-              <w:t>079.4</w:t>
+              </w:rPr>
+              <w:t>1,112.0</w:t>
             </w:r>
           </w:p>
         </w:tc>
@@ -29010,10 +29529,8 @@
                 <w:rFonts w:cstheme="majorBidi"/>
                 <w:sz w:val="18"/>
                 <w:szCs w:val="18"/>
-                <w:cs/>
-                <w:lang w:bidi="th-TH"/>
-              </w:rPr>
-              <w:t>96.5</w:t>
+              </w:rPr>
+              <w:t>93.3</w:t>
             </w:r>
           </w:p>
         </w:tc>
@@ -29039,7 +29556,7 @@
                 <w:szCs w:val="18"/>
                 <w:lang w:bidi="th-TH"/>
               </w:rPr>
-              <w:t>0.3</w:t>
+              <w:t>0.0</w:t>
             </w:r>
           </w:p>
         </w:tc>
@@ -29062,10 +29579,8 @@
                 <w:rFonts w:cstheme="majorBidi"/>
                 <w:sz w:val="18"/>
                 <w:szCs w:val="18"/>
-                <w:cs/>
-                <w:lang w:bidi="th-TH"/>
-              </w:rPr>
-              <w:t>96.2</w:t>
+              </w:rPr>
+              <w:t>93.3</w:t>
             </w:r>
           </w:p>
         </w:tc>
@@ -29078,9 +29593,6 @@
           <w:tcPr>
             <w:cnfStyle w:val="001000000000" w:firstRow="0" w:lastRow="0" w:firstColumn="1" w:lastColumn="0" w:oddVBand="0" w:evenVBand="0" w:oddHBand="0" w:evenHBand="0" w:firstRowFirstColumn="0" w:firstRowLastColumn="0" w:lastRowFirstColumn="0" w:lastRowLastColumn="0"/>
             <w:tcW w:w="1191" w:type="dxa"/>
-            <w:tcBorders>
-              <w:bottom w:val="single" w:sz="8" w:space="0" w:color="000000" w:themeColor="text1"/>
-            </w:tcBorders>
             <w:vAlign w:val="center"/>
           </w:tcPr>
           <w:p>
@@ -29109,9 +29621,6 @@
         <w:tc>
           <w:tcPr>
             <w:tcW w:w="1701" w:type="dxa"/>
-            <w:tcBorders>
-              <w:bottom w:val="single" w:sz="8" w:space="0" w:color="000000" w:themeColor="text1"/>
-            </w:tcBorders>
           </w:tcPr>
           <w:p>
             <w:pPr>
@@ -29269,9 +29778,6 @@
         <w:tc>
           <w:tcPr>
             <w:tcW w:w="850" w:type="dxa"/>
-            <w:tcBorders>
-              <w:bottom w:val="single" w:sz="8" w:space="0" w:color="000000" w:themeColor="text1"/>
-            </w:tcBorders>
             <w:vAlign w:val="center"/>
           </w:tcPr>
           <w:p>
@@ -29301,9 +29807,6 @@
         <w:tc>
           <w:tcPr>
             <w:tcW w:w="1077" w:type="dxa"/>
-            <w:tcBorders>
-              <w:bottom w:val="single" w:sz="8" w:space="0" w:color="000000" w:themeColor="text1"/>
-            </w:tcBorders>
           </w:tcPr>
           <w:p>
             <w:pPr>
@@ -29321,19 +29824,15 @@
                 <w:rFonts w:cstheme="majorBidi"/>
                 <w:sz w:val="18"/>
                 <w:szCs w:val="18"/>
-                <w:cs/>
                 <w:lang w:bidi="th-TH"/>
               </w:rPr>
-              <w:t>352.5</w:t>
+              <w:t>395.9</w:t>
             </w:r>
           </w:p>
         </w:tc>
         <w:tc>
           <w:tcPr>
             <w:tcW w:w="1077" w:type="dxa"/>
-            <w:tcBorders>
-              <w:bottom w:val="single" w:sz="8" w:space="0" w:color="000000" w:themeColor="text1"/>
-            </w:tcBorders>
           </w:tcPr>
           <w:p>
             <w:pPr>
@@ -29351,38 +29850,15 @@
                 <w:rFonts w:cstheme="majorBidi"/>
                 <w:sz w:val="18"/>
                 <w:szCs w:val="18"/>
-                <w:cs/>
                 <w:lang w:bidi="th-TH"/>
               </w:rPr>
-              <w:t>1</w:t>
-            </w:r>
-            <w:r>
-              <w:rPr>
-                <w:rFonts w:cstheme="majorBidi"/>
-                <w:sz w:val="18"/>
-                <w:szCs w:val="18"/>
-                <w:lang w:bidi="th-TH"/>
-              </w:rPr>
-              <w:t>,</w:t>
-            </w:r>
-            <w:r>
-              <w:rPr>
-                <w:rFonts w:cstheme="majorBidi"/>
-                <w:sz w:val="18"/>
-                <w:szCs w:val="18"/>
-                <w:cs/>
-                <w:lang w:bidi="th-TH"/>
-              </w:rPr>
-              <w:t>439.3</w:t>
+              <w:t>1,482.7</w:t>
             </w:r>
           </w:p>
         </w:tc>
         <w:tc>
           <w:tcPr>
             <w:tcW w:w="964" w:type="dxa"/>
-            <w:tcBorders>
-              <w:bottom w:val="single" w:sz="8" w:space="0" w:color="000000" w:themeColor="text1"/>
-            </w:tcBorders>
           </w:tcPr>
           <w:p>
             <w:pPr>
@@ -29400,19 +29876,15 @@
                 <w:rFonts w:cstheme="majorBidi"/>
                 <w:sz w:val="18"/>
                 <w:szCs w:val="18"/>
-                <w:cs/>
                 <w:lang w:bidi="th-TH"/>
               </w:rPr>
-              <w:t>93.6</w:t>
+              <w:t>93.0</w:t>
             </w:r>
           </w:p>
         </w:tc>
         <w:tc>
           <w:tcPr>
             <w:tcW w:w="964" w:type="dxa"/>
-            <w:tcBorders>
-              <w:bottom w:val="single" w:sz="8" w:space="0" w:color="000000" w:themeColor="text1"/>
-            </w:tcBorders>
           </w:tcPr>
           <w:p>
             <w:pPr>
@@ -29430,7 +29902,6 @@
                 <w:rFonts w:cstheme="majorBidi"/>
                 <w:sz w:val="18"/>
                 <w:szCs w:val="18"/>
-                <w:cs/>
                 <w:lang w:bidi="th-TH"/>
               </w:rPr>
               <w:t>0.0</w:t>
@@ -29440,9 +29911,6 @@
         <w:tc>
           <w:tcPr>
             <w:tcW w:w="964" w:type="dxa"/>
-            <w:tcBorders>
-              <w:bottom w:val="single" w:sz="8" w:space="0" w:color="000000" w:themeColor="text1"/>
-            </w:tcBorders>
           </w:tcPr>
           <w:p>
             <w:pPr>
@@ -29460,10 +29928,9 @@
                 <w:rFonts w:cstheme="majorBidi"/>
                 <w:sz w:val="18"/>
                 <w:szCs w:val="18"/>
-                <w:cs/>
                 <w:lang w:bidi="th-TH"/>
               </w:rPr>
-              <w:t>93.6</w:t>
+              <w:t>93.0</w:t>
             </w:r>
           </w:p>
         </w:tc>
@@ -29500,7 +29967,6 @@
           <w:sz w:val="20"/>
         </w:rPr>
         <w:tab/>
-        <w:t>The transmittance</w:t>
       </w:r>
       <w:r>
         <w:rPr>
@@ -29510,7 +29976,15 @@
           <w:iCs w:val="0"/>
           <w:sz w:val="20"/>
         </w:rPr>
-        <w:t xml:space="preserve"> contrast</w:t>
+        <w:t>Figure 8 is a transmittance contrast (</w:t>
+      </w:r>
+      <w:r>
+        <w:rPr>
+          <w:rStyle w:val="Emphasis"/>
+          <w:rFonts w:cstheme="majorBidi"/>
+          <w:sz w:val="20"/>
+        </w:rPr>
+        <w:t>ΔT</w:t>
       </w:r>
       <w:r>
         <w:rPr>
@@ -29520,21 +29994,7 @@
           <w:iCs w:val="0"/>
           <w:sz w:val="20"/>
         </w:rPr>
-        <w:t xml:space="preserve"> (</w:t>
-      </w:r>
-      <w:r>
-        <w:rPr>
-          <w:rFonts w:cstheme="majorBidi"/>
-          <w:i/>
-          <w:iCs/>
-        </w:rPr>
-        <w:t>ΔT</w:t>
-      </w:r>
-      <w:r>
-        <w:rPr>
-          <w:rFonts w:cstheme="majorBidi"/>
-        </w:rPr>
-        <w:t>)</w:t>
+        <w:t xml:space="preserve">) comparison between </w:t>
       </w:r>
       <w:r>
         <w:rPr>
@@ -29544,7 +30004,7 @@
           <w:iCs w:val="0"/>
           <w:sz w:val="20"/>
         </w:rPr>
-        <w:t xml:space="preserve"> </w:t>
+        <w:t>the single-layer HWOT design and various</w:t>
       </w:r>
       <w:r>
         <w:rPr>
@@ -29554,7 +30014,7 @@
           <w:iCs w:val="0"/>
           <w:sz w:val="20"/>
         </w:rPr>
-        <w:t>between</w:t>
+        <w:t xml:space="preserve"> edge-filter design. </w:t>
       </w:r>
       <w:r>
         <w:rPr>
@@ -29564,11 +30024,51 @@
           <w:iCs w:val="0"/>
           <w:sz w:val="20"/>
         </w:rPr>
-        <w:t xml:space="preserve"> ON and OFF modes of some of the design is shown in Fig. 8</w:t>
-      </w:r>
-    </w:p>
-    <w:p>
-      <w:pPr>
+        <w:t xml:space="preserve">Even though all edge-filter designs have the same </w:t>
+      </w:r>
+      <w:r>
+        <w:rPr>
+          <w:i/>
+          <w:iCs/>
+        </w:rPr>
+        <w:t>λ</w:t>
+      </w:r>
+      <w:r>
+        <w:rPr>
+          <w:i/>
+          <w:iCs/>
+          <w:vertAlign w:val="subscript"/>
+        </w:rPr>
+        <w:t xml:space="preserve">0 </w:t>
+      </w:r>
+      <w:r>
+        <w:t xml:space="preserve">= 750 nm, not all designs have the highest </w:t>
+      </w:r>
+      <w:r>
+        <w:t>ΔT</w:t>
+      </w:r>
+      <w:r>
+        <w:t xml:space="preserve"> at the same wavelength. So, designs such as 5 unit-cells or 6 unit-cells can have </w:t>
+      </w:r>
+      <w:r>
+        <w:rPr>
+          <w:i/>
+          <w:iCs/>
+        </w:rPr>
+        <w:t>λ</w:t>
+      </w:r>
+      <w:r>
+        <w:rPr>
+          <w:i/>
+          <w:iCs/>
+          <w:vertAlign w:val="subscript"/>
+        </w:rPr>
+        <w:t>0</w:t>
+      </w:r>
+      <w:r>
+        <w:t xml:space="preserve"> lower to increase the contrast.</w:t>
+      </w:r>
+      <w:r>
         <w:rPr>
           <w:rStyle w:val="Emphasis"/>
           <w:rFonts w:cstheme="majorBidi"/>
@@ -29576,7 +30076,8 @@
           <w:iCs w:val="0"/>
           <w:sz w:val="20"/>
         </w:rPr>
-      </w:pPr>
+        <w:t xml:space="preserve"> </w:t>
+      </w:r>
       <w:r>
         <w:rPr>
           <w:rStyle w:val="Emphasis"/>
@@ -29584,9 +30085,265 @@
           <w:i w:val="0"/>
           <w:iCs w:val="0"/>
           <w:sz w:val="20"/>
+          <w:highlight w:val="yellow"/>
+        </w:rPr>
+        <w:t>Interestingly, there</w:t>
+      </w:r>
+      <w:r>
+        <w:rPr>
+          <w:rStyle w:val="Emphasis"/>
+          <w:rFonts w:cstheme="majorBidi"/>
+          <w:i w:val="0"/>
+          <w:iCs w:val="0"/>
+          <w:sz w:val="20"/>
+          <w:highlight w:val="yellow"/>
+        </w:rPr>
+        <w:t xml:space="preserve"> are</w:t>
+      </w:r>
+      <w:r>
+        <w:rPr>
+          <w:rStyle w:val="Emphasis"/>
+          <w:rFonts w:cstheme="majorBidi"/>
+          <w:i w:val="0"/>
+          <w:iCs w:val="0"/>
+          <w:sz w:val="20"/>
+          <w:highlight w:val="yellow"/>
+        </w:rPr>
+        <w:t xml:space="preserve"> only marginal improvements when increasing the number of unit cell above 3, a trade-off between optical performance and fabrication complication should also be considered.</w:t>
+      </w:r>
+    </w:p>
+    <w:p>
+      <w:pPr>
+        <w:rPr>
+          <w:rStyle w:val="Emphasis"/>
+          <w:rFonts w:cstheme="majorBidi"/>
+          <w:i w:val="0"/>
+          <w:iCs w:val="0"/>
+          <w:sz w:val="20"/>
+        </w:rPr>
+      </w:pPr>
+      <w:r>
+        <w:rPr>
+          <w:rFonts w:cstheme="majorBidi"/>
+          <w:noProof/>
+        </w:rPr>
+        <w:drawing>
+          <wp:inline distT="0" distB="0" distL="0" distR="0" wp14:anchorId="71FAEE2F" wp14:editId="13B4C4DD">
+            <wp:extent cx="5267960" cy="3350525"/>
+            <wp:effectExtent l="0" t="0" r="8890" b="2540"/>
+            <wp:docPr id="1776286140" name="Picture 2"/>
+            <wp:cNvGraphicFramePr>
+              <a:graphicFrameLocks xmlns:a="http://schemas.openxmlformats.org/drawingml/2006/main" noChangeAspect="1"/>
+            </wp:cNvGraphicFramePr>
+            <a:graphic xmlns:a="http://schemas.openxmlformats.org/drawingml/2006/main">
+              <a:graphicData uri="http://schemas.openxmlformats.org/drawingml/2006/picture">
+                <pic:pic xmlns:pic="http://schemas.openxmlformats.org/drawingml/2006/picture">
+                  <pic:nvPicPr>
+                    <pic:cNvPr id="1776286140" name="Picture 2"/>
+                    <pic:cNvPicPr/>
+                  </pic:nvPicPr>
+                  <pic:blipFill rotWithShape="1">
+                    <a:blip r:embed="rId16" cstate="print">
+                      <a:extLst>
+                        <a:ext uri="{28A0092B-C50C-407E-A947-70E740481C1C}">
+                          <a14:useLocalDpi xmlns:a14="http://schemas.microsoft.com/office/drawing/2010/main" val="0"/>
+                        </a:ext>
+                      </a:extLst>
+                    </a:blip>
+                    <a:srcRect l="4047" t="7036" r="4047" b="2036"/>
+                    <a:stretch>
+                      <a:fillRect/>
+                    </a:stretch>
+                  </pic:blipFill>
+                  <pic:spPr bwMode="auto">
+                    <a:xfrm>
+                      <a:off x="0" y="0"/>
+                      <a:ext cx="5268983" cy="3351176"/>
+                    </a:xfrm>
+                    <a:prstGeom prst="rect">
+                      <a:avLst/>
+                    </a:prstGeom>
+                    <a:ln>
+                      <a:noFill/>
+                    </a:ln>
+                    <a:extLst>
+                      <a:ext uri="{53640926-AAD7-44D8-BBD7-CCE9431645EC}">
+                        <a14:shadowObscured xmlns:a14="http://schemas.microsoft.com/office/drawing/2010/main"/>
+                      </a:ext>
+                    </a:extLst>
+                  </pic:spPr>
+                </pic:pic>
+              </a:graphicData>
+            </a:graphic>
+          </wp:inline>
+        </w:drawing>
+      </w:r>
+    </w:p>
+    <w:p>
+      <w:r>
+        <w:rPr>
+          <w:b/>
+          <w:bCs/>
+        </w:rPr>
+        <w:t>Fig.</w:t>
+      </w:r>
+      <w:r>
+        <w:rPr>
+          <w:b/>
+          <w:bCs/>
+        </w:rPr>
+        <w:t xml:space="preserve"> </w:t>
+      </w:r>
+      <w:r>
+        <w:rPr>
+          <w:rFonts w:cstheme="majorBidi"/>
+          <w:b/>
+          <w:bCs/>
+          <w:szCs w:val="20"/>
+          <w:lang w:bidi="th-TH"/>
+        </w:rPr>
+        <w:t>8</w:t>
+      </w:r>
+      <w:r>
+        <w:rPr>
+          <w:rFonts w:cstheme="majorBidi"/>
+          <w:b/>
+          <w:bCs/>
+          <w:szCs w:val="20"/>
+          <w:cs/>
+          <w:lang w:bidi="th-TH"/>
+        </w:rPr>
+        <w:t>.</w:t>
+      </w:r>
+      <w:r>
+        <w:t xml:space="preserve"> Transmittance contrast comparison of the design shown in Table 1. The reference wavelength (</w:t>
+      </w:r>
+      <w:r>
+        <w:rPr>
+          <w:i/>
+          <w:iCs/>
+        </w:rPr>
+        <w:t>λ</w:t>
+      </w:r>
+      <w:r>
+        <w:rPr>
+          <w:i/>
+          <w:iCs/>
+          <w:vertAlign w:val="subscript"/>
+        </w:rPr>
+        <w:t>0</w:t>
+      </w:r>
+      <w:r>
+        <w:t>)</w:t>
+      </w:r>
+      <w:r>
+        <w:t xml:space="preserve"> of the single-layer design is 1064 nm. All edge-filters designs have </w:t>
+      </w:r>
+      <w:r>
+        <w:rPr>
+          <w:i/>
+          <w:iCs/>
+        </w:rPr>
+        <w:t>λ</w:t>
+      </w:r>
+      <w:r>
+        <w:rPr>
+          <w:i/>
+          <w:iCs/>
+          <w:vertAlign w:val="subscript"/>
+        </w:rPr>
+        <w:t>0</w:t>
+      </w:r>
+      <w:r>
+        <w:rPr>
+          <w:i/>
+          <w:iCs/>
+        </w:rPr>
+        <w:t xml:space="preserve"> </w:t>
+      </w:r>
+      <w:r>
+        <w:t>= 750 nm.</w:t>
+      </w:r>
+    </w:p>
+    <w:p>
+      <w:pPr>
+        <w:rPr>
+          <w:rStyle w:val="Emphasis"/>
+          <w:i w:val="0"/>
+          <w:iCs w:val="0"/>
+          <w:sz w:val="20"/>
+        </w:rPr>
+      </w:pPr>
+    </w:p>
+    <w:p>
+      <w:pPr>
+        <w:rPr>
+          <w:rStyle w:val="Emphasis"/>
+          <w:rFonts w:cstheme="majorBidi"/>
+          <w:i w:val="0"/>
+          <w:iCs w:val="0"/>
+          <w:sz w:val="20"/>
+        </w:rPr>
+      </w:pPr>
+      <w:r>
+        <w:rPr>
+          <w:rStyle w:val="Emphasis"/>
+          <w:rFonts w:cstheme="majorBidi"/>
+          <w:i w:val="0"/>
+          <w:iCs w:val="0"/>
+          <w:sz w:val="20"/>
         </w:rPr>
         <w:tab/>
-        <w:t>The endurance and optical stability of a single-layer, two-layer and edge filter with N = 5 are shown in Fig. 9. Thickness of Sb</w:t>
+      </w:r>
+      <w:r>
+        <w:rPr>
+          <w:rStyle w:val="Emphasis"/>
+          <w:rFonts w:cstheme="majorBidi"/>
+          <w:i w:val="0"/>
+          <w:iCs w:val="0"/>
+          <w:sz w:val="20"/>
+        </w:rPr>
+        <w:t xml:space="preserve">The endurance and optical stability of a single-layer, and edge filter with </w:t>
+      </w:r>
+      <w:r>
+        <w:rPr>
+          <w:rStyle w:val="Emphasis"/>
+          <w:rFonts w:cstheme="majorBidi"/>
+          <w:i w:val="0"/>
+          <w:iCs w:val="0"/>
+          <w:sz w:val="20"/>
+        </w:rPr>
+        <w:t xml:space="preserve">number of unit cells </w:t>
+      </w:r>
+      <w:r>
+        <w:rPr>
+          <w:rStyle w:val="Emphasis"/>
+          <w:rFonts w:cstheme="majorBidi"/>
+          <w:i w:val="0"/>
+          <w:iCs w:val="0"/>
+          <w:sz w:val="20"/>
+        </w:rPr>
+        <w:t xml:space="preserve">N = </w:t>
+      </w:r>
+      <w:r>
+        <w:rPr>
+          <w:rStyle w:val="Emphasis"/>
+          <w:rFonts w:cstheme="majorBidi"/>
+          <w:i w:val="0"/>
+          <w:iCs w:val="0"/>
+          <w:sz w:val="20"/>
+        </w:rPr>
+        <w:t>4</w:t>
+      </w:r>
+      <w:r>
+        <w:rPr>
+          <w:rStyle w:val="Emphasis"/>
+          <w:rFonts w:cstheme="majorBidi"/>
+          <w:i w:val="0"/>
+          <w:iCs w:val="0"/>
+          <w:sz w:val="20"/>
+        </w:rPr>
+        <w:t xml:space="preserve"> are shown in Fig. 9. Thickness of Sb</w:t>
       </w:r>
       <w:r>
         <w:rPr>
@@ -29628,27 +30385,7 @@
           <w:iCs w:val="0"/>
           <w:sz w:val="20"/>
         </w:rPr>
-        <w:t xml:space="preserve"> used in single-layer design is 157 nm (HWOT) which is thicker than </w:t>
-      </w:r>
-      <w:r>
-        <w:rPr>
-          <w:rStyle w:val="Emphasis"/>
-          <w:rFonts w:cstheme="majorBidi"/>
-          <w:i w:val="0"/>
-          <w:iCs w:val="0"/>
-          <w:sz w:val="20"/>
-        </w:rPr>
-        <w:t>79 nm (QWOT)</w:t>
-      </w:r>
-      <w:r>
-        <w:rPr>
-          <w:rStyle w:val="Emphasis"/>
-          <w:rFonts w:cstheme="majorBidi"/>
-          <w:i w:val="0"/>
-          <w:iCs w:val="0"/>
-          <w:sz w:val="20"/>
-        </w:rPr>
-        <w:t xml:space="preserve"> used in a two-layer SbSe/TiO design. </w:t>
+        <w:t xml:space="preserve"> used in single-layer design is 157 nm (HWOT) which is thicker than 79 nm (QWOT) used in a two-layer SbSe/TiO design. </w:t>
       </w:r>
       <w:r>
         <w:rPr>
@@ -29711,7 +30448,18 @@
           <w:iCs w:val="0"/>
           <w:sz w:val="20"/>
         </w:rPr>
-        <w:t xml:space="preserve"> is segmented into a thinner layer in an edge-filter design, its optical stability is still comparable, even though the overall Sb</w:t>
+        <w:t xml:space="preserve"> is </w:t>
+      </w:r>
+      <w:r>
+        <w:rPr>
+          <w:rStyle w:val="Emphasis"/>
+          <w:rFonts w:cstheme="majorBidi"/>
+          <w:i w:val="0"/>
+          <w:iCs w:val="0"/>
+          <w:sz w:val="20"/>
+        </w:rPr>
+        <w:lastRenderedPageBreak/>
+        <w:t>segmented into a thinner layer in an edge-filter design, its optical stability is still comparable, even though the overall Sb</w:t>
       </w:r>
       <w:r>
         <w:rPr>
@@ -29761,32 +30509,87 @@
         <w:pStyle w:val="Heading2"/>
       </w:pPr>
       <w:r>
-        <w:t>4.</w:t>
-      </w:r>
-      <w:r>
-        <w:t>2</w:t>
-      </w:r>
-      <w:r>
-        <w:t xml:space="preserve"> </w:t>
-      </w:r>
-      <w:r>
-        <w:t>532</w:t>
-      </w:r>
-      <w:r>
-        <w:t>-nm optical limiters</w:t>
+        <w:t xml:space="preserve">4.2 532-nm </w:t>
+      </w:r>
+      <w:r>
+        <w:t>optical</w:t>
+      </w:r>
+      <w:r>
+        <w:t xml:space="preserve"> limiters</w:t>
       </w:r>
     </w:p>
     <w:p>
       <w:pPr>
         <w:rPr>
           <w:rStyle w:val="Emphasis"/>
-          <w:rFonts w:ascii="Arial" w:hAnsi="Arial"/>
+          <w:rFonts w:cstheme="majorBidi"/>
+          <w:i w:val="0"/>
+          <w:iCs w:val="0"/>
+          <w:sz w:val="20"/>
+        </w:rPr>
+      </w:pPr>
+      <w:r>
+        <w:rPr>
+          <w:rStyle w:val="Emphasis"/>
+          <w:rFonts w:cstheme="majorBidi"/>
+          <w:i w:val="0"/>
+          <w:iCs w:val="0"/>
+          <w:sz w:val="20"/>
+        </w:rPr>
+        <w:t xml:space="preserve">The </w:t>
+      </w:r>
+      <w:r>
+        <w:rPr>
+          <w:rStyle w:val="Emphasis"/>
+          <w:rFonts w:cstheme="majorBidi"/>
+          <w:i w:val="0"/>
+          <w:iCs w:val="0"/>
+          <w:sz w:val="20"/>
+        </w:rPr>
+        <w:t>complex refractive index of Sb</w:t>
+      </w:r>
+      <w:r>
+        <w:rPr>
+          <w:rStyle w:val="Emphasis"/>
+          <w:rFonts w:cstheme="majorBidi"/>
           <w:i w:val="0"/>
           <w:iCs w:val="0"/>
           <w:sz w:val="20"/>
           <w:vertAlign w:val="subscript"/>
         </w:rPr>
-      </w:pPr>
+        <w:t>2</w:t>
+      </w:r>
+      <w:r>
+        <w:rPr>
+          <w:rStyle w:val="Emphasis"/>
+          <w:rFonts w:cstheme="majorBidi"/>
+          <w:i w:val="0"/>
+          <w:iCs w:val="0"/>
+          <w:sz w:val="20"/>
+        </w:rPr>
+        <w:t>Se</w:t>
+      </w:r>
+      <w:r>
+        <w:rPr>
+          <w:rStyle w:val="Emphasis"/>
+          <w:rFonts w:cstheme="majorBidi"/>
+          <w:i w:val="0"/>
+          <w:iCs w:val="0"/>
+          <w:sz w:val="20"/>
+          <w:vertAlign w:val="subscript"/>
+        </w:rPr>
+        <w:t>3</w:t>
+      </w:r>
+      <w:r>
+        <w:rPr>
+          <w:rStyle w:val="Emphasis"/>
+          <w:rFonts w:cstheme="majorBidi"/>
+          <w:i w:val="0"/>
+          <w:iCs w:val="0"/>
+          <w:sz w:val="20"/>
+        </w:rPr>
+        <w:t xml:space="preserve"> at 532 nm is </w:t>
+      </w:r>
     </w:p>
     <w:p>
       <w:pPr>
@@ -29850,18 +30653,6 @@
     </w:p>
     <w:p>
       <w:r>
-        <w:tab/>
-        <w:t>For a 1064-nm optical limiters, a simple QWOT-design already satisfy anti-reflection conditions, it’s also the smallest design. For a broader operating range in the IR spectrum, the XXX design has</w:t>
-      </w:r>
-      <w:r>
-        <w:t>…</w:t>
-      </w:r>
-    </w:p>
-    <w:p>
-      <w:r>
-        <w:tab/>
-      </w:r>
-      <w:r>
         <w:t>The edge filter design use Sb</w:t>
       </w:r>
       <w:r>
@@ -29880,7 +30671,28 @@
         <w:t>3</w:t>
       </w:r>
       <w:r>
-        <w:t xml:space="preserve"> in many layers, which could complicated phase switching methods. If we use laser as switching method, the phase transition of each </w:t>
+        <w:t xml:space="preserve"> in </w:t>
+      </w:r>
+      <w:r>
+        <w:rPr>
+          <w:lang w:val="en-US" w:bidi="th-TH"/>
+        </w:rPr>
+        <w:t>multiple</w:t>
+      </w:r>
+      <w:r>
+        <w:t xml:space="preserve"> layers, which could complicated phase switching methods. </w:t>
+      </w:r>
+      <w:r>
+        <w:t>For example, if</w:t>
+      </w:r>
+      <w:r>
+        <w:t xml:space="preserve"> we use laser as switching method, the phase transition of </w:t>
+      </w:r>
+      <w:r>
+        <w:t>every</w:t>
+      </w:r>
+      <w:r>
+        <w:t xml:space="preserve"> </w:t>
       </w:r>
       <w:r>
         <w:t>Sb</w:t>
@@ -29907,7 +30719,19 @@
         <w:t>layer</w:t>
       </w:r>
       <w:r>
-        <w:t xml:space="preserve"> is not simultaneous, such that the transmission contrast will increase in a gradual sense, this effect can be seen in </w:t>
+        <w:t xml:space="preserve"> is not simultaneous, such that the transmission contrast will increase in a gradual sense</w:t>
+      </w:r>
+      <w:r>
+        <w:t>.</w:t>
+      </w:r>
+      <w:r>
+        <w:t xml:space="preserve"> </w:t>
+      </w:r>
+      <w:r>
+        <w:t>T</w:t>
+      </w:r>
+      <w:r>
+        <w:t xml:space="preserve">his effect can be seen in </w:t>
       </w:r>
       <w:r>
         <w:fldChar w:fldCharType="begin"/>
@@ -29928,7 +30752,13 @@
         <w:fldChar w:fldCharType="end"/>
       </w:r>
       <w:r>
-        <w:t xml:space="preserve">’s work, their self-activating optical limiter use </w:t>
+        <w:t>’s work, their self-activating optical limiter use</w:t>
+      </w:r>
+      <w:r>
+        <w:t xml:space="preserve"> the same long-pass edge-filter</w:t>
+      </w:r>
+      <w:r>
+        <w:t xml:space="preserve"> </w:t>
       </w:r>
       <m:oMath>
         <m:sSup>
@@ -30026,7 +30856,7 @@
         </m:sSup>
       </m:oMath>
       <w:r>
-        <w:t xml:space="preserve"> unit cells design but use GST as PCM instead of Sb</w:t>
+        <w:t xml:space="preserve"> design but use GST instead of Sb</w:t>
       </w:r>
       <w:r>
         <w:rPr>
@@ -30044,53 +30874,49 @@
         <w:t>3</w:t>
       </w:r>
       <w:r>
-        <w:t>, their experimental result shows that the switching of GST is done layer-by-layer in a sequence determined by the changing optical field distribution and the thermal crosstalk between layers.</w:t>
+        <w:t xml:space="preserve"> as H layer, and SiO</w:t>
+      </w:r>
+      <w:r>
+        <w:rPr>
+          <w:vertAlign w:val="subscript"/>
+        </w:rPr>
+        <w:t>2</w:t>
+      </w:r>
+      <w:r>
+        <w:t xml:space="preserve"> as L layer.</w:t>
+      </w:r>
+      <w:r>
+        <w:t xml:space="preserve"> </w:t>
+      </w:r>
+      <w:r>
+        <w:t>T</w:t>
+      </w:r>
+      <w:r>
+        <w:t>heir experimental result shows that the switching of GST</w:t>
+      </w:r>
+      <w:r>
+        <w:t>s</w:t>
+      </w:r>
+      <w:r>
+        <w:t xml:space="preserve"> </w:t>
+      </w:r>
+      <w:r>
+        <w:t>is</w:t>
+      </w:r>
+      <w:r>
+        <w:t xml:space="preserve"> done layer-by-layer in a sequence </w:t>
+      </w:r>
+      <w:r>
+        <w:t xml:space="preserve">that’s </w:t>
+      </w:r>
+      <w:r>
+        <w:t>determined by the changing optical field distribution and the thermal crosstalk between layers.</w:t>
       </w:r>
     </w:p>
     <w:p>
       <w:r>
         <w:tab/>
-        <w:t xml:space="preserve">A quick and simple optimization, such as the one found in OpenFilters </w:t>
-      </w:r>
-      <w:r>
-        <w:fldChar w:fldCharType="begin"/>
-      </w:r>
-      <w:r>
-        <w:instrText xml:space="preserve"> ADDIN EN.CITE &lt;EndNote&gt;&lt;Cite&gt;&lt;Author&gt;Larouche&lt;/Author&gt;&lt;Year&gt;2008&lt;/Year&gt;&lt;RecNum&gt;101&lt;/RecNum&gt;&lt;DisplayText&gt;[53]&lt;/DisplayText&gt;&lt;record&gt;&lt;rec-number&gt;101&lt;/rec-number&gt;&lt;foreign-keys&gt;&lt;key app="EN" db-id="v920pft06rp9dbex2ap500x99x5rrtswxzss" timestamp="1776935415"&gt;101&lt;/key&gt;&lt;/foreign-keys&gt;&lt;ref-type name="Journal Article"&gt;17&lt;/ref-type&gt;&lt;contributors&gt;&lt;authors&gt;&lt;author&gt;Larouche, Stéphane&lt;/author&gt;&lt;author&gt;Martinu, Ludvik&lt;/author&gt;&lt;/authors&gt;&lt;/contributors&gt;&lt;titles&gt;&lt;title&gt;OpenFilters: open-source software for the design, optimization, and synthesis of optical filters&lt;/title&gt;&lt;secondary-title&gt;Applied Optics&lt;/secondary-title&gt;&lt;alt-title&gt;Appl. Opt.&lt;/alt-title&gt;&lt;/titles&gt;&lt;periodical&gt;&lt;full-title&gt;Applied Optics&lt;/full-title&gt;&lt;abbr-1&gt;Appl. Opt.&lt;/abbr-1&gt;&lt;/periodical&gt;&lt;alt-periodical&gt;&lt;full-title&gt;Applied Optics&lt;/full-title&gt;&lt;abbr-1&gt;Appl. Opt.&lt;/abbr-1&gt;&lt;/alt-periodical&gt;&lt;pages&gt;C219-C230&lt;/pages&gt;&lt;volume&gt;47&lt;/volume&gt;&lt;number&gt;13&lt;/number&gt;&lt;keywords&gt;&lt;keyword&gt;Thin films&lt;/keyword&gt;&lt;keyword&gt;Interference coatings&lt;/keyword&gt;&lt;keyword&gt;Multilayer design&lt;/keyword&gt;&lt;keyword&gt;Refinement and synthesis methods&lt;/keyword&gt;&lt;keyword&gt;Theory and design&lt;/keyword&gt;&lt;keyword&gt;Effective medium theory&lt;/keyword&gt;&lt;keyword&gt;Fourier transforms&lt;/keyword&gt;&lt;keyword&gt;Interference filters&lt;/keyword&gt;&lt;keyword&gt;Optical filters&lt;/keyword&gt;&lt;keyword&gt;Refractive index&lt;/keyword&gt;&lt;keyword&gt;Synthesis methods&lt;/keyword&gt;&lt;/keywords&gt;&lt;dates&gt;&lt;year&gt;2008&lt;/year&gt;&lt;pub-dates&gt;&lt;date&gt;2008/05/01&lt;/date&gt;&lt;/pub-dates&gt;&lt;/dates&gt;&lt;publisher&gt;Optica Publishing Group&lt;/publisher&gt;&lt;urls&gt;&lt;related-urls&gt;&lt;url&gt;https://opg.optica.org/ao/abstract.cfm?URI=ao-47-13-C219&lt;/url&gt;&lt;/related-urls&gt;&lt;/urls&gt;&lt;electronic-resource-num&gt;10.1364/AO.47.00C219&lt;/electronic-resource-num&gt;&lt;/record&gt;&lt;/Cite&gt;&lt;/EndNote&gt;</w:instrText>
-      </w:r>
-      <w:r>
-        <w:fldChar w:fldCharType="separate"/>
-      </w:r>
-      <w:r>
-        <w:rPr>
-          <w:noProof/>
-        </w:rPr>
-        <w:t>[53]</w:t>
-      </w:r>
-      <w:r>
-        <w:fldChar w:fldCharType="end"/>
-      </w:r>
-      <w:r>
-        <w:t xml:space="preserve"> can stabilize the transmission</w:t>
-      </w:r>
-    </w:p>
-    <w:p/>
-    <w:p/>
-    <w:p>
-      <w:r>
-        <w:tab/>
-      </w:r>
-      <w:r>
-        <w:t>For a self-activating optical limiter</w:t>
-      </w:r>
-      <w:r>
-        <w:t xml:space="preserve"> at 532 nm</w:t>
-      </w:r>
-      <w:r>
-        <w:t xml:space="preserve">, </w:t>
-      </w:r>
-      <w:r>
-        <w:t>resonance can be restored with asymmetrical designs. Asymmetrical cavity designs required thinner Sb</w:t>
+        <w:t>When compare 1064-nm optical limiter made from Sb</w:t>
       </w:r>
       <w:r>
         <w:rPr>
@@ -30108,97 +30934,34 @@
         <w:t>3</w:t>
       </w:r>
       <w:r>
-        <w:t xml:space="preserve">. Which should prevent partial phase-transition described in </w:t>
-      </w:r>
-      <w:r>
-        <w:fldChar w:fldCharType="begin"/>
-      </w:r>
-      <w:r>
-        <w:instrText xml:space="preserve"> ADDIN EN.CITE &lt;EndNote&gt;&lt;Cite&gt;&lt;Author&gt;Lawson&lt;/Author&gt;&lt;Year&gt;2023&lt;/Year&gt;&lt;RecNum&gt;60&lt;/RecNum&gt;&lt;DisplayText&gt;[32]&lt;/DisplayText&gt;&lt;record&gt;&lt;rec-number&gt;60&lt;/rec-number&gt;&lt;foreign-keys&gt;&lt;key app="EN" db-id="v920pft06rp9dbex2ap500x99x5rrtswxzss" timestamp="1768052911" guid="c8950606-4fdd-411c-9882-492341aa05f3"&gt;60&lt;/key&gt;&lt;/foreign-keys&gt;&lt;ref-type name="Journal Article"&gt;17&lt;/ref-type&gt;&lt;contributors&gt;&lt;authors&gt;&lt;author&gt;Lawson, Daniel&lt;/author&gt;&lt;author&gt;Blundell, Sophie&lt;/author&gt;&lt;author&gt;Ebert, Martin&lt;/author&gt;&lt;author&gt;Muskens, Otto L.&lt;/author&gt;&lt;author&gt;Zeimpekis, Ioannis&lt;/author&gt;&lt;/authors&gt;&lt;/contributors&gt;&lt;titles&gt;&lt;title&gt;Optical switching beyond a million cycles of low-loss phase change material Sb2Se3&lt;/title&gt;&lt;secondary-title&gt;Optical Materials Express&lt;/secondary-title&gt;&lt;/titles&gt;&lt;periodical&gt;&lt;full-title&gt;Optical Materials Express&lt;/full-title&gt;&lt;abbr-1&gt;Opt. Mater. Express&lt;/abbr-1&gt;&lt;/periodical&gt;&lt;volume&gt;14&lt;/volume&gt;&lt;number&gt;1&lt;/number&gt;&lt;section&gt;22&lt;/section&gt;&lt;dates&gt;&lt;year&gt;2023&lt;/year&gt;&lt;/dates&gt;&lt;isbn&gt;2159-3930&lt;/isbn&gt;&lt;urls&gt;&lt;/urls&gt;&lt;electronic-resource-num&gt;10.1364/ome.509434&lt;/electronic-resource-num&gt;&lt;/record&gt;&lt;/Cite&gt;&lt;/EndNote&gt;</w:instrText>
-      </w:r>
-      <w:r>
-        <w:fldChar w:fldCharType="separate"/>
-      </w:r>
-      <w:r>
-        <w:rPr>
-          <w:noProof/>
-        </w:rPr>
-        <w:t>[32]</w:t>
-      </w:r>
-      <w:r>
-        <w:fldChar w:fldCharType="end"/>
-      </w:r>
-      <w:r>
-        <w:t>. T</w:t>
-      </w:r>
-      <w:r>
-        <w:t xml:space="preserve">he question </w:t>
-      </w:r>
-      <w:r>
-        <w:t xml:space="preserve">then </w:t>
-      </w:r>
-      <w:r>
-        <w:t>becomes</w:t>
-      </w:r>
-      <w:r>
-        <w:t xml:space="preserve"> </w:t>
-      </w:r>
-      <w:r>
-        <w:t>‘</w:t>
-      </w:r>
-      <w:r>
-        <w:t xml:space="preserve">at what threshold of </w:t>
-      </w:r>
-      <w:r>
-        <w:t>laser</w:t>
-      </w:r>
-      <w:r>
-        <w:t xml:space="preserve"> intensity will the optical limiter </w:t>
-      </w:r>
-      <w:r>
-        <w:t xml:space="preserve">be </w:t>
-      </w:r>
-      <w:r>
-        <w:t>turned off? If the threshold is low, then the device need</w:t>
-      </w:r>
-      <w:r>
-        <w:t>s</w:t>
-      </w:r>
-      <w:r>
-        <w:t xml:space="preserve"> to have more absorptivity in </w:t>
-      </w:r>
-      <w:r>
-        <w:t>the</w:t>
-      </w:r>
-      <w:r>
-        <w:t xml:space="preserve"> ON mode</w:t>
-      </w:r>
-      <w:r>
-        <w:t xml:space="preserve">. But if the threshold is high, then the absorptivity in the ON mode </w:t>
-      </w:r>
-      <w:r>
-        <w:t xml:space="preserve">does </w:t>
-      </w:r>
-      <w:r>
-        <w:t>not need to be as high.</w:t>
-      </w:r>
-      <w:r>
-        <w:t xml:space="preserve"> Its absorptivity in the OFF mode is also </w:t>
-      </w:r>
-      <w:r>
-        <w:t>important;</w:t>
-      </w:r>
-      <w:r>
-        <w:t xml:space="preserve"> it ideally should be as high as possible</w:t>
-      </w:r>
-      <w:r>
-        <w:t xml:space="preserve"> since it need to be re-amorphized at an even higher temperature to return </w:t>
-      </w:r>
-      <w:r>
-        <w:t xml:space="preserve">the device </w:t>
-      </w:r>
-      <w:r>
-        <w:t>from OFF to ON mode. Would a volatile-type PCM be more suitable for self-activating optical limiter?</w:t>
+        <w:t xml:space="preserve"> to other PCMs, such as GST, GSST or VO</w:t>
+      </w:r>
+      <w:r>
+        <w:rPr>
+          <w:vertAlign w:val="subscript"/>
+        </w:rPr>
+        <w:t>2</w:t>
+      </w:r>
+      <w:r>
+        <w:t>, Sb</w:t>
+      </w:r>
+      <w:r>
+        <w:rPr>
+          <w:vertAlign w:val="subscript"/>
+        </w:rPr>
+        <w:t>2</w:t>
+      </w:r>
+      <w:r>
+        <w:t>Se</w:t>
+      </w:r>
+      <w:r>
+        <w:rPr>
+          <w:vertAlign w:val="subscript"/>
+        </w:rPr>
+        <w:t>3</w:t>
+      </w:r>
+      <w:r>
+        <w:t>-based optical limiter still has the best overall transmittance contrast, as shown in Fig. XX.</w:t>
       </w:r>
     </w:p>
     <w:p>
@@ -30206,7 +30969,52 @@
         <w:tab/>
       </w:r>
       <w:r>
-        <w:t>Finite Element Method (FEM)</w:t>
+        <w:t>The backside reflection from substrate causes slight increase in reflectance. This is because light reflected</w:t>
+      </w:r>
+      <w:r>
+        <w:t xml:space="preserve"> when exiting</w:t>
+      </w:r>
+      <w:r>
+        <w:t xml:space="preserve"> from substrate-air interface </w:t>
+      </w:r>
+      <w:r>
+        <w:t>(R</w:t>
+      </w:r>
+      <w:r>
+        <w:rPr>
+          <w:vertAlign w:val="subscript"/>
+        </w:rPr>
+        <w:t>b</w:t>
+      </w:r>
+      <w:r>
+        <w:t>) would interfere with light reflected from each film layer</w:t>
+      </w:r>
+      <w:r>
+        <w:t xml:space="preserve"> such as (R</w:t>
+      </w:r>
+      <w:r>
+        <w:rPr>
+          <w:vertAlign w:val="subscript"/>
+        </w:rPr>
+        <w:t>1</w:t>
+      </w:r>
+      <w:r>
+        <w:t>, R</w:t>
+      </w:r>
+      <w:r>
+        <w:rPr>
+          <w:vertAlign w:val="subscript"/>
+        </w:rPr>
+        <w:t>2</w:t>
+      </w:r>
+      <w:r>
+        <w:t>, etc.). This effect can be reduced by applying translucent adhesive tape</w:t>
+      </w:r>
+      <w:r>
+        <w:t xml:space="preserve"> to the backside of the substrate</w:t>
+      </w:r>
+      <w:r>
+        <w:t xml:space="preserve"> which will scatter light entered instead</w:t>
       </w:r>
       <w:r>
         <w:t xml:space="preserve"> </w:t>
@@ -30215,7 +31023,7 @@
         <w:fldChar w:fldCharType="begin"/>
       </w:r>
       <w:r>
-        <w:instrText xml:space="preserve"> ADDIN EN.CITE &lt;EndNote&gt;&lt;Cite&gt;&lt;Author&gt;Ling&lt;/Author&gt;&lt;Year&gt;2025&lt;/Year&gt;&lt;RecNum&gt;99&lt;/RecNum&gt;&lt;DisplayText&gt;[6]&lt;/DisplayText&gt;&lt;record&gt;&lt;rec-number&gt;99&lt;/rec-number&gt;&lt;foreign-keys&gt;&lt;key app="EN" db-id="v920pft06rp9dbex2ap500x99x5rrtswxzss" timestamp="1776763538"&gt;99&lt;/key&gt;&lt;/foreign-keys&gt;&lt;ref-type name="Journal Article"&gt;17&lt;/ref-type&gt;&lt;contributors&gt;&lt;authors&gt;&lt;author&gt;Ling, Xiulan&lt;/author&gt;&lt;author&gt;Pang, Xinyue&lt;/author&gt;&lt;author&gt;Chen, Xubin&lt;/author&gt;&lt;author&gt;Shao, Zhichong&lt;/author&gt;&lt;/authors&gt;&lt;/contributors&gt;&lt;titles&gt;&lt;title&gt;Broadband mid-infrared optical limiter based on&amp;amp;#x00A0;vanadium dioxide phase transition&lt;/title&gt;&lt;secondary-title&gt;Journal of the Optical Society of America B&lt;/secondary-title&gt;&lt;alt-title&gt;J. Opt. Soc. Am. B&lt;/alt-title&gt;&lt;/titles&gt;&lt;periodical&gt;&lt;full-title&gt;Journal of the Optical Society of America B&lt;/full-title&gt;&lt;abbr-1&gt;J. Opt. Soc. Am. B&lt;/abbr-1&gt;&lt;/periodical&gt;&lt;alt-periodical&gt;&lt;full-title&gt;Journal of the Optical Society of America B&lt;/full-title&gt;&lt;abbr-1&gt;J. Opt. Soc. Am. B&lt;/abbr-1&gt;&lt;/alt-periodical&gt;&lt;pages&gt;2062-2067&lt;/pages&gt;&lt;volume&gt;42&lt;/volume&gt;&lt;number&gt;9&lt;/number&gt;&lt;keywords&gt;&lt;keyword&gt;Finite element method&lt;/keyword&gt;&lt;keyword&gt;High power lasers&lt;/keyword&gt;&lt;keyword&gt;Nonlinear absorption&lt;/keyword&gt;&lt;keyword&gt;Optical limiting&lt;/keyword&gt;&lt;keyword&gt;Optical properties&lt;/keyword&gt;&lt;keyword&gt;Thin films&lt;/keyword&gt;&lt;/keywords&gt;&lt;dates&gt;&lt;year&gt;2025&lt;/year&gt;&lt;pub-dates&gt;&lt;date&gt;2025/09/01&lt;/date&gt;&lt;/pub-dates&gt;&lt;/dates&gt;&lt;publisher&gt;Optica Publishing Group&lt;/publisher&gt;&lt;urls&gt;&lt;related-urls&gt;&lt;url&gt;https://opg.optica.org/josab/abstract.cfm?URI=josab-42-9-2062&lt;/url&gt;&lt;/related-urls&gt;&lt;/urls&gt;&lt;electronic-resource-num&gt;10.1364/JOSAB.569492&lt;/electronic-resource-num&gt;&lt;/record&gt;&lt;/Cite&gt;&lt;/EndNote&gt;</w:instrText>
+        <w:instrText xml:space="preserve"> ADDIN EN.CITE &lt;EndNote&gt;&lt;Cite&gt;&lt;Author&gt;Synowicki&lt;/Author&gt;&lt;Year&gt;2008&lt;/Year&gt;&lt;RecNum&gt;104&lt;/RecNum&gt;&lt;DisplayText&gt;[53]&lt;/DisplayText&gt;&lt;record&gt;&lt;rec-number&gt;104&lt;/rec-number&gt;&lt;foreign-keys&gt;&lt;key app="EN" db-id="v920pft06rp9dbex2ap500x99x5rrtswxzss" timestamp="1779361691"&gt;104&lt;/key&gt;&lt;/foreign-keys&gt;&lt;ref-type name="Journal Article"&gt;17&lt;/ref-type&gt;&lt;contributors&gt;&lt;authors&gt;&lt;author&gt;Synowicki, R.&lt;/author&gt;&lt;/authors&gt;&lt;/contributors&gt;&lt;titles&gt;&lt;title&gt;Suppression of backside reflections from transparent substrates&lt;/title&gt;&lt;secondary-title&gt;physica status solidi (c)&lt;/secondary-title&gt;&lt;/titles&gt;&lt;periodical&gt;&lt;full-title&gt;physica status solidi (c)&lt;/full-title&gt;&lt;/periodical&gt;&lt;pages&gt;1085-1088&lt;/pages&gt;&lt;volume&gt;5&lt;/volume&gt;&lt;dates&gt;&lt;year&gt;2008&lt;/year&gt;&lt;pub-dates&gt;&lt;date&gt;05/01&lt;/date&gt;&lt;/pub-dates&gt;&lt;/dates&gt;&lt;urls&gt;&lt;/urls&gt;&lt;electronic-resource-num&gt;10.1002/pssc.200777873&lt;/electronic-resource-num&gt;&lt;/record&gt;&lt;/Cite&gt;&lt;/EndNote&gt;</w:instrText>
       </w:r>
       <w:r>
         <w:fldChar w:fldCharType="separate"/>
@@ -30224,46 +31032,401 @@
         <w:rPr>
           <w:noProof/>
         </w:rPr>
-        <w:t>[6]</w:t>
+        <w:t>[53]</w:t>
       </w:r>
       <w:r>
         <w:fldChar w:fldCharType="end"/>
+      </w:r>
+      <w:r>
+        <w:t>.</w:t>
       </w:r>
     </w:p>
     <w:p>
       <w:r>
         <w:tab/>
-        <w:t xml:space="preserve">Our work still </w:t>
-      </w:r>
-      <w:r>
-        <w:t>lacks</w:t>
-      </w:r>
-      <w:r>
-        <w:t xml:space="preserve"> thermal analysis which </w:t>
-      </w:r>
-      <w:r>
-        <w:t>should</w:t>
-      </w:r>
-      <w:r>
-        <w:t xml:space="preserve"> determine the </w:t>
-      </w:r>
-      <w:r>
-        <w:t>intensity of laser and pulse duration needed</w:t>
-      </w:r>
-      <w:r>
-        <w:t xml:space="preserve"> for both 532 and 1064 nm design.</w:t>
+        <w:t>A simple optimization</w:t>
       </w:r>
       <w:r>
         <w:t xml:space="preserve"> </w:t>
       </w:r>
       <w:r>
-        <w:t>Another metric that we didn’t consider is the tolerance of optical performances at varying incident angles. A high-tolerance devices would allow for broader applications.</w:t>
+        <w:t xml:space="preserve">scheme, </w:t>
+      </w:r>
+      <w:r>
+        <w:t xml:space="preserve">such as </w:t>
+      </w:r>
+      <w:r>
+        <w:t>merit function found in</w:t>
+      </w:r>
+      <w:r>
+        <w:t xml:space="preserve"> OpenFilters </w:t>
+      </w:r>
+      <w:r>
+        <w:fldChar w:fldCharType="begin"/>
+      </w:r>
+      <w:r>
+        <w:instrText xml:space="preserve"> ADDIN EN.CITE &lt;EndNote&gt;&lt;Cite&gt;&lt;Author&gt;Larouche&lt;/Author&gt;&lt;Year&gt;2008&lt;/Year&gt;&lt;RecNum&gt;101&lt;/RecNum&gt;&lt;DisplayText&gt;[54]&lt;/DisplayText&gt;&lt;record&gt;&lt;rec-number&gt;101&lt;/rec-number&gt;&lt;foreign-keys&gt;&lt;key app="EN" db-id="v920pft06rp9dbex2ap500x99x5rrtswxzss" timestamp="1776935415"&gt;101&lt;/key&gt;&lt;/foreign-keys&gt;&lt;ref-type name="Journal Article"&gt;17&lt;/ref-type&gt;&lt;contributors&gt;&lt;authors&gt;&lt;author&gt;Larouche, Stéphane&lt;/author&gt;&lt;author&gt;Martinu, Ludvik&lt;/author&gt;&lt;/authors&gt;&lt;/contributors&gt;&lt;titles&gt;&lt;title&gt;OpenFilters: open-source software for the design, optimization, and synthesis of optical filters&lt;/title&gt;&lt;secondary-title&gt;Applied Optics&lt;/secondary-title&gt;&lt;alt-title&gt;Appl. Opt.&lt;/alt-title&gt;&lt;/titles&gt;&lt;periodical&gt;&lt;full-title&gt;Applied Optics&lt;/full-title&gt;&lt;abbr-1&gt;Appl. Opt.&lt;/abbr-1&gt;&lt;/periodical&gt;&lt;alt-periodical&gt;&lt;full-title&gt;Applied Optics&lt;/full-title&gt;&lt;abbr-1&gt;Appl. Opt.&lt;/abbr-1&gt;&lt;/alt-periodical&gt;&lt;pages&gt;C219-C230&lt;/pages&gt;&lt;volume&gt;47&lt;/volume&gt;&lt;number&gt;13&lt;/number&gt;&lt;keywords&gt;&lt;keyword&gt;Thin films&lt;/keyword&gt;&lt;keyword&gt;Interference coatings&lt;/keyword&gt;&lt;keyword&gt;Multilayer design&lt;/keyword&gt;&lt;keyword&gt;Refinement and synthesis methods&lt;/keyword&gt;&lt;keyword&gt;Theory and design&lt;/keyword&gt;&lt;keyword&gt;Effective medium theory&lt;/keyword&gt;&lt;keyword&gt;Fourier transforms&lt;/keyword&gt;&lt;keyword&gt;Interference filters&lt;/keyword&gt;&lt;keyword&gt;Optical filters&lt;/keyword&gt;&lt;keyword&gt;Refractive index&lt;/keyword&gt;&lt;keyword&gt;Synthesis methods&lt;/keyword&gt;&lt;/keywords&gt;&lt;dates&gt;&lt;year&gt;2008&lt;/year&gt;&lt;pub-dates&gt;&lt;date&gt;2008/05/01&lt;/date&gt;&lt;/pub-dates&gt;&lt;/dates&gt;&lt;publisher&gt;Optica Publishing Group&lt;/publisher&gt;&lt;urls&gt;&lt;related-urls&gt;&lt;url&gt;https://opg.optica.org/ao/abstract.cfm?URI=ao-47-13-C219&lt;/url&gt;&lt;/related-urls&gt;&lt;/urls&gt;&lt;electronic-resource-num&gt;10.1364/AO.47.00C219&lt;/electronic-resource-num&gt;&lt;/record&gt;&lt;/Cite&gt;&lt;/EndNote&gt;</w:instrText>
+      </w:r>
+      <w:r>
+        <w:fldChar w:fldCharType="separate"/>
+      </w:r>
+      <w:r>
+        <w:rPr>
+          <w:noProof/>
+        </w:rPr>
+        <w:t>[54]</w:t>
+      </w:r>
+      <w:r>
+        <w:fldChar w:fldCharType="end"/>
+      </w:r>
+      <w:r>
+        <w:t>,</w:t>
+      </w:r>
+      <w:r>
+        <w:t xml:space="preserve"> </w:t>
+      </w:r>
+      <w:r>
+        <w:t xml:space="preserve">can </w:t>
+      </w:r>
+      <w:r>
+        <w:t xml:space="preserve">be used to decrease the </w:t>
+      </w:r>
+      <w:r>
+        <w:t>reflectance</w:t>
+      </w:r>
+      <w:r>
+        <w:t xml:space="preserve"> </w:t>
+      </w:r>
+      <w:r>
+        <w:t xml:space="preserve">by varying each layer thickness. </w:t>
+      </w:r>
+      <w:r>
+        <w:rPr>
+          <w:highlight w:val="yellow"/>
+        </w:rPr>
+        <w:t xml:space="preserve">Finite Element Method (FEM) </w:t>
+      </w:r>
+      <w:r>
+        <w:rPr>
+          <w:highlight w:val="yellow"/>
+        </w:rPr>
+        <w:fldChar w:fldCharType="begin"/>
+      </w:r>
+      <w:r>
+        <w:rPr>
+          <w:highlight w:val="yellow"/>
+        </w:rPr>
+        <w:instrText xml:space="preserve"> ADDIN EN.CITE &lt;EndNote&gt;&lt;Cite&gt;&lt;Author&gt;Ling&lt;/Author&gt;&lt;Year&gt;2025&lt;/Year&gt;&lt;RecNum&gt;99&lt;/RecNum&gt;&lt;DisplayText&gt;[6]&lt;/DisplayText&gt;&lt;record&gt;&lt;rec-number&gt;99&lt;/rec-number&gt;&lt;foreign-keys&gt;&lt;key app="EN" db-id="v920pft06rp9dbex2ap500x99x5rrtswxzss" timestamp="1776763538"&gt;99&lt;/key&gt;&lt;/foreign-keys&gt;&lt;ref-type name="Journal Article"&gt;17&lt;/ref-type&gt;&lt;contributors&gt;&lt;authors&gt;&lt;author&gt;Ling, Xiulan&lt;/author&gt;&lt;author&gt;Pang, Xinyue&lt;/author&gt;&lt;author&gt;Chen, Xubin&lt;/author&gt;&lt;author&gt;Shao, Zhichong&lt;/author&gt;&lt;/authors&gt;&lt;/contributors&gt;&lt;titles&gt;&lt;title&gt;Broadband mid-infrared optical limiter based on&amp;amp;#x00A0;vanadium dioxide phase transition&lt;/title&gt;&lt;secondary-title&gt;Journal of the Optical Society of America B&lt;/secondary-title&gt;&lt;alt-title&gt;J. Opt. Soc. Am. B&lt;/alt-title&gt;&lt;/titles&gt;&lt;periodical&gt;&lt;full-title&gt;Journal of the Optical Society of America B&lt;/full-title&gt;&lt;abbr-1&gt;J. Opt. Soc. Am. B&lt;/abbr-1&gt;&lt;/periodical&gt;&lt;alt-periodical&gt;&lt;full-title&gt;Journal of the Optical Society of America B&lt;/full-title&gt;&lt;abbr-1&gt;J. Opt. Soc. Am. B&lt;/abbr-1&gt;&lt;/alt-periodical&gt;&lt;pages&gt;2062-2067&lt;/pages&gt;&lt;volume&gt;42&lt;/volume&gt;&lt;number&gt;9&lt;/number&gt;&lt;keywords&gt;&lt;keyword&gt;Finite element method&lt;/keyword&gt;&lt;keyword&gt;High power lasers&lt;/keyword&gt;&lt;keyword&gt;Nonlinear absorption&lt;/keyword&gt;&lt;keyword&gt;Optical limiting&lt;/keyword&gt;&lt;keyword&gt;Optical properties&lt;/keyword&gt;&lt;keyword&gt;Thin films&lt;/keyword&gt;&lt;/keywords&gt;&lt;dates&gt;&lt;year&gt;2025&lt;/year&gt;&lt;pub-dates&gt;&lt;date&gt;2025/09/01&lt;/date&gt;&lt;/pub-dates&gt;&lt;/dates&gt;&lt;publisher&gt;Optica Publishing Group&lt;/publisher&gt;&lt;urls&gt;&lt;related-urls&gt;&lt;url&gt;https://opg.optica.org/josab/abstract.cfm?URI=josab-42-9-2062&lt;/url&gt;&lt;/related-urls&gt;&lt;/urls&gt;&lt;electronic-resource-num&gt;10.1364/JOSAB.569492&lt;/electronic-resource-num&gt;&lt;/record&gt;&lt;/Cite&gt;&lt;/EndNote&gt;</w:instrText>
+      </w:r>
+      <w:r>
+        <w:rPr>
+          <w:highlight w:val="yellow"/>
+        </w:rPr>
+        <w:fldChar w:fldCharType="separate"/>
+      </w:r>
+      <w:r>
+        <w:rPr>
+          <w:noProof/>
+          <w:highlight w:val="yellow"/>
+        </w:rPr>
+        <w:t>[6]</w:t>
+      </w:r>
+      <w:r>
+        <w:rPr>
+          <w:highlight w:val="yellow"/>
+        </w:rPr>
+        <w:fldChar w:fldCharType="end"/>
       </w:r>
     </w:p>
     <w:p>
       <w:r>
-        <w:lastRenderedPageBreak/>
         <w:tab/>
+      </w:r>
+      <w:r>
+        <w:rPr>
+          <w:highlight w:val="yellow"/>
+        </w:rPr>
+        <w:t>For a self-activating optical limiter</w:t>
+      </w:r>
+      <w:r>
+        <w:rPr>
+          <w:highlight w:val="yellow"/>
+        </w:rPr>
+        <w:t xml:space="preserve"> at 532 nm</w:t>
+      </w:r>
+      <w:r>
+        <w:rPr>
+          <w:highlight w:val="yellow"/>
+        </w:rPr>
+        <w:t xml:space="preserve">, </w:t>
+      </w:r>
+      <w:r>
+        <w:rPr>
+          <w:highlight w:val="yellow"/>
+        </w:rPr>
+        <w:t>resonance can be restored with asymmetrical designs. Asymmetrical cavity designs required thinner Sb</w:t>
+      </w:r>
+      <w:r>
+        <w:rPr>
+          <w:highlight w:val="yellow"/>
+          <w:vertAlign w:val="subscript"/>
+        </w:rPr>
+        <w:t>2</w:t>
+      </w:r>
+      <w:r>
+        <w:rPr>
+          <w:highlight w:val="yellow"/>
+        </w:rPr>
+        <w:t>Se</w:t>
+      </w:r>
+      <w:r>
+        <w:rPr>
+          <w:highlight w:val="yellow"/>
+          <w:vertAlign w:val="subscript"/>
+        </w:rPr>
+        <w:t>3</w:t>
+      </w:r>
+      <w:r>
+        <w:rPr>
+          <w:highlight w:val="yellow"/>
+        </w:rPr>
+        <w:t xml:space="preserve">. Which should prevent partial phase-transition described in </w:t>
+      </w:r>
+      <w:r>
+        <w:rPr>
+          <w:highlight w:val="yellow"/>
+        </w:rPr>
+        <w:fldChar w:fldCharType="begin"/>
+      </w:r>
+      <w:r>
+        <w:rPr>
+          <w:highlight w:val="yellow"/>
+        </w:rPr>
+        <w:instrText xml:space="preserve"> ADDIN EN.CITE &lt;EndNote&gt;&lt;Cite&gt;&lt;Author&gt;Lawson&lt;/Author&gt;&lt;Year&gt;2023&lt;/Year&gt;&lt;RecNum&gt;60&lt;/RecNum&gt;&lt;DisplayText&gt;[32]&lt;/DisplayText&gt;&lt;record&gt;&lt;rec-number&gt;60&lt;/rec-number&gt;&lt;foreign-keys&gt;&lt;key app="EN" db-id="v920pft06rp9dbex2ap500x99x5rrtswxzss" timestamp="1768052911" guid="c8950606-4fdd-411c-9882-492341aa05f3"&gt;60&lt;/key&gt;&lt;/foreign-keys&gt;&lt;ref-type name="Journal Article"&gt;17&lt;/ref-type&gt;&lt;contributors&gt;&lt;authors&gt;&lt;author&gt;Lawson, Daniel&lt;/author&gt;&lt;author&gt;Blundell, Sophie&lt;/author&gt;&lt;author&gt;Ebert, Martin&lt;/author&gt;&lt;author&gt;Muskens, Otto L.&lt;/author&gt;&lt;author&gt;Zeimpekis, Ioannis&lt;/author&gt;&lt;/authors&gt;&lt;/contributors&gt;&lt;titles&gt;&lt;title&gt;Optical switching beyond a million cycles of low-loss phase change material Sb2Se3&lt;/title&gt;&lt;secondary-title&gt;Optical Materials Express&lt;/secondary-title&gt;&lt;/titles&gt;&lt;periodical&gt;&lt;full-title&gt;Optical Materials Express&lt;/full-title&gt;&lt;abbr-1&gt;Opt. Mater. Express&lt;/abbr-1&gt;&lt;/periodical&gt;&lt;volume&gt;14&lt;/volume&gt;&lt;number&gt;1&lt;/number&gt;&lt;section&gt;22&lt;/section&gt;&lt;dates&gt;&lt;year&gt;2023&lt;/year&gt;&lt;/dates&gt;&lt;isbn&gt;2159-3930&lt;/isbn&gt;&lt;urls&gt;&lt;/urls&gt;&lt;electronic-resource-num&gt;10.1364/ome.509434&lt;/electronic-resource-num&gt;&lt;/record&gt;&lt;/Cite&gt;&lt;/EndNote&gt;</w:instrText>
+      </w:r>
+      <w:r>
+        <w:rPr>
+          <w:highlight w:val="yellow"/>
+        </w:rPr>
+        <w:fldChar w:fldCharType="separate"/>
+      </w:r>
+      <w:r>
+        <w:rPr>
+          <w:noProof/>
+          <w:highlight w:val="yellow"/>
+        </w:rPr>
+        <w:t>[32]</w:t>
+      </w:r>
+      <w:r>
+        <w:rPr>
+          <w:highlight w:val="yellow"/>
+        </w:rPr>
+        <w:fldChar w:fldCharType="end"/>
+      </w:r>
+      <w:r>
+        <w:rPr>
+          <w:highlight w:val="yellow"/>
+        </w:rPr>
+        <w:t>. T</w:t>
+      </w:r>
+      <w:r>
+        <w:rPr>
+          <w:highlight w:val="yellow"/>
+        </w:rPr>
+        <w:t xml:space="preserve">he question </w:t>
+      </w:r>
+      <w:r>
+        <w:rPr>
+          <w:highlight w:val="yellow"/>
+        </w:rPr>
+        <w:t xml:space="preserve">then </w:t>
+      </w:r>
+      <w:r>
+        <w:rPr>
+          <w:highlight w:val="yellow"/>
+        </w:rPr>
+        <w:t>becomes</w:t>
+      </w:r>
+      <w:r>
+        <w:rPr>
+          <w:highlight w:val="yellow"/>
+        </w:rPr>
+        <w:t xml:space="preserve"> </w:t>
+      </w:r>
+      <w:r>
+        <w:rPr>
+          <w:highlight w:val="yellow"/>
+        </w:rPr>
+        <w:t>‘</w:t>
+      </w:r>
+      <w:r>
+        <w:rPr>
+          <w:highlight w:val="yellow"/>
+        </w:rPr>
+        <w:t xml:space="preserve">at what threshold of </w:t>
+      </w:r>
+      <w:r>
+        <w:rPr>
+          <w:highlight w:val="yellow"/>
+        </w:rPr>
+        <w:t>laser</w:t>
+      </w:r>
+      <w:r>
+        <w:rPr>
+          <w:highlight w:val="yellow"/>
+        </w:rPr>
+        <w:t xml:space="preserve"> intensity will the optical limiter </w:t>
+      </w:r>
+      <w:r>
+        <w:rPr>
+          <w:highlight w:val="yellow"/>
+        </w:rPr>
+        <w:t xml:space="preserve">be </w:t>
+      </w:r>
+      <w:r>
+        <w:rPr>
+          <w:highlight w:val="yellow"/>
+        </w:rPr>
+        <w:t>turned off? If the threshold is low, then the device need</w:t>
+      </w:r>
+      <w:r>
+        <w:rPr>
+          <w:highlight w:val="yellow"/>
+        </w:rPr>
+        <w:t>s</w:t>
+      </w:r>
+      <w:r>
+        <w:rPr>
+          <w:highlight w:val="yellow"/>
+        </w:rPr>
+        <w:t xml:space="preserve"> to have more absorptivity in </w:t>
+      </w:r>
+      <w:r>
+        <w:rPr>
+          <w:highlight w:val="yellow"/>
+        </w:rPr>
+        <w:t>the</w:t>
+      </w:r>
+      <w:r>
+        <w:rPr>
+          <w:highlight w:val="yellow"/>
+        </w:rPr>
+        <w:t xml:space="preserve"> ON mode</w:t>
+      </w:r>
+      <w:r>
+        <w:rPr>
+          <w:highlight w:val="yellow"/>
+        </w:rPr>
+        <w:t xml:space="preserve">. But if the threshold is high, then the absorptivity in the ON mode </w:t>
+      </w:r>
+      <w:r>
+        <w:rPr>
+          <w:highlight w:val="yellow"/>
+        </w:rPr>
+        <w:t xml:space="preserve">does </w:t>
+      </w:r>
+      <w:r>
+        <w:rPr>
+          <w:highlight w:val="yellow"/>
+        </w:rPr>
+        <w:t>not need to be as high.</w:t>
+      </w:r>
+      <w:r>
+        <w:rPr>
+          <w:highlight w:val="yellow"/>
+        </w:rPr>
+        <w:t xml:space="preserve"> Its absorptivity in the OFF mode is also </w:t>
+      </w:r>
+      <w:r>
+        <w:rPr>
+          <w:highlight w:val="yellow"/>
+        </w:rPr>
+        <w:t>important;</w:t>
+      </w:r>
+      <w:r>
+        <w:rPr>
+          <w:highlight w:val="yellow"/>
+        </w:rPr>
+        <w:t xml:space="preserve"> it ideally should be as high as possible</w:t>
+      </w:r>
+      <w:r>
+        <w:rPr>
+          <w:highlight w:val="yellow"/>
+        </w:rPr>
+        <w:t xml:space="preserve"> since it need to be re-amorphized at an even higher temperature to return </w:t>
+      </w:r>
+      <w:r>
+        <w:rPr>
+          <w:highlight w:val="yellow"/>
+        </w:rPr>
+        <w:t xml:space="preserve">the device </w:t>
+      </w:r>
+      <w:r>
+        <w:rPr>
+          <w:highlight w:val="yellow"/>
+        </w:rPr>
+        <w:t>from OFF to ON mode. Would a volatile-type PCM be more suitable for self-activating optical limiter?</w:t>
+      </w:r>
+    </w:p>
+    <w:p>
+      <w:r>
+        <w:tab/>
+      </w:r>
+      <w:r>
+        <w:t xml:space="preserve">Our work still </w:t>
+      </w:r>
+      <w:r>
+        <w:t>lacks</w:t>
+      </w:r>
+      <w:r>
+        <w:t xml:space="preserve"> thermal analysis which </w:t>
+      </w:r>
+      <w:r>
+        <w:t>would</w:t>
+      </w:r>
+      <w:r>
+        <w:t xml:space="preserve"> determine the </w:t>
+      </w:r>
+      <w:r>
+        <w:t>intensity of laser and pulse duration needed</w:t>
+      </w:r>
+      <w:r>
+        <w:t xml:space="preserve"> for </w:t>
+      </w:r>
+      <w:r>
+        <w:t xml:space="preserve">phase switching for </w:t>
+      </w:r>
+      <w:r>
+        <w:t>both 532 and 1064 nm design</w:t>
+      </w:r>
+      <w:r>
+        <w:t>s</w:t>
+      </w:r>
+      <w:r>
+        <w:t>.</w:t>
+      </w:r>
+      <w:r>
+        <w:t xml:space="preserve"> </w:t>
+      </w:r>
+      <w:r>
+        <w:t xml:space="preserve">Another metric that we </w:t>
+      </w:r>
+      <w:r>
+        <w:t>haven’t</w:t>
+      </w:r>
+      <w:r>
+        <w:t xml:space="preserve"> consider</w:t>
+      </w:r>
+      <w:r>
+        <w:t>ed</w:t>
+      </w:r>
+      <w:r>
+        <w:t xml:space="preserve"> is the optical performances </w:t>
+      </w:r>
+      <w:r>
+        <w:t xml:space="preserve">when vary the incident angle. </w:t>
+      </w:r>
+      <w:r>
         <w:t>Future research should be about thermal simulation or experiment on the real-world fabrication. The latter is especially encouraged since further complication that hasn’t been accounted here, such as precision limit in depositing film layer, material cost, etc., could be the real limitation of the design.</w:t>
       </w:r>
     </w:p>
@@ -30302,7 +31465,9 @@
     <w:p>
       <w:pPr>
         <w:rPr>
-          <w:lang w:val="en-US"/>
+          <w:rFonts w:hint="cs"/>
+          <w:cs/>
+          <w:lang w:val="en-US" w:bidi="th-TH"/>
         </w:rPr>
       </w:pPr>
       <w:r>
@@ -30348,46 +31513,46 @@
         <w:rPr>
           <w:lang w:val="en-US"/>
         </w:rPr>
-        <w:t xml:space="preserve"> different; at 1064 nm, long-pass edge filter design with 5 or 6 unit cells of Sb</w:t>
+        <w:t xml:space="preserve"> different; at 1064 nm, </w:t>
+      </w:r>
+      <w:r>
+        <w:t xml:space="preserve">only long-pass edge-filter designs with unit-cell numbers </w:t>
+      </w:r>
+      <w:r>
+        <w:t>≥</w:t>
+      </w:r>
+      <w:r>
+        <w:t xml:space="preserve"> 3 show transmittance contrast higher than 90%, </w:t>
+      </w:r>
+      <w:r>
+        <w:t>it required</w:t>
+      </w:r>
+      <w:r>
+        <w:t xml:space="preserve"> Sb</w:t>
       </w:r>
       <w:r>
         <w:rPr>
           <w:vertAlign w:val="subscript"/>
-          <w:lang w:val="en-US"/>
         </w:rPr>
         <w:t>2</w:t>
       </w:r>
       <w:r>
-        <w:rPr>
-          <w:lang w:val="en-US"/>
-        </w:rPr>
         <w:t>Se</w:t>
       </w:r>
       <w:r>
         <w:rPr>
           <w:vertAlign w:val="subscript"/>
-          <w:lang w:val="en-US"/>
         </w:rPr>
         <w:t>3</w:t>
       </w:r>
       <w:r>
-        <w:rPr>
-          <w:lang w:val="en-US"/>
-        </w:rPr>
-        <w:t xml:space="preserve"> (H) and MgF</w:t>
-      </w:r>
-      <w:r>
-        <w:rPr>
-          <w:vertAlign w:val="subscript"/>
-          <w:lang w:val="en-US"/>
-        </w:rPr>
-        <w:t>2</w:t>
-      </w:r>
-      <w:r>
-        <w:rPr>
-          <w:lang w:val="en-US"/>
-        </w:rPr>
-        <w:t xml:space="preserve"> (L) have the best performance.</w:t>
+        <w:t xml:space="preserve"> as H and MgF2 as L layers.</w:t>
+      </w:r>
+      <w:r>
+        <w:t xml:space="preserve"> </w:t>
+      </w:r>
+      <w:r>
+        <w:t>The thickness and fabrication complication of these design are higher than simpler single or multi-layer designs.</w:t>
       </w:r>
     </w:p>
     <w:p>
@@ -30464,7 +31629,43 @@
         <w:rPr>
           <w:lang w:val="en-US"/>
         </w:rPr>
-        <w:t xml:space="preserve"> than a single-layer HWOT design but its limitations are the narrower operating bandwidth, and the difficulty of fabricating multiple film layers with tight thickness tolerance.</w:t>
+        <w:t xml:space="preserve"> than a </w:t>
+      </w:r>
+      <w:r>
+        <w:rPr>
+          <w:lang w:val="en-US"/>
+        </w:rPr>
+        <w:t xml:space="preserve">simple </w:t>
+      </w:r>
+      <w:r>
+        <w:rPr>
+          <w:lang w:val="en-US"/>
+        </w:rPr>
+        <w:t>single</w:t>
+      </w:r>
+      <w:r>
+        <w:rPr>
+          <w:lang w:val="en-US"/>
+        </w:rPr>
+        <w:t xml:space="preserve">, multi-layer, or edge-filter </w:t>
+      </w:r>
+      <w:r>
+        <w:rPr>
+          <w:lang w:val="en-US"/>
+        </w:rPr>
+        <w:t>design</w:t>
+      </w:r>
+      <w:r>
+        <w:rPr>
+          <w:lang w:val="en-US"/>
+        </w:rPr>
+        <w:t>s</w:t>
+      </w:r>
+      <w:r>
+        <w:rPr>
+          <w:lang w:val="en-US"/>
+        </w:rPr>
+        <w:t xml:space="preserve"> but its limitations are the narrower operating bandwidth, and the difficulty of fabricating multiple film layers with tight thickness tolerance.</w:t>
       </w:r>
     </w:p>
     <w:p>
@@ -30478,31 +31679,29 @@
           <w:lang w:val="en-US"/>
         </w:rPr>
         <w:tab/>
+      </w:r>
+      <w:r>
+        <w:rPr>
+          <w:highlight w:val="yellow"/>
+          <w:lang w:val="en-US"/>
+        </w:rPr>
         <w:t xml:space="preserve">Optimization using computer has a significant impact on the overall performance, OpenFilters or similar program should be </w:t>
       </w:r>
-      <w:proofErr w:type="gramStart"/>
-      <w:r>
-        <w:rPr>
-          <w:lang w:val="en-US"/>
-        </w:rPr>
-        <w:t>use</w:t>
-      </w:r>
-      <w:proofErr w:type="gramEnd"/>
-      <w:r>
-        <w:rPr>
+      <w:r>
+        <w:rPr>
+          <w:highlight w:val="yellow"/>
+          <w:lang w:val="en-US"/>
+        </w:rPr>
+        <w:t>used</w:t>
+      </w:r>
+      <w:r>
+        <w:rPr>
+          <w:highlight w:val="yellow"/>
           <w:lang w:val="en-US"/>
         </w:rPr>
         <w:t xml:space="preserve"> after the initial design.</w:t>
       </w:r>
     </w:p>
-    <w:p>
-      <w:pPr>
-        <w:rPr>
-          <w:lang w:val="en-US"/>
-        </w:rPr>
-      </w:pPr>
-    </w:p>
-    <w:p/>
     <w:p>
       <w:pPr>
         <w:pStyle w:val="Heading1"/>
@@ -30544,7 +31743,7 @@
       </w:r>
     </w:p>
     <w:p>
-      <w:hyperlink r:id="rId15" w:history="1">
+      <w:hyperlink r:id="rId17" w:history="1">
         <w:r>
           <w:rPr>
             <w:rStyle w:val="Hyperlink"/>
@@ -30560,7 +31759,7 @@
           <w:szCs w:val="20"/>
         </w:rPr>
       </w:pPr>
-      <w:hyperlink r:id="rId16" w:history="1">
+      <w:hyperlink r:id="rId18" w:history="1">
         <w:r>
           <w:rPr>
             <w:rStyle w:val="Hyperlink"/>
@@ -30619,7 +31818,7 @@
         </w:rPr>
         <w:t xml:space="preserve"> </w:t>
       </w:r>
-      <w:hyperlink r:id="rId17" w:history="1">
+      <w:hyperlink r:id="rId19" w:history="1">
         <w:r>
           <w:rPr>
             <w:rStyle w:val="Hyperlink"/>
@@ -31021,7 +32220,7 @@
         <w:fldChar w:fldCharType="begin"/>
       </w:r>
       <w:r>
-        <w:instrText xml:space="preserve"> ADDIN EN.CITE &lt;EndNote&gt;&lt;Cite&gt;&lt;Author&gt;Franta&lt;/Author&gt;&lt;Year&gt;2018&lt;/Year&gt;&lt;RecNum&gt;95&lt;/RecNum&gt;&lt;DisplayText&gt;[54]&lt;/DisplayText&gt;&lt;record&gt;&lt;rec-number&gt;95&lt;/rec-number&gt;&lt;foreign-keys&gt;&lt;key app="EN" db-id="v920pft06rp9dbex2ap500x99x5rrtswxzss" timestamp="1776659453"&gt;95&lt;/key&gt;&lt;/foreign-keys&gt;&lt;ref-type name="Journal Article"&gt;17&lt;/ref-type&gt;&lt;contributors&gt;&lt;authors&gt;&lt;author&gt;Franta, Daniel&lt;/author&gt;&lt;author&gt;Franta, Pavel&lt;/author&gt;&lt;author&gt;Vohánka, Jiří&lt;/author&gt;&lt;author&gt;Čermák, Martin&lt;/author&gt;&lt;author&gt;Ohlídal, Ivan&lt;/author&gt;&lt;/authors&gt;&lt;/contributors&gt;&lt;titles&gt;&lt;title&gt;Determination of thicknesses and temperatures of crystalline silicon wafers from optical measurements in the far infrared region&lt;/title&gt;&lt;secondary-title&gt;Journal of Applied Physics&lt;/secondary-title&gt;&lt;/titles&gt;&lt;periodical&gt;&lt;full-title&gt;Journal of Applied Physics&lt;/full-title&gt;&lt;/periodical&gt;&lt;volume&gt;123&lt;/volume&gt;&lt;number&gt;18&lt;/number&gt;&lt;dates&gt;&lt;year&gt;2018&lt;/year&gt;&lt;/dates&gt;&lt;isbn&gt;0021-8979&lt;/isbn&gt;&lt;urls&gt;&lt;related-urls&gt;&lt;url&gt;https://doi.org/10.1063/1.5026195&lt;/url&gt;&lt;/related-urls&gt;&lt;/urls&gt;&lt;custom1&gt;185707&lt;/custom1&gt;&lt;electronic-resource-num&gt;10.1063/1.5026195&lt;/electronic-resource-num&gt;&lt;access-date&gt;4/20/2026&lt;/access-date&gt;&lt;/record&gt;&lt;/Cite&gt;&lt;/EndNote&gt;</w:instrText>
+        <w:instrText xml:space="preserve"> ADDIN EN.CITE &lt;EndNote&gt;&lt;Cite&gt;&lt;Author&gt;Franta&lt;/Author&gt;&lt;Year&gt;2018&lt;/Year&gt;&lt;RecNum&gt;95&lt;/RecNum&gt;&lt;DisplayText&gt;[55]&lt;/DisplayText&gt;&lt;record&gt;&lt;rec-number&gt;95&lt;/rec-number&gt;&lt;foreign-keys&gt;&lt;key app="EN" db-id="v920pft06rp9dbex2ap500x99x5rrtswxzss" timestamp="1776659453"&gt;95&lt;/key&gt;&lt;/foreign-keys&gt;&lt;ref-type name="Journal Article"&gt;17&lt;/ref-type&gt;&lt;contributors&gt;&lt;authors&gt;&lt;author&gt;Franta, Daniel&lt;/author&gt;&lt;author&gt;Franta, Pavel&lt;/author&gt;&lt;author&gt;Vohánka, Jiří&lt;/author&gt;&lt;author&gt;Čermák, Martin&lt;/author&gt;&lt;author&gt;Ohlídal, Ivan&lt;/author&gt;&lt;/authors&gt;&lt;/contributors&gt;&lt;titles&gt;&lt;title&gt;Determination of thicknesses and temperatures of crystalline silicon wafers from optical measurements in the far infrared region&lt;/title&gt;&lt;secondary-title&gt;Journal of Applied Physics&lt;/secondary-title&gt;&lt;/titles&gt;&lt;periodical&gt;&lt;full-title&gt;Journal of Applied Physics&lt;/full-title&gt;&lt;/periodical&gt;&lt;volume&gt;123&lt;/volume&gt;&lt;number&gt;18&lt;/number&gt;&lt;dates&gt;&lt;year&gt;2018&lt;/year&gt;&lt;/dates&gt;&lt;isbn&gt;0021-8979&lt;/isbn&gt;&lt;urls&gt;&lt;related-urls&gt;&lt;url&gt;https://doi.org/10.1063/1.5026195&lt;/url&gt;&lt;/related-urls&gt;&lt;/urls&gt;&lt;custom1&gt;185707&lt;/custom1&gt;&lt;electronic-resource-num&gt;10.1063/1.5026195&lt;/electronic-resource-num&gt;&lt;access-date&gt;4/20/2026&lt;/access-date&gt;&lt;/record&gt;&lt;/Cite&gt;&lt;/EndNote&gt;</w:instrText>
       </w:r>
       <w:r>
         <w:fldChar w:fldCharType="separate"/>
@@ -31030,7 +32229,7 @@
         <w:rPr>
           <w:noProof/>
         </w:rPr>
-        <w:t>[54]</w:t>
+        <w:t>[55]</w:t>
       </w:r>
       <w:r>
         <w:fldChar w:fldCharType="end"/>
@@ -31388,7 +32587,7 @@
         <w:fldChar w:fldCharType="begin"/>
       </w:r>
       <w:r>
-        <w:instrText xml:space="preserve"> ADDIN EN.CITE &lt;EndNote&gt;&lt;Cite&gt;&lt;Author&gt;Franta&lt;/Author&gt;&lt;Year&gt;2018&lt;/Year&gt;&lt;RecNum&gt;95&lt;/RecNum&gt;&lt;DisplayText&gt;[54]&lt;/DisplayText&gt;&lt;record&gt;&lt;rec-number&gt;95&lt;/rec-number&gt;&lt;foreign-keys&gt;&lt;key app="EN" db-id="v920pft06rp9dbex2ap500x99x5rrtswxzss" timestamp="1776659453"&gt;95&lt;/key&gt;&lt;/foreign-keys&gt;&lt;ref-type name="Journal Article"&gt;17&lt;/ref-type&gt;&lt;contributors&gt;&lt;authors&gt;&lt;author&gt;Franta, Daniel&lt;/author&gt;&lt;author&gt;Franta, Pavel&lt;/author&gt;&lt;author&gt;Vohánka, Jiří&lt;/author&gt;&lt;author&gt;Čermák, Martin&lt;/author&gt;&lt;author&gt;Ohlídal, Ivan&lt;/author&gt;&lt;/authors&gt;&lt;/contributors&gt;&lt;titles&gt;&lt;title&gt;Determination of thicknesses and temperatures of crystalline silicon wafers from optical measurements in the far infrared region&lt;/title&gt;&lt;secondary-title&gt;Journal of Applied Physics&lt;/secondary-title&gt;&lt;/titles&gt;&lt;periodical&gt;&lt;full-title&gt;Journal of Applied Physics&lt;/full-title&gt;&lt;/periodical&gt;&lt;volume&gt;123&lt;/volume&gt;&lt;number&gt;18&lt;/number&gt;&lt;dates&gt;&lt;year&gt;2018&lt;/year&gt;&lt;/dates&gt;&lt;isbn&gt;0021-8979&lt;/isbn&gt;&lt;urls&gt;&lt;related-urls&gt;&lt;url&gt;https://doi.org/10.1063/1.5026195&lt;/url&gt;&lt;/related-urls&gt;&lt;/urls&gt;&lt;custom1&gt;185707&lt;/custom1&gt;&lt;electronic-resource-num&gt;10.1063/1.5026195&lt;/electronic-resource-num&gt;&lt;access-date&gt;4/20/2026&lt;/access-date&gt;&lt;/record&gt;&lt;/Cite&gt;&lt;/EndNote&gt;</w:instrText>
+        <w:instrText xml:space="preserve"> ADDIN EN.CITE &lt;EndNote&gt;&lt;Cite&gt;&lt;Author&gt;Franta&lt;/Author&gt;&lt;Year&gt;2018&lt;/Year&gt;&lt;RecNum&gt;95&lt;/RecNum&gt;&lt;DisplayText&gt;[55]&lt;/DisplayText&gt;&lt;record&gt;&lt;rec-number&gt;95&lt;/rec-number&gt;&lt;foreign-keys&gt;&lt;key app="EN" db-id="v920pft06rp9dbex2ap500x99x5rrtswxzss" timestamp="1776659453"&gt;95&lt;/key&gt;&lt;/foreign-keys&gt;&lt;ref-type name="Journal Article"&gt;17&lt;/ref-type&gt;&lt;contributors&gt;&lt;authors&gt;&lt;author&gt;Franta, Daniel&lt;/author&gt;&lt;author&gt;Franta, Pavel&lt;/author&gt;&lt;author&gt;Vohánka, Jiří&lt;/author&gt;&lt;author&gt;Čermák, Martin&lt;/author&gt;&lt;author&gt;Ohlídal, Ivan&lt;/author&gt;&lt;/authors&gt;&lt;/contributors&gt;&lt;titles&gt;&lt;title&gt;Determination of thicknesses and temperatures of crystalline silicon wafers from optical measurements in the far infrared region&lt;/title&gt;&lt;secondary-title&gt;Journal of Applied Physics&lt;/secondary-title&gt;&lt;/titles&gt;&lt;periodical&gt;&lt;full-title&gt;Journal of Applied Physics&lt;/full-title&gt;&lt;/periodical&gt;&lt;volume&gt;123&lt;/volume&gt;&lt;number&gt;18&lt;/number&gt;&lt;dates&gt;&lt;year&gt;2018&lt;/year&gt;&lt;/dates&gt;&lt;isbn&gt;0021-8979&lt;/isbn&gt;&lt;urls&gt;&lt;related-urls&gt;&lt;url&gt;https://doi.org/10.1063/1.5026195&lt;/url&gt;&lt;/related-urls&gt;&lt;/urls&gt;&lt;custom1&gt;185707&lt;/custom1&gt;&lt;electronic-resource-num&gt;10.1063/1.5026195&lt;/electronic-resource-num&gt;&lt;access-date&gt;4/20/2026&lt;/access-date&gt;&lt;/record&gt;&lt;/Cite&gt;&lt;/EndNote&gt;</w:instrText>
       </w:r>
       <w:r>
         <w:fldChar w:fldCharType="separate"/>
@@ -31397,7 +32596,7 @@
         <w:rPr>
           <w:noProof/>
         </w:rPr>
-        <w:t>[54]</w:t>
+        <w:t>[55]</w:t>
       </w:r>
       <w:r>
         <w:fldChar w:fldCharType="end"/>
@@ -31738,7 +32937,7 @@
         <w:fldChar w:fldCharType="begin"/>
       </w:r>
       <w:r>
-        <w:instrText xml:space="preserve"> ADDIN EN.CITE &lt;EndNote&gt;&lt;Cite&gt;&lt;Author&gt;Franta&lt;/Author&gt;&lt;Year&gt;2018&lt;/Year&gt;&lt;RecNum&gt;95&lt;/RecNum&gt;&lt;DisplayText&gt;[54]&lt;/DisplayText&gt;&lt;record&gt;&lt;rec-number&gt;95&lt;/rec-number&gt;&lt;foreign-keys&gt;&lt;key app="EN" db-id="v920pft06rp9dbex2ap500x99x5rrtswxzss" timestamp="1776659453"&gt;95&lt;/key&gt;&lt;/foreign-keys&gt;&lt;ref-type name="Journal Article"&gt;17&lt;/ref-type&gt;&lt;contributors&gt;&lt;authors&gt;&lt;author&gt;Franta, Daniel&lt;/author&gt;&lt;author&gt;Franta, Pavel&lt;/author&gt;&lt;author&gt;Vohánka, Jiří&lt;/author&gt;&lt;author&gt;Čermák, Martin&lt;/author&gt;&lt;author&gt;Ohlídal, Ivan&lt;/author&gt;&lt;/authors&gt;&lt;/contributors&gt;&lt;titles&gt;&lt;title&gt;Determination of thicknesses and temperatures of crystalline silicon wafers from optical measurements in the far infrared region&lt;/title&gt;&lt;secondary-title&gt;Journal of Applied Physics&lt;/secondary-title&gt;&lt;/titles&gt;&lt;periodical&gt;&lt;full-title&gt;Journal of Applied Physics&lt;/full-title&gt;&lt;/periodical&gt;&lt;volume&gt;123&lt;/volume&gt;&lt;number&gt;18&lt;/number&gt;&lt;dates&gt;&lt;year&gt;2018&lt;/year&gt;&lt;/dates&gt;&lt;isbn&gt;0021-8979&lt;/isbn&gt;&lt;urls&gt;&lt;related-urls&gt;&lt;url&gt;https://doi.org/10.1063/1.5026195&lt;/url&gt;&lt;/related-urls&gt;&lt;/urls&gt;&lt;custom1&gt;185707&lt;/custom1&gt;&lt;electronic-resource-num&gt;10.1063/1.5026195&lt;/electronic-resource-num&gt;&lt;access-date&gt;4/20/2026&lt;/access-date&gt;&lt;/record&gt;&lt;/Cite&gt;&lt;/EndNote&gt;</w:instrText>
+        <w:instrText xml:space="preserve"> ADDIN EN.CITE &lt;EndNote&gt;&lt;Cite&gt;&lt;Author&gt;Franta&lt;/Author&gt;&lt;Year&gt;2018&lt;/Year&gt;&lt;RecNum&gt;95&lt;/RecNum&gt;&lt;DisplayText&gt;[55]&lt;/DisplayText&gt;&lt;record&gt;&lt;rec-number&gt;95&lt;/rec-number&gt;&lt;foreign-keys&gt;&lt;key app="EN" db-id="v920pft06rp9dbex2ap500x99x5rrtswxzss" timestamp="1776659453"&gt;95&lt;/key&gt;&lt;/foreign-keys&gt;&lt;ref-type name="Journal Article"&gt;17&lt;/ref-type&gt;&lt;contributors&gt;&lt;authors&gt;&lt;author&gt;Franta, Daniel&lt;/author&gt;&lt;author&gt;Franta, Pavel&lt;/author&gt;&lt;author&gt;Vohánka, Jiří&lt;/author&gt;&lt;author&gt;Čermák, Martin&lt;/author&gt;&lt;author&gt;Ohlídal, Ivan&lt;/author&gt;&lt;/authors&gt;&lt;/contributors&gt;&lt;titles&gt;&lt;title&gt;Determination of thicknesses and temperatures of crystalline silicon wafers from optical measurements in the far infrared region&lt;/title&gt;&lt;secondary-title&gt;Journal of Applied Physics&lt;/secondary-title&gt;&lt;/titles&gt;&lt;periodical&gt;&lt;full-title&gt;Journal of Applied Physics&lt;/full-title&gt;&lt;/periodical&gt;&lt;volume&gt;123&lt;/volume&gt;&lt;number&gt;18&lt;/number&gt;&lt;dates&gt;&lt;year&gt;2018&lt;/year&gt;&lt;/dates&gt;&lt;isbn&gt;0021-8979&lt;/isbn&gt;&lt;urls&gt;&lt;related-urls&gt;&lt;url&gt;https://doi.org/10.1063/1.5026195&lt;/url&gt;&lt;/related-urls&gt;&lt;/urls&gt;&lt;custom1&gt;185707&lt;/custom1&gt;&lt;electronic-resource-num&gt;10.1063/1.5026195&lt;/electronic-resource-num&gt;&lt;access-date&gt;4/20/2026&lt;/access-date&gt;&lt;/record&gt;&lt;/Cite&gt;&lt;/EndNote&gt;</w:instrText>
       </w:r>
       <w:r>
         <w:fldChar w:fldCharType="separate"/>
@@ -31747,7 +32946,7 @@
         <w:rPr>
           <w:noProof/>
         </w:rPr>
-        <w:t>[54]</w:t>
+        <w:t>[55]</w:t>
       </w:r>
       <w:r>
         <w:fldChar w:fldCharType="end"/>
@@ -31875,7 +33074,7 @@
       <w:r>
         <w:t xml:space="preserve">vol. 14, no. 6, p. 1259, 2023. [Online]. Available: </w:t>
       </w:r>
-      <w:hyperlink r:id="rId18" w:history="1">
+      <w:hyperlink r:id="rId20" w:history="1">
         <w:r>
           <w:rPr>
             <w:rStyle w:val="Hyperlink"/>
@@ -31908,7 +33107,7 @@
       <w:r>
         <w:t xml:space="preserve">, 9–13 Nov. 2025 2025, pp. 1–2, doi: 10.1109/IPC65510.2025.11281888. [Online]. Available: </w:t>
       </w:r>
-      <w:hyperlink r:id="rId19" w:history="1">
+      <w:hyperlink r:id="rId21" w:history="1">
         <w:r>
           <w:rPr>
             <w:rStyle w:val="Hyperlink"/>
@@ -31972,7 +33171,7 @@
       <w:r>
         <w:t xml:space="preserve">vol. 15, no. 6, p. 2100001, 2021, doi: </w:t>
       </w:r>
-      <w:hyperlink r:id="rId20" w:history="1">
+      <w:hyperlink r:id="rId22" w:history="1">
         <w:r>
           <w:rPr>
             <w:rStyle w:val="Hyperlink"/>
@@ -32036,7 +33235,7 @@
       <w:r>
         <w:t xml:space="preserve">, 12–17 Sept. 2022 2022, pp. 148–150, doi: 10.1109/Metamaterials54993.2022.9920767. [Online]. Available: </w:t>
       </w:r>
-      <w:hyperlink r:id="rId21" w:history="1">
+      <w:hyperlink r:id="rId23" w:history="1">
         <w:r>
           <w:rPr>
             <w:rStyle w:val="Hyperlink"/>
@@ -32091,7 +33290,7 @@
         <w:tab/>
         <w:t xml:space="preserve">A. Donval, Y. Ofir, D. Nevo, and M. Oron, "Reflective Optical Limiter," US Patent US 2014/0233085 A1 Patent Appl. US 201214343922 A, 2014/08/21, 2014. [Online]. Available: </w:t>
       </w:r>
-      <w:hyperlink r:id="rId22" w:history="1">
+      <w:hyperlink r:id="rId24" w:history="1">
         <w:r>
           <w:rPr>
             <w:rStyle w:val="Hyperlink"/>
@@ -32112,7 +33311,7 @@
         <w:tab/>
         <w:t xml:space="preserve">A. N. H. Lam Tai, "OPTICAL LIMITERS FOR FACILITATING APERTURE PROTECTION," US Patent US 2019/0094430 A1 Patent Appl. US 201715716364 A, 2019/03/28, 2019. [Online]. Available: </w:t>
       </w:r>
-      <w:hyperlink r:id="rId23" w:history="1">
+      <w:hyperlink r:id="rId25" w:history="1">
         <w:r>
           <w:rPr>
             <w:rStyle w:val="Hyperlink"/>
@@ -32149,6 +33348,7 @@
         <w:ind w:left="720" w:hanging="720"/>
       </w:pPr>
       <w:r>
+        <w:lastRenderedPageBreak/>
         <w:t>[12]</w:t>
       </w:r>
       <w:r>
@@ -32268,7 +33468,6 @@
         <w:ind w:left="720" w:hanging="720"/>
       </w:pPr>
       <w:r>
-        <w:lastRenderedPageBreak/>
         <w:t>[17]</w:t>
       </w:r>
       <w:r>
@@ -32293,7 +33492,7 @@
       <w:r>
         <w:t xml:space="preserve">vol. 18, p. 100364, 2023/06/01/ 2023, doi: </w:t>
       </w:r>
-      <w:hyperlink r:id="rId24" w:history="1">
+      <w:hyperlink r:id="rId26" w:history="1">
         <w:r>
           <w:rPr>
             <w:rStyle w:val="Hyperlink"/>
@@ -32512,7 +33711,7 @@
       <w:r>
         <w:t xml:space="preserve">vol. 150, p. 106907, 2022/11/01/ 2022, doi: </w:t>
       </w:r>
-      <w:hyperlink r:id="rId25" w:history="1">
+      <w:hyperlink r:id="rId27" w:history="1">
         <w:r>
           <w:rPr>
             <w:rStyle w:val="Hyperlink"/>
@@ -32545,7 +33744,7 @@
       <w:r>
         <w:t xml:space="preserve">vol. 707, p. 138117, 2020/08/01/ 2020, doi: </w:t>
       </w:r>
-      <w:hyperlink r:id="rId26" w:history="1">
+      <w:hyperlink r:id="rId28" w:history="1">
         <w:r>
           <w:rPr>
             <w:rStyle w:val="Hyperlink"/>
@@ -32609,7 +33808,7 @@
       <w:r>
         <w:t xml:space="preserve">vol. 2, no. 9, pp. 1707–1746, 2018/09/19/ 2018, doi: </w:t>
       </w:r>
-      <w:hyperlink r:id="rId27" w:history="1">
+      <w:hyperlink r:id="rId29" w:history="1">
         <w:r>
           <w:rPr>
             <w:rStyle w:val="Hyperlink"/>
@@ -32673,7 +33872,7 @@
       <w:r>
         <w:t xml:space="preserve">vol. 14, no. 19, p. 4250, 2022. [Online]. Available: </w:t>
       </w:r>
-      <w:hyperlink r:id="rId28" w:history="1">
+      <w:hyperlink r:id="rId30" w:history="1">
         <w:r>
           <w:rPr>
             <w:rStyle w:val="Hyperlink"/>
@@ -32790,7 +33989,7 @@
       <w:r>
         <w:t xml:space="preserve">vol. 34, no. 14, p. 2310306, 2024, doi: </w:t>
       </w:r>
-      <w:hyperlink r:id="rId29" w:history="1">
+      <w:hyperlink r:id="rId31" w:history="1">
         <w:r>
           <w:rPr>
             <w:rStyle w:val="Hyperlink"/>
@@ -32938,7 +34137,7 @@
         <w:tab/>
         <w:t xml:space="preserve">L. Shah, S. Cannon Roger, and A. Drummer Mark, "LIDAR RECEIVER OPTICAL LIMITER," US Patent US 2025/0172672 A1 Patent Appl. US 202418960941 A, 2025/05/29, 2025. [Online]. Available: </w:t>
       </w:r>
-      <w:hyperlink r:id="rId30" w:history="1">
+      <w:hyperlink r:id="rId32" w:history="1">
         <w:r>
           <w:rPr>
             <w:rStyle w:val="Hyperlink"/>
@@ -33034,7 +34233,7 @@
       <w:r>
         <w:t xml:space="preserve">vol. 421, pp. 424–429, 2017/11/01/ 2017, doi: </w:t>
       </w:r>
-      <w:hyperlink r:id="rId31" w:history="1">
+      <w:hyperlink r:id="rId33" w:history="1">
         <w:r>
           <w:rPr>
             <w:rStyle w:val="Hyperlink"/>
@@ -33052,6 +34251,7 @@
         <w:ind w:left="720" w:hanging="720"/>
       </w:pPr>
       <w:r>
+        <w:lastRenderedPageBreak/>
         <w:t>[43]</w:t>
       </w:r>
       <w:r>
@@ -33129,7 +34329,7 @@
       <w:r>
         <w:t xml:space="preserve">vol. 763, p. 139568, 2022/12/01/ 2022, doi: </w:t>
       </w:r>
-      <w:hyperlink r:id="rId32" w:history="1">
+      <w:hyperlink r:id="rId34" w:history="1">
         <w:r>
           <w:rPr>
             <w:rStyle w:val="Hyperlink"/>
@@ -33169,7 +34369,6 @@
         <w:ind w:left="720" w:hanging="720"/>
       </w:pPr>
       <w:r>
-        <w:lastRenderedPageBreak/>
         <w:t>[47]</w:t>
       </w:r>
       <w:r>
@@ -33185,7 +34384,7 @@
       <w:r>
         <w:t xml:space="preserve">vol. 19, no. 24, p. e01014, 2025, doi: </w:t>
       </w:r>
-      <w:hyperlink r:id="rId33" w:history="1">
+      <w:hyperlink r:id="rId35" w:history="1">
         <w:r>
           <w:rPr>
             <w:rStyle w:val="Hyperlink"/>
@@ -33335,16 +34534,16 @@
       </w:r>
       <w:r>
         <w:tab/>
-        <w:t xml:space="preserve">S. Larouche and L. Martinu, "OpenFilters: open-source software for the design, optimization, and synthesis of optical filters," </w:t>
-      </w:r>
-      <w:r>
-        <w:rPr>
-          <w:i/>
-        </w:rPr>
-        <w:t xml:space="preserve">Appl. Opt., </w:t>
-      </w:r>
-      <w:r>
-        <w:t>vol. 47, no. 13, pp. C219–C230, 2008/05/01 2008, doi: 10.1364/AO.47.00C219.</w:t>
+        <w:t xml:space="preserve">R. Synowicki, "Suppression of backside reflections from transparent substrates," </w:t>
+      </w:r>
+      <w:r>
+        <w:rPr>
+          <w:i/>
+        </w:rPr>
+        <w:t xml:space="preserve">physica status solidi (c), </w:t>
+      </w:r>
+      <w:r>
+        <w:t>vol. 5, pp. 1085–1088, 05/01 2008, doi: 10.1002/pssc.200777873.</w:t>
       </w:r>
     </w:p>
     <w:p>
@@ -33354,6 +34553,28 @@
       </w:pPr>
       <w:r>
         <w:t>[54]</w:t>
+      </w:r>
+      <w:r>
+        <w:tab/>
+        <w:t xml:space="preserve">S. Larouche and L. Martinu, "OpenFilters: open-source software for the design, optimization, and synthesis of optical filters," </w:t>
+      </w:r>
+      <w:r>
+        <w:rPr>
+          <w:i/>
+        </w:rPr>
+        <w:t xml:space="preserve">Appl. Opt., </w:t>
+      </w:r>
+      <w:r>
+        <w:t>vol. 47, no. 13, pp. C219–C230, 2008/05/01 2008, doi: 10.1364/AO.47.00C219.</w:t>
+      </w:r>
+    </w:p>
+    <w:p>
+      <w:pPr>
+        <w:pStyle w:val="EndNoteBibliography"/>
+        <w:ind w:left="720" w:hanging="720"/>
+      </w:pPr>
+      <w:r>
+        <w:t>[55]</w:t>
       </w:r>
       <w:r>
         <w:tab/>
@@ -33420,6 +34641,35 @@
     </w:p>
   </w:footnote>
 </w:footnotes>
+</file>
+
+<file path=word/numbering.xml><?xml version="1.0" encoding="utf-8"?>
+<w:numbering xmlns:wpc="http://schemas.microsoft.com/office/word/2010/wordprocessingCanvas" xmlns:cx="http://schemas.microsoft.com/office/drawing/2014/chartex" xmlns:cx1="http://schemas.microsoft.com/office/drawing/2015/9/8/chartex" xmlns:cx2="http://schemas.microsoft.com/office/drawing/2015/10/21/chartex" xmlns:cx3="http://schemas.microsoft.com/office/drawing/2016/5/9/chartex" xmlns:cx4="http://schemas.microsoft.com/office/drawing/2016/5/10/chartex" xmlns:cx5="http://schemas.microsoft.com/office/drawing/2016/5/11/chartex" xmlns:cx6="http://schemas.microsoft.com/office/drawing/2016/5/12/chartex" xmlns:cx7="http://schemas.microsoft.com/office/drawing/2016/5/13/chartex" xmlns:cx8="http://schemas.microsoft.com/office/drawing/2016/5/14/chartex" xmlns:mc="http://schemas.openxmlformats.org/markup-compatibility/2006" xmlns:aink="http://schemas.microsoft.com/office/drawing/2016/ink" xmlns:am3d="http://schemas.microsoft.com/office/drawing/2017/model3d" xmlns:o="urn:schemas-microsoft-com:office:office" xmlns:oel="http://schemas.microsoft.com/office/2019/extlst" xmlns:r="http://schemas.openxmlformats.org/officeDocument/2006/relationships" xmlns:m="http://schemas.openxmlformats.org/officeDocument/2006/math" xmlns:v="urn:schemas-microsoft-com:vml" xmlns:wp14="http://schemas.microsoft.com/office/word/2010/wordprocessingDrawing" xmlns:wp="http://schemas.openxmlformats.org/drawingml/2006/wordprocessingDrawing" xmlns:w10="urn:schemas-microsoft-com:office:word" xmlns:w="http://schemas.openxmlformats.org/wordprocessingml/2006/main" xmlns:w14="http://schemas.microsoft.com/office/word/2010/wordml" xmlns:w15="http://schemas.microsoft.com/office/word/2012/wordml" xmlns:w16cex="http://schemas.microsoft.com/office/word/2018/wordml/cex" xmlns:w16cid="http://schemas.microsoft.com/office/word/2016/wordml/cid" xmlns:w16="http://schemas.microsoft.com/office/word/2018/wordml" xmlns:w16du="http://schemas.microsoft.com/office/word/2023/wordml/word16du" xmlns:w16sdtdh="http://schemas.microsoft.com/office/word/2020/wordml/sdtdatahash" xmlns:w16sdtfl="http://schemas.microsoft.com/office/word/2024/wordml/sdtformatlock" xmlns:w16se="http://schemas.microsoft.com/office/word/2015/wordml/symex" xmlns:wpg="http://schemas.microsoft.com/office/word/2010/wordprocessingGroup" xmlns:wpi="http://schemas.microsoft.com/office/word/2010/wordprocessingInk" xmlns:wne="http://schemas.microsoft.com/office/word/2006/wordml" xmlns:wps="http://schemas.microsoft.com/office/word/2010/wordprocessingShape" mc:Ignorable="w14 w15 w16se w16cid w16 w16cex w16sdtdh w16sdtfl w16du wp14">
+  <w:abstractNum w:abstractNumId="0" w15:restartNumberingAfterBreak="0">
+    <w:nsid w:val="FFFFFF89"/>
+    <w:multiLevelType w:val="singleLevel"/>
+    <w:tmpl w:val="8BBE70EE"/>
+    <w:lvl w:ilvl="0">
+      <w:start w:val="1"/>
+      <w:numFmt w:val="bullet"/>
+      <w:pStyle w:val="ListBullet"/>
+      <w:lvlText w:val=""/>
+      <w:lvlJc w:val="left"/>
+      <w:pPr>
+        <w:tabs>
+          <w:tab w:val="num" w:pos="360"/>
+        </w:tabs>
+        <w:ind w:left="360" w:hanging="360"/>
+      </w:pPr>
+      <w:rPr>
+        <w:rFonts w:ascii="Symbol" w:hAnsi="Symbol" w:hint="default"/>
+      </w:rPr>
+    </w:lvl>
+  </w:abstractNum>
+  <w:num w:numId="1" w16cid:durableId="979111948">
+    <w:abstractNumId w:val="0"/>
+  </w:num>
+</w:numbering>
 </file>
 
 <file path=word/styles.xml><?xml version="1.0" encoding="utf-8"?>
@@ -33820,7 +35070,7 @@
   <w:style w:type="paragraph" w:default="1" w:styleId="Normal">
     <w:name w:val="Normal"/>
     <w:qFormat/>
-    <w:rsid w:val="00020E74"/>
+    <w:rsid w:val="00B44FC8"/>
     <w:pPr>
       <w:spacing w:after="0" w:line="240" w:lineRule="auto"/>
       <w:jc w:val="both"/>
@@ -34672,6 +35922,19 @@
       </w:tblBorders>
     </w:tblPr>
   </w:style>
+  <w:style w:type="paragraph" w:styleId="ListBullet">
+    <w:name w:val="List Bullet"/>
+    <w:basedOn w:val="Normal"/>
+    <w:uiPriority w:val="99"/>
+    <w:unhideWhenUsed/>
+    <w:rsid w:val="00985A65"/>
+    <w:pPr>
+      <w:numPr>
+        <w:numId w:val="1"/>
+      </w:numPr>
+      <w:contextualSpacing/>
+    </w:pPr>
+  </w:style>
 </w:styles>
 </file>
 

</xml_diff>